<commit_message>
Adding Ternary Search Algo
</commit_message>
<xml_diff>
--- a/Searching Algorithm/Basics.docx
+++ b/Searching Algorithm/Basics.docx
@@ -1975,6 +1975,1482 @@
           <w:sz w:val="36"/>
           <w:szCs w:val="36"/>
         </w:rPr>
+      </w:pPr>
+    </w:p>
+    <w:p>
+      <w:pPr>
+        <w:jc w:val="center"/>
+        <w:rPr>
+          <w:b/>
+          <w:sz w:val="36"/>
+          <w:szCs w:val="36"/>
+        </w:rPr>
+      </w:pPr>
+      <w:r>
+        <w:rPr>
+          <w:b/>
+          <w:sz w:val="36"/>
+          <w:szCs w:val="36"/>
+        </w:rPr>
+        <w:t>Ternary Search</w:t>
+      </w:r>
+    </w:p>
+    <w:p>
+      <w:pPr>
+        <w:pStyle w:val="NormalWeb"/>
+      </w:pPr>
+      <w:r>
+        <w:t xml:space="preserve">Ternary Search is a searching algorithm used to find an element in a </w:t>
+      </w:r>
+      <w:r>
+        <w:rPr>
+          <w:rStyle w:val="Strong"/>
+        </w:rPr>
+        <w:t xml:space="preserve">sorted </w:t>
+      </w:r>
+      <w:proofErr w:type="spellStart"/>
+      <w:r>
+        <w:rPr>
+          <w:rStyle w:val="Strong"/>
+        </w:rPr>
+        <w:t>array</w:t>
+      </w:r>
+      <w:r>
+        <w:t>.It</w:t>
+      </w:r>
+      <w:proofErr w:type="spellEnd"/>
+      <w:r>
+        <w:t xml:space="preserve"> works by dividing the array into </w:t>
+      </w:r>
+      <w:r>
+        <w:rPr>
+          <w:rStyle w:val="Strong"/>
+        </w:rPr>
+        <w:t>three parts</w:t>
+      </w:r>
+      <w:r>
+        <w:t xml:space="preserve"> using </w:t>
+      </w:r>
+      <w:r>
+        <w:rPr>
+          <w:rStyle w:val="Strong"/>
+        </w:rPr>
+        <w:t>two middle positions</w:t>
+      </w:r>
+      <w:r>
+        <w:t>.</w:t>
+      </w:r>
+    </w:p>
+    <w:p>
+      <w:pPr>
+        <w:spacing w:before="100" w:beforeAutospacing="1" w:after="100" w:afterAutospacing="1" w:line="240" w:lineRule="auto"/>
+        <w:outlineLvl w:val="0"/>
+        <w:rPr>
+          <w:rFonts w:ascii="Times New Roman" w:eastAsia="Times New Roman" w:hAnsi="Times New Roman" w:cs="Times New Roman"/>
+          <w:b/>
+          <w:bCs/>
+          <w:kern w:val="36"/>
+          <w:sz w:val="48"/>
+          <w:szCs w:val="48"/>
+        </w:rPr>
+      </w:pPr>
+      <w:r>
+        <w:rPr>
+          <w:rFonts w:ascii="Times New Roman" w:eastAsia="Times New Roman" w:hAnsi="Times New Roman" w:cs="Times New Roman"/>
+          <w:b/>
+          <w:bCs/>
+          <w:kern w:val="36"/>
+          <w:sz w:val="48"/>
+          <w:szCs w:val="48"/>
+        </w:rPr>
+        <w:t>Steps of Ternary Search</w:t>
+      </w:r>
+    </w:p>
+    <w:p>
+      <w:pPr>
+        <w:numPr>
+          <w:ilvl w:val="0"/>
+          <w:numId w:val="7"/>
+        </w:numPr>
+        <w:spacing w:before="100" w:beforeAutospacing="1" w:after="100" w:afterAutospacing="1" w:line="240" w:lineRule="auto"/>
+        <w:rPr>
+          <w:rFonts w:ascii="Times New Roman" w:eastAsia="Times New Roman" w:hAnsi="Times New Roman" w:cs="Times New Roman"/>
+          <w:sz w:val="24"/>
+          <w:szCs w:val="24"/>
+        </w:rPr>
+      </w:pPr>
+      <w:r>
+        <w:rPr>
+          <w:rFonts w:ascii="Times New Roman" w:eastAsia="Times New Roman" w:hAnsi="Times New Roman" w:cs="Times New Roman"/>
+          <w:sz w:val="24"/>
+          <w:szCs w:val="24"/>
+        </w:rPr>
+        <w:t xml:space="preserve">Set: </w:t>
+      </w:r>
+    </w:p>
+    <w:p>
+      <w:pPr>
+        <w:numPr>
+          <w:ilvl w:val="1"/>
+          <w:numId w:val="7"/>
+        </w:numPr>
+        <w:spacing w:before="100" w:beforeAutospacing="1" w:after="100" w:afterAutospacing="1" w:line="240" w:lineRule="auto"/>
+        <w:rPr>
+          <w:rFonts w:ascii="Times New Roman" w:eastAsia="Times New Roman" w:hAnsi="Times New Roman" w:cs="Times New Roman"/>
+          <w:sz w:val="24"/>
+          <w:szCs w:val="24"/>
+        </w:rPr>
+      </w:pPr>
+      <w:r>
+        <w:rPr>
+          <w:rFonts w:ascii="Courier New" w:eastAsia="Times New Roman" w:hAnsi="Courier New" w:cs="Courier New"/>
+          <w:sz w:val="20"/>
+        </w:rPr>
+        <w:t>left = 0</w:t>
+      </w:r>
+      <w:r>
+        <w:rPr>
+          <w:rFonts w:ascii="Times New Roman" w:eastAsia="Times New Roman" w:hAnsi="Times New Roman" w:cs="Times New Roman"/>
+          <w:sz w:val="24"/>
+          <w:szCs w:val="24"/>
+        </w:rPr>
+        <w:t xml:space="preserve"> </w:t>
+      </w:r>
+    </w:p>
+    <w:p>
+      <w:pPr>
+        <w:numPr>
+          <w:ilvl w:val="1"/>
+          <w:numId w:val="7"/>
+        </w:numPr>
+        <w:spacing w:before="100" w:beforeAutospacing="1" w:after="100" w:afterAutospacing="1" w:line="240" w:lineRule="auto"/>
+        <w:rPr>
+          <w:rFonts w:ascii="Times New Roman" w:eastAsia="Times New Roman" w:hAnsi="Times New Roman" w:cs="Times New Roman"/>
+          <w:sz w:val="24"/>
+          <w:szCs w:val="24"/>
+        </w:rPr>
+      </w:pPr>
+      <w:r>
+        <w:rPr>
+          <w:rFonts w:ascii="Courier New" w:eastAsia="Times New Roman" w:hAnsi="Courier New" w:cs="Courier New"/>
+          <w:sz w:val="20"/>
+        </w:rPr>
+        <w:t>right = n - 1</w:t>
+      </w:r>
+      <w:r>
+        <w:rPr>
+          <w:rFonts w:ascii="Times New Roman" w:eastAsia="Times New Roman" w:hAnsi="Times New Roman" w:cs="Times New Roman"/>
+          <w:sz w:val="24"/>
+          <w:szCs w:val="24"/>
+        </w:rPr>
+        <w:t xml:space="preserve"> </w:t>
+      </w:r>
+    </w:p>
+    <w:p>
+      <w:pPr>
+        <w:numPr>
+          <w:ilvl w:val="0"/>
+          <w:numId w:val="7"/>
+        </w:numPr>
+        <w:spacing w:before="100" w:beforeAutospacing="1" w:after="100" w:afterAutospacing="1" w:line="240" w:lineRule="auto"/>
+        <w:rPr>
+          <w:rFonts w:ascii="Times New Roman" w:eastAsia="Times New Roman" w:hAnsi="Times New Roman" w:cs="Times New Roman"/>
+          <w:sz w:val="24"/>
+          <w:szCs w:val="24"/>
+        </w:rPr>
+      </w:pPr>
+      <w:r>
+        <w:rPr>
+          <w:rFonts w:ascii="Times New Roman" w:eastAsia="Times New Roman" w:hAnsi="Times New Roman" w:cs="Times New Roman"/>
+          <w:sz w:val="24"/>
+          <w:szCs w:val="24"/>
+        </w:rPr>
+        <w:t xml:space="preserve">Find two middle positions: </w:t>
+      </w:r>
+    </w:p>
+    <w:p>
+      <w:pPr>
+        <w:spacing w:before="100" w:beforeAutospacing="1" w:after="100" w:afterAutospacing="1" w:line="240" w:lineRule="auto"/>
+        <w:rPr>
+          <w:rFonts w:ascii="Times New Roman" w:eastAsia="Times New Roman" w:hAnsi="Times New Roman" w:cs="Times New Roman"/>
+          <w:sz w:val="24"/>
+          <w:szCs w:val="24"/>
+        </w:rPr>
+      </w:pPr>
+      <w:r>
+        <w:rPr>
+          <w:rFonts w:ascii="Times New Roman" w:eastAsia="Times New Roman" w:hAnsi="Times New Roman" w:cs="Times New Roman"/>
+          <w:sz w:val="24"/>
+          <w:szCs w:val="24"/>
+        </w:rPr>
+        <w:t>mid1=left+right−left3mid1 = left + \</w:t>
+      </w:r>
+      <w:proofErr w:type="spellStart"/>
+      <w:r>
+        <w:rPr>
+          <w:rFonts w:ascii="Times New Roman" w:eastAsia="Times New Roman" w:hAnsi="Times New Roman" w:cs="Times New Roman"/>
+          <w:sz w:val="24"/>
+          <w:szCs w:val="24"/>
+        </w:rPr>
+        <w:t>frac</w:t>
+      </w:r>
+      <w:proofErr w:type="spellEnd"/>
+      <w:r>
+        <w:rPr>
+          <w:rFonts w:ascii="Times New Roman" w:eastAsia="Times New Roman" w:hAnsi="Times New Roman" w:cs="Times New Roman"/>
+          <w:sz w:val="24"/>
+          <w:szCs w:val="24"/>
+        </w:rPr>
+        <w:t>{right-left}{3}mid1=left+3right−left​</w:t>
+      </w:r>
+    </w:p>
+    <w:p>
+      <w:pPr>
+        <w:spacing w:before="100" w:beforeAutospacing="1" w:after="100" w:afterAutospacing="1" w:line="240" w:lineRule="auto"/>
+        <w:rPr>
+          <w:rFonts w:ascii="Times New Roman" w:eastAsia="Times New Roman" w:hAnsi="Times New Roman" w:cs="Times New Roman"/>
+          <w:sz w:val="24"/>
+          <w:szCs w:val="24"/>
+        </w:rPr>
+      </w:pPr>
+      <w:r>
+        <w:rPr>
+          <w:rFonts w:ascii="Times New Roman" w:eastAsia="Times New Roman" w:hAnsi="Times New Roman" w:cs="Times New Roman"/>
+          <w:sz w:val="24"/>
+          <w:szCs w:val="24"/>
+        </w:rPr>
+        <w:t>mid2=right−right−left3mid2 = right - \</w:t>
+      </w:r>
+      <w:proofErr w:type="spellStart"/>
+      <w:r>
+        <w:rPr>
+          <w:rFonts w:ascii="Times New Roman" w:eastAsia="Times New Roman" w:hAnsi="Times New Roman" w:cs="Times New Roman"/>
+          <w:sz w:val="24"/>
+          <w:szCs w:val="24"/>
+        </w:rPr>
+        <w:t>frac</w:t>
+      </w:r>
+      <w:proofErr w:type="spellEnd"/>
+      <w:r>
+        <w:rPr>
+          <w:rFonts w:ascii="Times New Roman" w:eastAsia="Times New Roman" w:hAnsi="Times New Roman" w:cs="Times New Roman"/>
+          <w:sz w:val="24"/>
+          <w:szCs w:val="24"/>
+        </w:rPr>
+        <w:t>{right-left}{3}mid2=right−3right−left​</w:t>
+      </w:r>
+    </w:p>
+    <w:p>
+      <w:pPr>
+        <w:numPr>
+          <w:ilvl w:val="0"/>
+          <w:numId w:val="8"/>
+        </w:numPr>
+        <w:spacing w:before="100" w:beforeAutospacing="1" w:after="100" w:afterAutospacing="1" w:line="240" w:lineRule="auto"/>
+        <w:rPr>
+          <w:rFonts w:ascii="Times New Roman" w:eastAsia="Times New Roman" w:hAnsi="Times New Roman" w:cs="Times New Roman"/>
+          <w:sz w:val="24"/>
+          <w:szCs w:val="24"/>
+        </w:rPr>
+      </w:pPr>
+      <w:r>
+        <w:rPr>
+          <w:rFonts w:ascii="Times New Roman" w:eastAsia="Times New Roman" w:hAnsi="Times New Roman" w:cs="Times New Roman"/>
+          <w:sz w:val="24"/>
+          <w:szCs w:val="24"/>
+        </w:rPr>
+        <w:t xml:space="preserve">Compare target: </w:t>
+      </w:r>
+    </w:p>
+    <w:p>
+      <w:pPr>
+        <w:numPr>
+          <w:ilvl w:val="1"/>
+          <w:numId w:val="8"/>
+        </w:numPr>
+        <w:spacing w:before="100" w:beforeAutospacing="1" w:after="100" w:afterAutospacing="1" w:line="240" w:lineRule="auto"/>
+        <w:rPr>
+          <w:rFonts w:ascii="Times New Roman" w:eastAsia="Times New Roman" w:hAnsi="Times New Roman" w:cs="Times New Roman"/>
+          <w:sz w:val="24"/>
+          <w:szCs w:val="24"/>
+        </w:rPr>
+      </w:pPr>
+      <w:r>
+        <w:rPr>
+          <w:rFonts w:ascii="Times New Roman" w:eastAsia="Times New Roman" w:hAnsi="Times New Roman" w:cs="Times New Roman"/>
+          <w:sz w:val="24"/>
+          <w:szCs w:val="24"/>
+        </w:rPr>
+        <w:t xml:space="preserve">If </w:t>
+      </w:r>
+      <w:proofErr w:type="spellStart"/>
+      <w:r>
+        <w:rPr>
+          <w:rFonts w:ascii="Courier New" w:eastAsia="Times New Roman" w:hAnsi="Courier New" w:cs="Courier New"/>
+          <w:sz w:val="20"/>
+        </w:rPr>
+        <w:t>arr</w:t>
+      </w:r>
+      <w:proofErr w:type="spellEnd"/>
+      <w:r>
+        <w:rPr>
+          <w:rFonts w:ascii="Courier New" w:eastAsia="Times New Roman" w:hAnsi="Courier New" w:cs="Courier New"/>
+          <w:sz w:val="20"/>
+        </w:rPr>
+        <w:t>[mid1] == target</w:t>
+      </w:r>
+      <w:r>
+        <w:rPr>
+          <w:rFonts w:ascii="Times New Roman" w:eastAsia="Times New Roman" w:hAnsi="Times New Roman" w:cs="Times New Roman"/>
+          <w:sz w:val="24"/>
+          <w:szCs w:val="24"/>
+        </w:rPr>
+        <w:t xml:space="preserve"> → Found </w:t>
+      </w:r>
+    </w:p>
+    <w:p>
+      <w:pPr>
+        <w:numPr>
+          <w:ilvl w:val="1"/>
+          <w:numId w:val="8"/>
+        </w:numPr>
+        <w:spacing w:before="100" w:beforeAutospacing="1" w:after="100" w:afterAutospacing="1" w:line="240" w:lineRule="auto"/>
+        <w:rPr>
+          <w:rFonts w:ascii="Times New Roman" w:eastAsia="Times New Roman" w:hAnsi="Times New Roman" w:cs="Times New Roman"/>
+          <w:sz w:val="24"/>
+          <w:szCs w:val="24"/>
+        </w:rPr>
+      </w:pPr>
+      <w:r>
+        <w:rPr>
+          <w:rFonts w:ascii="Times New Roman" w:eastAsia="Times New Roman" w:hAnsi="Times New Roman" w:cs="Times New Roman"/>
+          <w:sz w:val="24"/>
+          <w:szCs w:val="24"/>
+        </w:rPr>
+        <w:t xml:space="preserve">If </w:t>
+      </w:r>
+      <w:proofErr w:type="spellStart"/>
+      <w:r>
+        <w:rPr>
+          <w:rFonts w:ascii="Courier New" w:eastAsia="Times New Roman" w:hAnsi="Courier New" w:cs="Courier New"/>
+          <w:sz w:val="20"/>
+        </w:rPr>
+        <w:t>arr</w:t>
+      </w:r>
+      <w:proofErr w:type="spellEnd"/>
+      <w:r>
+        <w:rPr>
+          <w:rFonts w:ascii="Courier New" w:eastAsia="Times New Roman" w:hAnsi="Courier New" w:cs="Courier New"/>
+          <w:sz w:val="20"/>
+        </w:rPr>
+        <w:t>[mid2] == target</w:t>
+      </w:r>
+      <w:r>
+        <w:rPr>
+          <w:rFonts w:ascii="Times New Roman" w:eastAsia="Times New Roman" w:hAnsi="Times New Roman" w:cs="Times New Roman"/>
+          <w:sz w:val="24"/>
+          <w:szCs w:val="24"/>
+        </w:rPr>
+        <w:t xml:space="preserve"> → Found </w:t>
+      </w:r>
+    </w:p>
+    <w:p>
+      <w:pPr>
+        <w:numPr>
+          <w:ilvl w:val="1"/>
+          <w:numId w:val="8"/>
+        </w:numPr>
+        <w:spacing w:before="100" w:beforeAutospacing="1" w:after="100" w:afterAutospacing="1" w:line="240" w:lineRule="auto"/>
+        <w:rPr>
+          <w:rFonts w:ascii="Times New Roman" w:eastAsia="Times New Roman" w:hAnsi="Times New Roman" w:cs="Times New Roman"/>
+          <w:sz w:val="24"/>
+          <w:szCs w:val="24"/>
+        </w:rPr>
+      </w:pPr>
+      <w:r>
+        <w:rPr>
+          <w:rFonts w:ascii="Times New Roman" w:eastAsia="Times New Roman" w:hAnsi="Times New Roman" w:cs="Times New Roman"/>
+          <w:sz w:val="24"/>
+          <w:szCs w:val="24"/>
+        </w:rPr>
+        <w:t xml:space="preserve">If target &lt; </w:t>
+      </w:r>
+      <w:proofErr w:type="spellStart"/>
+      <w:r>
+        <w:rPr>
+          <w:rFonts w:ascii="Courier New" w:eastAsia="Times New Roman" w:hAnsi="Courier New" w:cs="Courier New"/>
+          <w:sz w:val="20"/>
+        </w:rPr>
+        <w:t>arr</w:t>
+      </w:r>
+      <w:proofErr w:type="spellEnd"/>
+      <w:r>
+        <w:rPr>
+          <w:rFonts w:ascii="Courier New" w:eastAsia="Times New Roman" w:hAnsi="Courier New" w:cs="Courier New"/>
+          <w:sz w:val="20"/>
+        </w:rPr>
+        <w:t>[mid1]</w:t>
+      </w:r>
+      <w:r>
+        <w:rPr>
+          <w:rFonts w:ascii="Times New Roman" w:eastAsia="Times New Roman" w:hAnsi="Times New Roman" w:cs="Times New Roman"/>
+          <w:sz w:val="24"/>
+          <w:szCs w:val="24"/>
+        </w:rPr>
+        <w:t xml:space="preserve"> → search left part </w:t>
+      </w:r>
+    </w:p>
+    <w:p>
+      <w:pPr>
+        <w:numPr>
+          <w:ilvl w:val="1"/>
+          <w:numId w:val="8"/>
+        </w:numPr>
+        <w:spacing w:before="100" w:beforeAutospacing="1" w:after="100" w:afterAutospacing="1" w:line="240" w:lineRule="auto"/>
+        <w:rPr>
+          <w:rFonts w:ascii="Times New Roman" w:eastAsia="Times New Roman" w:hAnsi="Times New Roman" w:cs="Times New Roman"/>
+          <w:sz w:val="24"/>
+          <w:szCs w:val="24"/>
+        </w:rPr>
+      </w:pPr>
+      <w:r>
+        <w:rPr>
+          <w:rFonts w:ascii="Times New Roman" w:eastAsia="Times New Roman" w:hAnsi="Times New Roman" w:cs="Times New Roman"/>
+          <w:sz w:val="24"/>
+          <w:szCs w:val="24"/>
+        </w:rPr>
+        <w:t xml:space="preserve">If target &gt; </w:t>
+      </w:r>
+      <w:proofErr w:type="spellStart"/>
+      <w:r>
+        <w:rPr>
+          <w:rFonts w:ascii="Courier New" w:eastAsia="Times New Roman" w:hAnsi="Courier New" w:cs="Courier New"/>
+          <w:sz w:val="20"/>
+        </w:rPr>
+        <w:t>arr</w:t>
+      </w:r>
+      <w:proofErr w:type="spellEnd"/>
+      <w:r>
+        <w:rPr>
+          <w:rFonts w:ascii="Courier New" w:eastAsia="Times New Roman" w:hAnsi="Courier New" w:cs="Courier New"/>
+          <w:sz w:val="20"/>
+        </w:rPr>
+        <w:t>[mid2]</w:t>
+      </w:r>
+      <w:r>
+        <w:rPr>
+          <w:rFonts w:ascii="Times New Roman" w:eastAsia="Times New Roman" w:hAnsi="Times New Roman" w:cs="Times New Roman"/>
+          <w:sz w:val="24"/>
+          <w:szCs w:val="24"/>
+        </w:rPr>
+        <w:t xml:space="preserve"> → search right part </w:t>
+      </w:r>
+    </w:p>
+    <w:p>
+      <w:pPr>
+        <w:numPr>
+          <w:ilvl w:val="1"/>
+          <w:numId w:val="8"/>
+        </w:numPr>
+        <w:spacing w:before="100" w:beforeAutospacing="1" w:after="100" w:afterAutospacing="1" w:line="240" w:lineRule="auto"/>
+        <w:rPr>
+          <w:rFonts w:ascii="Times New Roman" w:eastAsia="Times New Roman" w:hAnsi="Times New Roman" w:cs="Times New Roman"/>
+          <w:sz w:val="24"/>
+          <w:szCs w:val="24"/>
+        </w:rPr>
+      </w:pPr>
+      <w:r>
+        <w:rPr>
+          <w:rFonts w:ascii="Times New Roman" w:eastAsia="Times New Roman" w:hAnsi="Times New Roman" w:cs="Times New Roman"/>
+          <w:sz w:val="24"/>
+          <w:szCs w:val="24"/>
+        </w:rPr>
+        <w:t xml:space="preserve">Otherwise → search middle part </w:t>
+      </w:r>
+    </w:p>
+    <w:p>
+      <w:pPr>
+        <w:numPr>
+          <w:ilvl w:val="0"/>
+          <w:numId w:val="8"/>
+        </w:numPr>
+        <w:spacing w:before="100" w:beforeAutospacing="1" w:after="100" w:afterAutospacing="1" w:line="240" w:lineRule="auto"/>
+        <w:rPr>
+          <w:rFonts w:ascii="Times New Roman" w:eastAsia="Times New Roman" w:hAnsi="Times New Roman" w:cs="Times New Roman"/>
+          <w:sz w:val="24"/>
+          <w:szCs w:val="24"/>
+        </w:rPr>
+      </w:pPr>
+      <w:r>
+        <w:rPr>
+          <w:rFonts w:ascii="Times New Roman" w:eastAsia="Times New Roman" w:hAnsi="Times New Roman" w:cs="Times New Roman"/>
+          <w:sz w:val="24"/>
+          <w:szCs w:val="24"/>
+        </w:rPr>
+        <w:lastRenderedPageBreak/>
+        <w:t>Repeat until found or range becomes empty.</w:t>
+      </w:r>
+    </w:p>
+    <w:p>
+      <w:pPr>
+        <w:pStyle w:val="NormalWeb"/>
+      </w:pPr>
+    </w:p>
+    <w:p>
+      <w:pPr>
+        <w:pStyle w:val="NormalWeb"/>
+      </w:pPr>
+      <w:proofErr w:type="spellStart"/>
+      <w:r>
+        <w:t>Pseudocode</w:t>
+      </w:r>
+      <w:proofErr w:type="spellEnd"/>
+      <w:r>
+        <w:t>:</w:t>
+      </w:r>
+    </w:p>
+    <w:p>
+      <w:pPr>
+        <w:pStyle w:val="NormalWeb"/>
+      </w:pPr>
+      <w:proofErr w:type="spellStart"/>
+      <w:r>
+        <w:rPr>
+          <w:rStyle w:val="m"/>
+        </w:rPr>
+        <w:t>int</w:t>
+      </w:r>
+      <w:proofErr w:type="spellEnd"/>
+      <w:r>
+        <w:t xml:space="preserve"> </w:t>
+      </w:r>
+      <w:proofErr w:type="spellStart"/>
+      <w:r>
+        <w:rPr>
+          <w:rStyle w:val="m"/>
+        </w:rPr>
+        <w:t>ternarySearch</w:t>
+      </w:r>
+      <w:proofErr w:type="spellEnd"/>
+      <w:r>
+        <w:t>(</w:t>
+      </w:r>
+      <w:proofErr w:type="spellStart"/>
+      <w:r>
+        <w:rPr>
+          <w:rStyle w:val="m"/>
+        </w:rPr>
+        <w:t>int</w:t>
+      </w:r>
+      <w:proofErr w:type="spellEnd"/>
+      <w:r>
+        <w:t xml:space="preserve"> </w:t>
+      </w:r>
+      <w:proofErr w:type="spellStart"/>
+      <w:r>
+        <w:rPr>
+          <w:rStyle w:val="m"/>
+        </w:rPr>
+        <w:t>arr</w:t>
+      </w:r>
+      <w:proofErr w:type="spellEnd"/>
+      <w:r>
+        <w:t xml:space="preserve">[], </w:t>
+      </w:r>
+      <w:proofErr w:type="spellStart"/>
+      <w:r>
+        <w:rPr>
+          <w:rStyle w:val="m"/>
+        </w:rPr>
+        <w:t>int</w:t>
+      </w:r>
+      <w:proofErr w:type="spellEnd"/>
+      <w:r>
+        <w:t xml:space="preserve"> </w:t>
+      </w:r>
+      <w:r>
+        <w:rPr>
+          <w:rStyle w:val="m"/>
+        </w:rPr>
+        <w:t>left</w:t>
+      </w:r>
+      <w:r>
+        <w:t xml:space="preserve">, </w:t>
+      </w:r>
+      <w:proofErr w:type="spellStart"/>
+      <w:r>
+        <w:rPr>
+          <w:rStyle w:val="m"/>
+        </w:rPr>
+        <w:t>int</w:t>
+      </w:r>
+      <w:proofErr w:type="spellEnd"/>
+      <w:r>
+        <w:t xml:space="preserve"> </w:t>
+      </w:r>
+      <w:r>
+        <w:rPr>
+          <w:rStyle w:val="m"/>
+        </w:rPr>
+        <w:t>right</w:t>
+      </w:r>
+      <w:r>
+        <w:t xml:space="preserve">, </w:t>
+      </w:r>
+      <w:proofErr w:type="spellStart"/>
+      <w:r>
+        <w:rPr>
+          <w:rStyle w:val="m"/>
+        </w:rPr>
+        <w:t>int</w:t>
+      </w:r>
+      <w:proofErr w:type="spellEnd"/>
+      <w:r>
+        <w:t xml:space="preserve"> </w:t>
+      </w:r>
+      <w:r>
+        <w:rPr>
+          <w:rStyle w:val="m"/>
+        </w:rPr>
+        <w:t>target</w:t>
+      </w:r>
+      <w:r>
+        <w:t>) {</w:t>
+      </w:r>
+      <w:r>
+        <w:br/>
+      </w:r>
+      <w:r>
+        <w:br/>
+      </w:r>
+      <w:r>
+        <w:rPr>
+          <w:rStyle w:val="g"/>
+        </w:rPr>
+        <w:t>while</w:t>
+      </w:r>
+      <w:r>
+        <w:t xml:space="preserve"> (</w:t>
+      </w:r>
+      <w:r>
+        <w:rPr>
+          <w:rStyle w:val="m"/>
+        </w:rPr>
+        <w:t>left</w:t>
+      </w:r>
+      <w:r>
+        <w:t xml:space="preserve"> </w:t>
+      </w:r>
+      <w:r>
+        <w:rPr>
+          <w:rStyle w:val="g"/>
+        </w:rPr>
+        <w:t>&lt;=</w:t>
+      </w:r>
+      <w:r>
+        <w:t xml:space="preserve"> </w:t>
+      </w:r>
+      <w:r>
+        <w:rPr>
+          <w:rStyle w:val="m"/>
+        </w:rPr>
+        <w:t>right</w:t>
+      </w:r>
+      <w:r>
+        <w:t>) {</w:t>
+      </w:r>
+      <w:r>
+        <w:br/>
+      </w:r>
+      <w:r>
+        <w:br/>
+      </w:r>
+      <w:proofErr w:type="spellStart"/>
+      <w:r>
+        <w:rPr>
+          <w:rStyle w:val="m"/>
+        </w:rPr>
+        <w:t>int</w:t>
+      </w:r>
+      <w:proofErr w:type="spellEnd"/>
+      <w:r>
+        <w:t xml:space="preserve"> </w:t>
+      </w:r>
+      <w:r>
+        <w:rPr>
+          <w:rStyle w:val="m"/>
+        </w:rPr>
+        <w:t>mid1</w:t>
+      </w:r>
+      <w:r>
+        <w:t xml:space="preserve"> = </w:t>
+      </w:r>
+      <w:r>
+        <w:rPr>
+          <w:rStyle w:val="m"/>
+        </w:rPr>
+        <w:t>left</w:t>
+      </w:r>
+      <w:r>
+        <w:t xml:space="preserve"> </w:t>
+      </w:r>
+      <w:r>
+        <w:rPr>
+          <w:rStyle w:val="g"/>
+        </w:rPr>
+        <w:t>+</w:t>
+      </w:r>
+      <w:r>
+        <w:t xml:space="preserve"> (</w:t>
+      </w:r>
+      <w:r>
+        <w:rPr>
+          <w:rStyle w:val="m"/>
+        </w:rPr>
+        <w:t>right</w:t>
+      </w:r>
+      <w:r>
+        <w:t xml:space="preserve"> </w:t>
+      </w:r>
+      <w:r>
+        <w:rPr>
+          <w:rStyle w:val="g"/>
+        </w:rPr>
+        <w:t>-</w:t>
+      </w:r>
+      <w:r>
+        <w:t xml:space="preserve"> </w:t>
+      </w:r>
+      <w:r>
+        <w:rPr>
+          <w:rStyle w:val="m"/>
+        </w:rPr>
+        <w:t>left</w:t>
+      </w:r>
+      <w:r>
+        <w:t xml:space="preserve">) </w:t>
+      </w:r>
+      <w:r>
+        <w:rPr>
+          <w:rStyle w:val="g"/>
+        </w:rPr>
+        <w:t>/</w:t>
+      </w:r>
+      <w:r>
+        <w:t xml:space="preserve"> </w:t>
+      </w:r>
+      <w:r>
+        <w:rPr>
+          <w:rStyle w:val="j"/>
+        </w:rPr>
+        <w:t>3</w:t>
+      </w:r>
+      <w:r>
+        <w:t>;</w:t>
+      </w:r>
+      <w:r>
+        <w:br/>
+      </w:r>
+      <w:proofErr w:type="spellStart"/>
+      <w:r>
+        <w:rPr>
+          <w:rStyle w:val="m"/>
+        </w:rPr>
+        <w:t>int</w:t>
+      </w:r>
+      <w:proofErr w:type="spellEnd"/>
+      <w:r>
+        <w:t xml:space="preserve"> </w:t>
+      </w:r>
+      <w:r>
+        <w:rPr>
+          <w:rStyle w:val="m"/>
+        </w:rPr>
+        <w:t>mid2</w:t>
+      </w:r>
+      <w:r>
+        <w:t xml:space="preserve"> = </w:t>
+      </w:r>
+      <w:r>
+        <w:rPr>
+          <w:rStyle w:val="m"/>
+        </w:rPr>
+        <w:t>right</w:t>
+      </w:r>
+      <w:r>
+        <w:t xml:space="preserve"> </w:t>
+      </w:r>
+      <w:r>
+        <w:rPr>
+          <w:rStyle w:val="g"/>
+        </w:rPr>
+        <w:t>-</w:t>
+      </w:r>
+      <w:r>
+        <w:t xml:space="preserve"> (</w:t>
+      </w:r>
+      <w:r>
+        <w:rPr>
+          <w:rStyle w:val="m"/>
+        </w:rPr>
+        <w:t>right</w:t>
+      </w:r>
+      <w:r>
+        <w:t xml:space="preserve"> </w:t>
+      </w:r>
+      <w:r>
+        <w:rPr>
+          <w:rStyle w:val="g"/>
+        </w:rPr>
+        <w:t>-</w:t>
+      </w:r>
+      <w:r>
+        <w:t xml:space="preserve"> </w:t>
+      </w:r>
+      <w:r>
+        <w:rPr>
+          <w:rStyle w:val="m"/>
+        </w:rPr>
+        <w:t>left</w:t>
+      </w:r>
+      <w:r>
+        <w:t xml:space="preserve">) </w:t>
+      </w:r>
+      <w:r>
+        <w:rPr>
+          <w:rStyle w:val="g"/>
+        </w:rPr>
+        <w:t>/</w:t>
+      </w:r>
+      <w:r>
+        <w:t xml:space="preserve"> </w:t>
+      </w:r>
+      <w:r>
+        <w:rPr>
+          <w:rStyle w:val="j"/>
+        </w:rPr>
+        <w:t>3</w:t>
+      </w:r>
+      <w:r>
+        <w:t>;</w:t>
+      </w:r>
+      <w:r>
+        <w:br/>
+      </w:r>
+      <w:r>
+        <w:br/>
+      </w:r>
+      <w:r>
+        <w:rPr>
+          <w:rStyle w:val="g"/>
+        </w:rPr>
+        <w:t>if</w:t>
+      </w:r>
+      <w:r>
+        <w:t xml:space="preserve"> (</w:t>
+      </w:r>
+      <w:proofErr w:type="spellStart"/>
+      <w:r>
+        <w:rPr>
+          <w:rStyle w:val="m"/>
+        </w:rPr>
+        <w:t>arr</w:t>
+      </w:r>
+      <w:proofErr w:type="spellEnd"/>
+      <w:r>
+        <w:t>[</w:t>
+      </w:r>
+      <w:r>
+        <w:rPr>
+          <w:rStyle w:val="m"/>
+        </w:rPr>
+        <w:t>mid1</w:t>
+      </w:r>
+      <w:r>
+        <w:t xml:space="preserve">] </w:t>
+      </w:r>
+      <w:r>
+        <w:rPr>
+          <w:rStyle w:val="g"/>
+        </w:rPr>
+        <w:t>==</w:t>
+      </w:r>
+      <w:r>
+        <w:t xml:space="preserve"> </w:t>
+      </w:r>
+      <w:r>
+        <w:rPr>
+          <w:rStyle w:val="m"/>
+        </w:rPr>
+        <w:t>target</w:t>
+      </w:r>
+      <w:r>
+        <w:t>)</w:t>
+      </w:r>
+      <w:r>
+        <w:br/>
+      </w:r>
+      <w:r>
+        <w:rPr>
+          <w:rStyle w:val="g"/>
+        </w:rPr>
+        <w:t>return</w:t>
+      </w:r>
+      <w:r>
+        <w:t xml:space="preserve"> </w:t>
+      </w:r>
+      <w:r>
+        <w:rPr>
+          <w:rStyle w:val="m"/>
+        </w:rPr>
+        <w:t>mid1</w:t>
+      </w:r>
+      <w:r>
+        <w:t>;</w:t>
+      </w:r>
+      <w:r>
+        <w:br/>
+      </w:r>
+      <w:r>
+        <w:br/>
+      </w:r>
+      <w:r>
+        <w:rPr>
+          <w:rStyle w:val="g"/>
+        </w:rPr>
+        <w:t>if</w:t>
+      </w:r>
+      <w:r>
+        <w:t xml:space="preserve"> (</w:t>
+      </w:r>
+      <w:proofErr w:type="spellStart"/>
+      <w:r>
+        <w:rPr>
+          <w:rStyle w:val="m"/>
+        </w:rPr>
+        <w:t>arr</w:t>
+      </w:r>
+      <w:proofErr w:type="spellEnd"/>
+      <w:r>
+        <w:t>[</w:t>
+      </w:r>
+      <w:r>
+        <w:rPr>
+          <w:rStyle w:val="m"/>
+        </w:rPr>
+        <w:t>mid2</w:t>
+      </w:r>
+      <w:r>
+        <w:t xml:space="preserve">] </w:t>
+      </w:r>
+      <w:r>
+        <w:rPr>
+          <w:rStyle w:val="g"/>
+        </w:rPr>
+        <w:t>==</w:t>
+      </w:r>
+      <w:r>
+        <w:t xml:space="preserve"> </w:t>
+      </w:r>
+      <w:r>
+        <w:rPr>
+          <w:rStyle w:val="m"/>
+        </w:rPr>
+        <w:t>target</w:t>
+      </w:r>
+      <w:r>
+        <w:t>)</w:t>
+      </w:r>
+      <w:r>
+        <w:br/>
+      </w:r>
+      <w:r>
+        <w:rPr>
+          <w:rStyle w:val="g"/>
+        </w:rPr>
+        <w:t>return</w:t>
+      </w:r>
+      <w:r>
+        <w:t xml:space="preserve"> </w:t>
+      </w:r>
+      <w:r>
+        <w:rPr>
+          <w:rStyle w:val="m"/>
+        </w:rPr>
+        <w:t>mid2</w:t>
+      </w:r>
+      <w:r>
+        <w:t>;</w:t>
+      </w:r>
+      <w:r>
+        <w:br/>
+      </w:r>
+      <w:r>
+        <w:br/>
+      </w:r>
+      <w:r>
+        <w:rPr>
+          <w:rStyle w:val="e"/>
+        </w:rPr>
+        <w:t>// Search left part</w:t>
+      </w:r>
+      <w:r>
+        <w:br/>
+      </w:r>
+      <w:r>
+        <w:rPr>
+          <w:rStyle w:val="g"/>
+        </w:rPr>
+        <w:t>if</w:t>
+      </w:r>
+      <w:r>
+        <w:t xml:space="preserve"> (</w:t>
+      </w:r>
+      <w:r>
+        <w:rPr>
+          <w:rStyle w:val="m"/>
+        </w:rPr>
+        <w:t>target</w:t>
+      </w:r>
+      <w:r>
+        <w:t xml:space="preserve"> </w:t>
+      </w:r>
+      <w:r>
+        <w:rPr>
+          <w:rStyle w:val="g"/>
+        </w:rPr>
+        <w:t>&lt;</w:t>
+      </w:r>
+      <w:r>
+        <w:t xml:space="preserve"> </w:t>
+      </w:r>
+      <w:proofErr w:type="spellStart"/>
+      <w:r>
+        <w:rPr>
+          <w:rStyle w:val="m"/>
+        </w:rPr>
+        <w:t>arr</w:t>
+      </w:r>
+      <w:proofErr w:type="spellEnd"/>
+      <w:r>
+        <w:t>[</w:t>
+      </w:r>
+      <w:r>
+        <w:rPr>
+          <w:rStyle w:val="m"/>
+        </w:rPr>
+        <w:t>mid1</w:t>
+      </w:r>
+      <w:r>
+        <w:t>]) {</w:t>
+      </w:r>
+      <w:r>
+        <w:br/>
+      </w:r>
+      <w:r>
+        <w:rPr>
+          <w:rStyle w:val="m"/>
+        </w:rPr>
+        <w:t>right</w:t>
+      </w:r>
+      <w:r>
+        <w:t xml:space="preserve"> = </w:t>
+      </w:r>
+      <w:r>
+        <w:rPr>
+          <w:rStyle w:val="m"/>
+        </w:rPr>
+        <w:t>mid1</w:t>
+      </w:r>
+      <w:r>
+        <w:t xml:space="preserve"> </w:t>
+      </w:r>
+      <w:r>
+        <w:rPr>
+          <w:rStyle w:val="g"/>
+        </w:rPr>
+        <w:t>-</w:t>
+      </w:r>
+      <w:r>
+        <w:t xml:space="preserve"> </w:t>
+      </w:r>
+      <w:r>
+        <w:rPr>
+          <w:rStyle w:val="j"/>
+        </w:rPr>
+        <w:t>1</w:t>
+      </w:r>
+      <w:r>
+        <w:t>;</w:t>
+      </w:r>
+      <w:r>
+        <w:br/>
+        <w:t>}</w:t>
+      </w:r>
+      <w:r>
+        <w:br/>
+      </w:r>
+      <w:r>
+        <w:br/>
+      </w:r>
+      <w:r>
+        <w:rPr>
+          <w:rStyle w:val="e"/>
+        </w:rPr>
+        <w:t>// Search right part</w:t>
+      </w:r>
+      <w:r>
+        <w:br/>
+      </w:r>
+      <w:r>
+        <w:rPr>
+          <w:rStyle w:val="g"/>
+        </w:rPr>
+        <w:t>else</w:t>
+      </w:r>
+      <w:r>
+        <w:t xml:space="preserve"> </w:t>
+      </w:r>
+      <w:r>
+        <w:rPr>
+          <w:rStyle w:val="g"/>
+        </w:rPr>
+        <w:t>if</w:t>
+      </w:r>
+      <w:r>
+        <w:t xml:space="preserve"> (</w:t>
+      </w:r>
+      <w:r>
+        <w:rPr>
+          <w:rStyle w:val="m"/>
+        </w:rPr>
+        <w:t>target</w:t>
+      </w:r>
+      <w:r>
+        <w:t xml:space="preserve"> </w:t>
+      </w:r>
+      <w:r>
+        <w:rPr>
+          <w:rStyle w:val="g"/>
+        </w:rPr>
+        <w:t>&gt;</w:t>
+      </w:r>
+      <w:r>
+        <w:t xml:space="preserve"> </w:t>
+      </w:r>
+      <w:proofErr w:type="spellStart"/>
+      <w:r>
+        <w:rPr>
+          <w:rStyle w:val="m"/>
+        </w:rPr>
+        <w:t>arr</w:t>
+      </w:r>
+      <w:proofErr w:type="spellEnd"/>
+      <w:r>
+        <w:t>[</w:t>
+      </w:r>
+      <w:r>
+        <w:rPr>
+          <w:rStyle w:val="m"/>
+        </w:rPr>
+        <w:t>mid2</w:t>
+      </w:r>
+      <w:r>
+        <w:t>]) {</w:t>
+      </w:r>
+      <w:r>
+        <w:br/>
+      </w:r>
+      <w:r>
+        <w:rPr>
+          <w:rStyle w:val="m"/>
+        </w:rPr>
+        <w:t>left</w:t>
+      </w:r>
+      <w:r>
+        <w:t xml:space="preserve"> = </w:t>
+      </w:r>
+      <w:r>
+        <w:rPr>
+          <w:rStyle w:val="m"/>
+        </w:rPr>
+        <w:t>mid2</w:t>
+      </w:r>
+      <w:r>
+        <w:t xml:space="preserve"> </w:t>
+      </w:r>
+      <w:r>
+        <w:rPr>
+          <w:rStyle w:val="g"/>
+        </w:rPr>
+        <w:t>+</w:t>
+      </w:r>
+      <w:r>
+        <w:t xml:space="preserve"> </w:t>
+      </w:r>
+      <w:r>
+        <w:rPr>
+          <w:rStyle w:val="j"/>
+        </w:rPr>
+        <w:t>1</w:t>
+      </w:r>
+      <w:r>
+        <w:t>;</w:t>
+      </w:r>
+      <w:r>
+        <w:br/>
+        <w:t>}</w:t>
+      </w:r>
+      <w:r>
+        <w:br/>
+      </w:r>
+      <w:r>
+        <w:br/>
+      </w:r>
+      <w:r>
+        <w:rPr>
+          <w:rStyle w:val="e"/>
+        </w:rPr>
+        <w:t>// Search middle part</w:t>
+      </w:r>
+      <w:r>
+        <w:br/>
+      </w:r>
+      <w:r>
+        <w:rPr>
+          <w:rStyle w:val="g"/>
+        </w:rPr>
+        <w:t>else</w:t>
+      </w:r>
+      <w:r>
+        <w:t xml:space="preserve"> {</w:t>
+      </w:r>
+      <w:r>
+        <w:br/>
+      </w:r>
+      <w:r>
+        <w:rPr>
+          <w:rStyle w:val="m"/>
+        </w:rPr>
+        <w:t>left</w:t>
+      </w:r>
+      <w:r>
+        <w:t xml:space="preserve"> = </w:t>
+      </w:r>
+      <w:r>
+        <w:rPr>
+          <w:rStyle w:val="m"/>
+        </w:rPr>
+        <w:t>mid1</w:t>
+      </w:r>
+      <w:r>
+        <w:t xml:space="preserve"> </w:t>
+      </w:r>
+      <w:r>
+        <w:rPr>
+          <w:rStyle w:val="g"/>
+        </w:rPr>
+        <w:t>+</w:t>
+      </w:r>
+      <w:r>
+        <w:t xml:space="preserve"> </w:t>
+      </w:r>
+      <w:r>
+        <w:rPr>
+          <w:rStyle w:val="j"/>
+        </w:rPr>
+        <w:t>1</w:t>
+      </w:r>
+      <w:r>
+        <w:t>;</w:t>
+      </w:r>
+      <w:r>
+        <w:br/>
+      </w:r>
+      <w:r>
+        <w:rPr>
+          <w:rStyle w:val="m"/>
+        </w:rPr>
+        <w:t>right</w:t>
+      </w:r>
+      <w:r>
+        <w:t xml:space="preserve"> = </w:t>
+      </w:r>
+      <w:r>
+        <w:rPr>
+          <w:rStyle w:val="m"/>
+        </w:rPr>
+        <w:t>mid2</w:t>
+      </w:r>
+      <w:r>
+        <w:t xml:space="preserve"> </w:t>
+      </w:r>
+      <w:r>
+        <w:rPr>
+          <w:rStyle w:val="g"/>
+        </w:rPr>
+        <w:t>-</w:t>
+      </w:r>
+      <w:r>
+        <w:t xml:space="preserve"> </w:t>
+      </w:r>
+      <w:r>
+        <w:rPr>
+          <w:rStyle w:val="j"/>
+        </w:rPr>
+        <w:t>1</w:t>
+      </w:r>
+      <w:r>
+        <w:t>;</w:t>
+      </w:r>
+      <w:r>
+        <w:br/>
+        <w:t>}</w:t>
+      </w:r>
+      <w:r>
+        <w:br/>
+        <w:t>}</w:t>
+      </w:r>
+      <w:r>
+        <w:br/>
+      </w:r>
+      <w:r>
+        <w:br/>
+      </w:r>
+      <w:r>
+        <w:rPr>
+          <w:rStyle w:val="g"/>
+        </w:rPr>
+        <w:t>return</w:t>
+      </w:r>
+      <w:r>
+        <w:t xml:space="preserve"> </w:t>
+      </w:r>
+      <w:r>
+        <w:rPr>
+          <w:rStyle w:val="g"/>
+        </w:rPr>
+        <w:t>-</w:t>
+      </w:r>
+      <w:r>
+        <w:rPr>
+          <w:rStyle w:val="j"/>
+        </w:rPr>
+        <w:t>1</w:t>
+      </w:r>
+      <w:r>
+        <w:t>;</w:t>
+      </w:r>
+      <w:r>
+        <w:br/>
+        <w:t>}</w:t>
+      </w:r>
+    </w:p>
+    <w:p>
+      <w:pPr>
+        <w:pStyle w:val="NormalWeb"/>
+      </w:pPr>
+    </w:p>
+    <w:p>
+      <w:pPr>
+        <w:spacing w:before="100" w:beforeAutospacing="1" w:after="100" w:afterAutospacing="1" w:line="240" w:lineRule="auto"/>
+        <w:outlineLvl w:val="0"/>
+        <w:rPr>
+          <w:rFonts w:ascii="Times New Roman" w:eastAsia="Times New Roman" w:hAnsi="Times New Roman" w:cs="Times New Roman"/>
+          <w:b/>
+          <w:bCs/>
+          <w:kern w:val="36"/>
+          <w:sz w:val="48"/>
+          <w:szCs w:val="48"/>
+        </w:rPr>
+      </w:pPr>
+      <w:r>
+        <w:rPr>
+          <w:rFonts w:ascii="Times New Roman" w:eastAsia="Times New Roman" w:hAnsi="Times New Roman" w:cs="Times New Roman"/>
+          <w:b/>
+          <w:bCs/>
+          <w:kern w:val="36"/>
+          <w:sz w:val="48"/>
+          <w:szCs w:val="48"/>
+        </w:rPr>
+        <w:t>Time Complexity</w:t>
+      </w:r>
+    </w:p>
+    <w:p>
+      <w:pPr>
+        <w:numPr>
+          <w:ilvl w:val="0"/>
+          <w:numId w:val="9"/>
+        </w:numPr>
+        <w:spacing w:before="100" w:beforeAutospacing="1" w:after="100" w:afterAutospacing="1" w:line="240" w:lineRule="auto"/>
+        <w:rPr>
+          <w:rFonts w:ascii="Times New Roman" w:eastAsia="Times New Roman" w:hAnsi="Times New Roman" w:cs="Times New Roman"/>
+          <w:sz w:val="24"/>
+          <w:szCs w:val="24"/>
+        </w:rPr>
+      </w:pPr>
+      <w:r>
+        <w:rPr>
+          <w:rFonts w:ascii="Times New Roman" w:eastAsia="Times New Roman" w:hAnsi="Times New Roman" w:cs="Times New Roman"/>
+          <w:sz w:val="24"/>
+          <w:szCs w:val="24"/>
+        </w:rPr>
+        <w:t xml:space="preserve">Best Case: </w:t>
+      </w:r>
+      <w:r>
+        <w:rPr>
+          <w:rFonts w:ascii="Times New Roman" w:eastAsia="Times New Roman" w:hAnsi="Times New Roman" w:cs="Times New Roman"/>
+          <w:b/>
+          <w:bCs/>
+          <w:sz w:val="24"/>
+          <w:szCs w:val="24"/>
+        </w:rPr>
+        <w:t>O(1)</w:t>
+      </w:r>
+      <w:r>
+        <w:rPr>
+          <w:rFonts w:ascii="Times New Roman" w:eastAsia="Times New Roman" w:hAnsi="Times New Roman" w:cs="Times New Roman"/>
+          <w:sz w:val="24"/>
+          <w:szCs w:val="24"/>
+        </w:rPr>
+        <w:t xml:space="preserve"> </w:t>
+      </w:r>
+    </w:p>
+    <w:p>
+      <w:pPr>
+        <w:numPr>
+          <w:ilvl w:val="0"/>
+          <w:numId w:val="9"/>
+        </w:numPr>
+        <w:spacing w:before="100" w:beforeAutospacing="1" w:after="100" w:afterAutospacing="1" w:line="240" w:lineRule="auto"/>
+        <w:rPr>
+          <w:rFonts w:ascii="Times New Roman" w:eastAsia="Times New Roman" w:hAnsi="Times New Roman" w:cs="Times New Roman"/>
+          <w:sz w:val="24"/>
+          <w:szCs w:val="24"/>
+        </w:rPr>
+      </w:pPr>
+      <w:r>
+        <w:rPr>
+          <w:rFonts w:ascii="Times New Roman" w:eastAsia="Times New Roman" w:hAnsi="Times New Roman" w:cs="Times New Roman"/>
+          <w:sz w:val="24"/>
+          <w:szCs w:val="24"/>
+        </w:rPr>
+        <w:t xml:space="preserve">Worst Case: </w:t>
+      </w:r>
+      <w:r>
+        <w:rPr>
+          <w:rFonts w:ascii="Times New Roman" w:eastAsia="Times New Roman" w:hAnsi="Times New Roman" w:cs="Times New Roman"/>
+          <w:b/>
+          <w:bCs/>
+          <w:sz w:val="24"/>
+          <w:szCs w:val="24"/>
+        </w:rPr>
+        <w:t>O(log₃ n)</w:t>
+      </w:r>
+    </w:p>
+    <w:p>
+      <w:pPr>
+        <w:pStyle w:val="NormalWeb"/>
       </w:pPr>
     </w:p>
     <w:p>
@@ -2415,6 +3891,155 @@
     </w:lvl>
   </w:abstractNum>
   <w:abstractNum w:abstractNumId="3">
+    <w:nsid w:val="328A23ED"/>
+    <w:multiLevelType w:val="multilevel"/>
+    <w:tmpl w:val="DB586EA8"/>
+    <w:lvl w:ilvl="0">
+      <w:start w:val="1"/>
+      <w:numFmt w:val="bullet"/>
+      <w:lvlText w:val=""/>
+      <w:lvlJc w:val="left"/>
+      <w:pPr>
+        <w:tabs>
+          <w:tab w:val="num" w:pos="720"/>
+        </w:tabs>
+        <w:ind w:left="720" w:hanging="360"/>
+      </w:pPr>
+      <w:rPr>
+        <w:rFonts w:ascii="Symbol" w:hAnsi="Symbol" w:hint="default"/>
+        <w:sz w:val="20"/>
+      </w:rPr>
+    </w:lvl>
+    <w:lvl w:ilvl="1" w:tentative="1">
+      <w:start w:val="1"/>
+      <w:numFmt w:val="bullet"/>
+      <w:lvlText w:val="o"/>
+      <w:lvlJc w:val="left"/>
+      <w:pPr>
+        <w:tabs>
+          <w:tab w:val="num" w:pos="1440"/>
+        </w:tabs>
+        <w:ind w:left="1440" w:hanging="360"/>
+      </w:pPr>
+      <w:rPr>
+        <w:rFonts w:ascii="Courier New" w:hAnsi="Courier New" w:hint="default"/>
+        <w:sz w:val="20"/>
+      </w:rPr>
+    </w:lvl>
+    <w:lvl w:ilvl="2" w:tentative="1">
+      <w:start w:val="1"/>
+      <w:numFmt w:val="bullet"/>
+      <w:lvlText w:val=""/>
+      <w:lvlJc w:val="left"/>
+      <w:pPr>
+        <w:tabs>
+          <w:tab w:val="num" w:pos="2160"/>
+        </w:tabs>
+        <w:ind w:left="2160" w:hanging="360"/>
+      </w:pPr>
+      <w:rPr>
+        <w:rFonts w:ascii="Wingdings" w:hAnsi="Wingdings" w:hint="default"/>
+        <w:sz w:val="20"/>
+      </w:rPr>
+    </w:lvl>
+    <w:lvl w:ilvl="3" w:tentative="1">
+      <w:start w:val="1"/>
+      <w:numFmt w:val="bullet"/>
+      <w:lvlText w:val=""/>
+      <w:lvlJc w:val="left"/>
+      <w:pPr>
+        <w:tabs>
+          <w:tab w:val="num" w:pos="2880"/>
+        </w:tabs>
+        <w:ind w:left="2880" w:hanging="360"/>
+      </w:pPr>
+      <w:rPr>
+        <w:rFonts w:ascii="Wingdings" w:hAnsi="Wingdings" w:hint="default"/>
+        <w:sz w:val="20"/>
+      </w:rPr>
+    </w:lvl>
+    <w:lvl w:ilvl="4" w:tentative="1">
+      <w:start w:val="1"/>
+      <w:numFmt w:val="bullet"/>
+      <w:lvlText w:val=""/>
+      <w:lvlJc w:val="left"/>
+      <w:pPr>
+        <w:tabs>
+          <w:tab w:val="num" w:pos="3600"/>
+        </w:tabs>
+        <w:ind w:left="3600" w:hanging="360"/>
+      </w:pPr>
+      <w:rPr>
+        <w:rFonts w:ascii="Wingdings" w:hAnsi="Wingdings" w:hint="default"/>
+        <w:sz w:val="20"/>
+      </w:rPr>
+    </w:lvl>
+    <w:lvl w:ilvl="5" w:tentative="1">
+      <w:start w:val="1"/>
+      <w:numFmt w:val="bullet"/>
+      <w:lvlText w:val=""/>
+      <w:lvlJc w:val="left"/>
+      <w:pPr>
+        <w:tabs>
+          <w:tab w:val="num" w:pos="4320"/>
+        </w:tabs>
+        <w:ind w:left="4320" w:hanging="360"/>
+      </w:pPr>
+      <w:rPr>
+        <w:rFonts w:ascii="Wingdings" w:hAnsi="Wingdings" w:hint="default"/>
+        <w:sz w:val="20"/>
+      </w:rPr>
+    </w:lvl>
+    <w:lvl w:ilvl="6" w:tentative="1">
+      <w:start w:val="1"/>
+      <w:numFmt w:val="bullet"/>
+      <w:lvlText w:val=""/>
+      <w:lvlJc w:val="left"/>
+      <w:pPr>
+        <w:tabs>
+          <w:tab w:val="num" w:pos="5040"/>
+        </w:tabs>
+        <w:ind w:left="5040" w:hanging="360"/>
+      </w:pPr>
+      <w:rPr>
+        <w:rFonts w:ascii="Wingdings" w:hAnsi="Wingdings" w:hint="default"/>
+        <w:sz w:val="20"/>
+      </w:rPr>
+    </w:lvl>
+    <w:lvl w:ilvl="7" w:tentative="1">
+      <w:start w:val="1"/>
+      <w:numFmt w:val="bullet"/>
+      <w:lvlText w:val=""/>
+      <w:lvlJc w:val="left"/>
+      <w:pPr>
+        <w:tabs>
+          <w:tab w:val="num" w:pos="5760"/>
+        </w:tabs>
+        <w:ind w:left="5760" w:hanging="360"/>
+      </w:pPr>
+      <w:rPr>
+        <w:rFonts w:ascii="Wingdings" w:hAnsi="Wingdings" w:hint="default"/>
+        <w:sz w:val="20"/>
+      </w:rPr>
+    </w:lvl>
+    <w:lvl w:ilvl="8" w:tentative="1">
+      <w:start w:val="1"/>
+      <w:numFmt w:val="bullet"/>
+      <w:lvlText w:val=""/>
+      <w:lvlJc w:val="left"/>
+      <w:pPr>
+        <w:tabs>
+          <w:tab w:val="num" w:pos="6480"/>
+        </w:tabs>
+        <w:ind w:left="6480" w:hanging="360"/>
+      </w:pPr>
+      <w:rPr>
+        <w:rFonts w:ascii="Wingdings" w:hAnsi="Wingdings" w:hint="default"/>
+        <w:sz w:val="20"/>
+      </w:rPr>
+    </w:lvl>
+  </w:abstractNum>
+  <w:abstractNum w:abstractNumId="4">
     <w:nsid w:val="36D25A31"/>
     <w:multiLevelType w:val="multilevel"/>
     <w:tmpl w:val="8D741E52"/>
@@ -2563,7 +4188,124 @@
       </w:rPr>
     </w:lvl>
   </w:abstractNum>
-  <w:abstractNum w:abstractNumId="4">
+  <w:abstractNum w:abstractNumId="5">
+    <w:nsid w:val="3E8E1A92"/>
+    <w:multiLevelType w:val="multilevel"/>
+    <w:tmpl w:val="30EAEB8A"/>
+    <w:lvl w:ilvl="0">
+      <w:start w:val="1"/>
+      <w:numFmt w:val="decimal"/>
+      <w:lvlText w:val="%1."/>
+      <w:lvlJc w:val="left"/>
+      <w:pPr>
+        <w:tabs>
+          <w:tab w:val="num" w:pos="720"/>
+        </w:tabs>
+        <w:ind w:left="720" w:hanging="360"/>
+      </w:pPr>
+    </w:lvl>
+    <w:lvl w:ilvl="1">
+      <w:start w:val="1"/>
+      <w:numFmt w:val="bullet"/>
+      <w:lvlText w:val="o"/>
+      <w:lvlJc w:val="left"/>
+      <w:pPr>
+        <w:tabs>
+          <w:tab w:val="num" w:pos="1440"/>
+        </w:tabs>
+        <w:ind w:left="1440" w:hanging="360"/>
+      </w:pPr>
+      <w:rPr>
+        <w:rFonts w:ascii="Courier New" w:hAnsi="Courier New" w:hint="default"/>
+        <w:sz w:val="20"/>
+      </w:rPr>
+    </w:lvl>
+    <w:lvl w:ilvl="2" w:tentative="1">
+      <w:start w:val="1"/>
+      <w:numFmt w:val="decimal"/>
+      <w:lvlText w:val="%3."/>
+      <w:lvlJc w:val="left"/>
+      <w:pPr>
+        <w:tabs>
+          <w:tab w:val="num" w:pos="2160"/>
+        </w:tabs>
+        <w:ind w:left="2160" w:hanging="360"/>
+      </w:pPr>
+    </w:lvl>
+    <w:lvl w:ilvl="3" w:tentative="1">
+      <w:start w:val="1"/>
+      <w:numFmt w:val="decimal"/>
+      <w:lvlText w:val="%4."/>
+      <w:lvlJc w:val="left"/>
+      <w:pPr>
+        <w:tabs>
+          <w:tab w:val="num" w:pos="2880"/>
+        </w:tabs>
+        <w:ind w:left="2880" w:hanging="360"/>
+      </w:pPr>
+    </w:lvl>
+    <w:lvl w:ilvl="4" w:tentative="1">
+      <w:start w:val="1"/>
+      <w:numFmt w:val="decimal"/>
+      <w:lvlText w:val="%5."/>
+      <w:lvlJc w:val="left"/>
+      <w:pPr>
+        <w:tabs>
+          <w:tab w:val="num" w:pos="3600"/>
+        </w:tabs>
+        <w:ind w:left="3600" w:hanging="360"/>
+      </w:pPr>
+    </w:lvl>
+    <w:lvl w:ilvl="5" w:tentative="1">
+      <w:start w:val="1"/>
+      <w:numFmt w:val="decimal"/>
+      <w:lvlText w:val="%6."/>
+      <w:lvlJc w:val="left"/>
+      <w:pPr>
+        <w:tabs>
+          <w:tab w:val="num" w:pos="4320"/>
+        </w:tabs>
+        <w:ind w:left="4320" w:hanging="360"/>
+      </w:pPr>
+    </w:lvl>
+    <w:lvl w:ilvl="6" w:tentative="1">
+      <w:start w:val="1"/>
+      <w:numFmt w:val="decimal"/>
+      <w:lvlText w:val="%7."/>
+      <w:lvlJc w:val="left"/>
+      <w:pPr>
+        <w:tabs>
+          <w:tab w:val="num" w:pos="5040"/>
+        </w:tabs>
+        <w:ind w:left="5040" w:hanging="360"/>
+      </w:pPr>
+    </w:lvl>
+    <w:lvl w:ilvl="7" w:tentative="1">
+      <w:start w:val="1"/>
+      <w:numFmt w:val="decimal"/>
+      <w:lvlText w:val="%8."/>
+      <w:lvlJc w:val="left"/>
+      <w:pPr>
+        <w:tabs>
+          <w:tab w:val="num" w:pos="5760"/>
+        </w:tabs>
+        <w:ind w:left="5760" w:hanging="360"/>
+      </w:pPr>
+    </w:lvl>
+    <w:lvl w:ilvl="8" w:tentative="1">
+      <w:start w:val="1"/>
+      <w:numFmt w:val="decimal"/>
+      <w:lvlText w:val="%9."/>
+      <w:lvlJc w:val="left"/>
+      <w:pPr>
+        <w:tabs>
+          <w:tab w:val="num" w:pos="6480"/>
+        </w:tabs>
+        <w:ind w:left="6480" w:hanging="360"/>
+      </w:pPr>
+    </w:lvl>
+  </w:abstractNum>
+  <w:abstractNum w:abstractNumId="6">
     <w:nsid w:val="47F2550C"/>
     <w:multiLevelType w:val="multilevel"/>
     <w:tmpl w:val="DB82CAD2"/>
@@ -2712,7 +4454,124 @@
       </w:rPr>
     </w:lvl>
   </w:abstractNum>
-  <w:abstractNum w:abstractNumId="5">
+  <w:abstractNum w:abstractNumId="7">
+    <w:nsid w:val="66342D61"/>
+    <w:multiLevelType w:val="multilevel"/>
+    <w:tmpl w:val="5AB6879A"/>
+    <w:lvl w:ilvl="0">
+      <w:start w:val="3"/>
+      <w:numFmt w:val="decimal"/>
+      <w:lvlText w:val="%1."/>
+      <w:lvlJc w:val="left"/>
+      <w:pPr>
+        <w:tabs>
+          <w:tab w:val="num" w:pos="720"/>
+        </w:tabs>
+        <w:ind w:left="720" w:hanging="360"/>
+      </w:pPr>
+    </w:lvl>
+    <w:lvl w:ilvl="1">
+      <w:start w:val="1"/>
+      <w:numFmt w:val="bullet"/>
+      <w:lvlText w:val="o"/>
+      <w:lvlJc w:val="left"/>
+      <w:pPr>
+        <w:tabs>
+          <w:tab w:val="num" w:pos="1440"/>
+        </w:tabs>
+        <w:ind w:left="1440" w:hanging="360"/>
+      </w:pPr>
+      <w:rPr>
+        <w:rFonts w:ascii="Courier New" w:hAnsi="Courier New" w:hint="default"/>
+        <w:sz w:val="20"/>
+      </w:rPr>
+    </w:lvl>
+    <w:lvl w:ilvl="2" w:tentative="1">
+      <w:start w:val="1"/>
+      <w:numFmt w:val="decimal"/>
+      <w:lvlText w:val="%3."/>
+      <w:lvlJc w:val="left"/>
+      <w:pPr>
+        <w:tabs>
+          <w:tab w:val="num" w:pos="2160"/>
+        </w:tabs>
+        <w:ind w:left="2160" w:hanging="360"/>
+      </w:pPr>
+    </w:lvl>
+    <w:lvl w:ilvl="3" w:tentative="1">
+      <w:start w:val="1"/>
+      <w:numFmt w:val="decimal"/>
+      <w:lvlText w:val="%4."/>
+      <w:lvlJc w:val="left"/>
+      <w:pPr>
+        <w:tabs>
+          <w:tab w:val="num" w:pos="2880"/>
+        </w:tabs>
+        <w:ind w:left="2880" w:hanging="360"/>
+      </w:pPr>
+    </w:lvl>
+    <w:lvl w:ilvl="4" w:tentative="1">
+      <w:start w:val="1"/>
+      <w:numFmt w:val="decimal"/>
+      <w:lvlText w:val="%5."/>
+      <w:lvlJc w:val="left"/>
+      <w:pPr>
+        <w:tabs>
+          <w:tab w:val="num" w:pos="3600"/>
+        </w:tabs>
+        <w:ind w:left="3600" w:hanging="360"/>
+      </w:pPr>
+    </w:lvl>
+    <w:lvl w:ilvl="5" w:tentative="1">
+      <w:start w:val="1"/>
+      <w:numFmt w:val="decimal"/>
+      <w:lvlText w:val="%6."/>
+      <w:lvlJc w:val="left"/>
+      <w:pPr>
+        <w:tabs>
+          <w:tab w:val="num" w:pos="4320"/>
+        </w:tabs>
+        <w:ind w:left="4320" w:hanging="360"/>
+      </w:pPr>
+    </w:lvl>
+    <w:lvl w:ilvl="6" w:tentative="1">
+      <w:start w:val="1"/>
+      <w:numFmt w:val="decimal"/>
+      <w:lvlText w:val="%7."/>
+      <w:lvlJc w:val="left"/>
+      <w:pPr>
+        <w:tabs>
+          <w:tab w:val="num" w:pos="5040"/>
+        </w:tabs>
+        <w:ind w:left="5040" w:hanging="360"/>
+      </w:pPr>
+    </w:lvl>
+    <w:lvl w:ilvl="7" w:tentative="1">
+      <w:start w:val="1"/>
+      <w:numFmt w:val="decimal"/>
+      <w:lvlText w:val="%8."/>
+      <w:lvlJc w:val="left"/>
+      <w:pPr>
+        <w:tabs>
+          <w:tab w:val="num" w:pos="5760"/>
+        </w:tabs>
+        <w:ind w:left="5760" w:hanging="360"/>
+      </w:pPr>
+    </w:lvl>
+    <w:lvl w:ilvl="8" w:tentative="1">
+      <w:start w:val="1"/>
+      <w:numFmt w:val="decimal"/>
+      <w:lvlText w:val="%9."/>
+      <w:lvlJc w:val="left"/>
+      <w:pPr>
+        <w:tabs>
+          <w:tab w:val="num" w:pos="6480"/>
+        </w:tabs>
+        <w:ind w:left="6480" w:hanging="360"/>
+      </w:pPr>
+    </w:lvl>
+  </w:abstractNum>
+  <w:abstractNum w:abstractNumId="8">
     <w:nsid w:val="68E01D92"/>
     <w:multiLevelType w:val="multilevel"/>
     <w:tmpl w:val="EFFC280C"/>
@@ -2843,13 +4702,22 @@
     <w:abstractNumId w:val="2"/>
   </w:num>
   <w:num w:numId="4">
+    <w:abstractNumId w:val="8"/>
+  </w:num>
+  <w:num w:numId="5">
+    <w:abstractNumId w:val="4"/>
+  </w:num>
+  <w:num w:numId="6">
+    <w:abstractNumId w:val="6"/>
+  </w:num>
+  <w:num w:numId="7">
     <w:abstractNumId w:val="5"/>
   </w:num>
-  <w:num w:numId="5">
+  <w:num w:numId="8">
+    <w:abstractNumId w:val="7"/>
+  </w:num>
+  <w:num w:numId="9">
     <w:abstractNumId w:val="3"/>
-  </w:num>
-  <w:num w:numId="6">
-    <w:abstractNumId w:val="4"/>
   </w:num>
 </w:numbering>
 </file>
@@ -3013,6 +4881,27 @@
   <w:style w:type="paragraph" w:default="1" w:styleId="Normal">
     <w:name w:val="Normal"/>
     <w:qFormat/>
+    <w:rsid w:val="00546F9D"/>
+  </w:style>
+  <w:style w:type="paragraph" w:styleId="Heading1">
+    <w:name w:val="heading 1"/>
+    <w:basedOn w:val="Normal"/>
+    <w:link w:val="Heading1Char"/>
+    <w:uiPriority w:val="9"/>
+    <w:qFormat/>
+    <w:rsid w:val="00196785"/>
+    <w:pPr>
+      <w:spacing w:before="100" w:beforeAutospacing="1" w:after="100" w:afterAutospacing="1" w:line="240" w:lineRule="auto"/>
+      <w:outlineLvl w:val="0"/>
+    </w:pPr>
+    <w:rPr>
+      <w:rFonts w:ascii="Times New Roman" w:eastAsia="Times New Roman" w:hAnsi="Times New Roman" w:cs="Times New Roman"/>
+      <w:b/>
+      <w:bCs/>
+      <w:kern w:val="36"/>
+      <w:sz w:val="48"/>
+      <w:szCs w:val="48"/>
+    </w:rPr>
   </w:style>
   <w:style w:type="character" w:default="1" w:styleId="DefaultParagraphFont">
     <w:name w:val="Default Paragraph Font"/>
@@ -3077,6 +4966,79 @@
     <w:pPr>
       <w:spacing w:after="0" w:line="240" w:lineRule="auto"/>
     </w:pPr>
+  </w:style>
+  <w:style w:type="character" w:customStyle="1" w:styleId="Heading1Char">
+    <w:name w:val="Heading 1 Char"/>
+    <w:basedOn w:val="DefaultParagraphFont"/>
+    <w:link w:val="Heading1"/>
+    <w:uiPriority w:val="9"/>
+    <w:rsid w:val="00196785"/>
+    <w:rPr>
+      <w:rFonts w:ascii="Times New Roman" w:eastAsia="Times New Roman" w:hAnsi="Times New Roman" w:cs="Times New Roman"/>
+      <w:b/>
+      <w:bCs/>
+      <w:kern w:val="36"/>
+      <w:sz w:val="48"/>
+      <w:szCs w:val="48"/>
+    </w:rPr>
+  </w:style>
+  <w:style w:type="character" w:styleId="HTMLCode">
+    <w:name w:val="HTML Code"/>
+    <w:basedOn w:val="DefaultParagraphFont"/>
+    <w:uiPriority w:val="99"/>
+    <w:semiHidden/>
+    <w:unhideWhenUsed/>
+    <w:rsid w:val="00196785"/>
+    <w:rPr>
+      <w:rFonts w:ascii="Courier New" w:eastAsia="Times New Roman" w:hAnsi="Courier New" w:cs="Courier New"/>
+      <w:sz w:val="20"/>
+      <w:szCs w:val="20"/>
+    </w:rPr>
+  </w:style>
+  <w:style w:type="character" w:customStyle="1" w:styleId="katex-mathml">
+    <w:name w:val="katex-mathml"/>
+    <w:basedOn w:val="DefaultParagraphFont"/>
+    <w:rsid w:val="00196785"/>
+  </w:style>
+  <w:style w:type="character" w:customStyle="1" w:styleId="mord">
+    <w:name w:val="mord"/>
+    <w:basedOn w:val="DefaultParagraphFont"/>
+    <w:rsid w:val="00196785"/>
+  </w:style>
+  <w:style w:type="character" w:customStyle="1" w:styleId="mrel">
+    <w:name w:val="mrel"/>
+    <w:basedOn w:val="DefaultParagraphFont"/>
+    <w:rsid w:val="00196785"/>
+  </w:style>
+  <w:style w:type="character" w:customStyle="1" w:styleId="mbin">
+    <w:name w:val="mbin"/>
+    <w:basedOn w:val="DefaultParagraphFont"/>
+    <w:rsid w:val="00196785"/>
+  </w:style>
+  <w:style w:type="character" w:customStyle="1" w:styleId="vlist-s">
+    <w:name w:val="vlist-s"/>
+    <w:basedOn w:val="DefaultParagraphFont"/>
+    <w:rsid w:val="00196785"/>
+  </w:style>
+  <w:style w:type="character" w:customStyle="1" w:styleId="m">
+    <w:name w:val="ͼm"/>
+    <w:basedOn w:val="DefaultParagraphFont"/>
+    <w:rsid w:val="00196785"/>
+  </w:style>
+  <w:style w:type="character" w:customStyle="1" w:styleId="g">
+    <w:name w:val="ͼg"/>
+    <w:basedOn w:val="DefaultParagraphFont"/>
+    <w:rsid w:val="00196785"/>
+  </w:style>
+  <w:style w:type="character" w:customStyle="1" w:styleId="j">
+    <w:name w:val="ͼj"/>
+    <w:basedOn w:val="DefaultParagraphFont"/>
+    <w:rsid w:val="00196785"/>
+  </w:style>
+  <w:style w:type="character" w:customStyle="1" w:styleId="e">
+    <w:name w:val="ͼe"/>
+    <w:basedOn w:val="DefaultParagraphFont"/>
+    <w:rsid w:val="00196785"/>
   </w:style>
 </w:styles>
 </file>

</xml_diff>

<commit_message>
Adding Jump Search Algo
</commit_message>
<xml_diff>
--- a/Searching Algorithm/Basics.docx
+++ b/Searching Algorithm/Basics.docx
@@ -3451,17 +3451,1211 @@
     <w:p>
       <w:pPr>
         <w:pStyle w:val="NormalWeb"/>
-      </w:pPr>
-    </w:p>
-    <w:p>
-      <w:pPr>
+        <w:jc w:val="center"/>
         <w:rPr>
           <w:b/>
           <w:sz w:val="36"/>
           <w:szCs w:val="36"/>
         </w:rPr>
       </w:pPr>
-    </w:p>
+      <w:r>
+        <w:rPr>
+          <w:b/>
+          <w:sz w:val="36"/>
+          <w:szCs w:val="36"/>
+        </w:rPr>
+        <w:lastRenderedPageBreak/>
+        <w:t>Jump Search</w:t>
+      </w:r>
+    </w:p>
+    <w:p>
+      <w:pPr>
+        <w:spacing w:before="100" w:beforeAutospacing="1" w:after="100" w:afterAutospacing="1" w:line="240" w:lineRule="auto"/>
+        <w:rPr>
+          <w:rFonts w:ascii="Times New Roman" w:eastAsia="Times New Roman" w:hAnsi="Times New Roman" w:cs="Times New Roman"/>
+          <w:sz w:val="24"/>
+          <w:szCs w:val="24"/>
+        </w:rPr>
+      </w:pPr>
+      <w:r>
+        <w:rPr>
+          <w:rFonts w:ascii="Times New Roman" w:eastAsia="Times New Roman" w:hAnsi="Times New Roman" w:cs="Times New Roman"/>
+          <w:sz w:val="24"/>
+          <w:szCs w:val="24"/>
+        </w:rPr>
+        <w:t xml:space="preserve">Jump Search is a searching algorithm used for </w:t>
+      </w:r>
+      <w:r>
+        <w:rPr>
+          <w:rFonts w:ascii="Times New Roman" w:eastAsia="Times New Roman" w:hAnsi="Times New Roman" w:cs="Times New Roman"/>
+          <w:b/>
+          <w:bCs/>
+          <w:sz w:val="24"/>
+          <w:szCs w:val="24"/>
+        </w:rPr>
+        <w:t>sorted arrays</w:t>
+      </w:r>
+      <w:r>
+        <w:rPr>
+          <w:rFonts w:ascii="Times New Roman" w:eastAsia="Times New Roman" w:hAnsi="Times New Roman" w:cs="Times New Roman"/>
+          <w:sz w:val="24"/>
+          <w:szCs w:val="24"/>
+        </w:rPr>
+        <w:t>.</w:t>
+      </w:r>
+    </w:p>
+    <w:p>
+      <w:pPr>
+        <w:spacing w:before="100" w:beforeAutospacing="1" w:after="100" w:afterAutospacing="1" w:line="240" w:lineRule="auto"/>
+        <w:rPr>
+          <w:rFonts w:ascii="Times New Roman" w:eastAsia="Times New Roman" w:hAnsi="Times New Roman" w:cs="Times New Roman"/>
+          <w:sz w:val="24"/>
+          <w:szCs w:val="24"/>
+        </w:rPr>
+      </w:pPr>
+      <w:r>
+        <w:rPr>
+          <w:rFonts w:ascii="Times New Roman" w:eastAsia="Times New Roman" w:hAnsi="Times New Roman" w:cs="Times New Roman"/>
+          <w:sz w:val="24"/>
+          <w:szCs w:val="24"/>
+        </w:rPr>
+        <w:t>Instead of checking every element one by one, it:</w:t>
+      </w:r>
+    </w:p>
+    <w:p>
+      <w:pPr>
+        <w:numPr>
+          <w:ilvl w:val="0"/>
+          <w:numId w:val="10"/>
+        </w:numPr>
+        <w:spacing w:before="100" w:beforeAutospacing="1" w:after="100" w:afterAutospacing="1" w:line="240" w:lineRule="auto"/>
+        <w:rPr>
+          <w:rFonts w:ascii="Times New Roman" w:eastAsia="Times New Roman" w:hAnsi="Times New Roman" w:cs="Times New Roman"/>
+          <w:sz w:val="24"/>
+          <w:szCs w:val="24"/>
+        </w:rPr>
+      </w:pPr>
+      <w:r>
+        <w:rPr>
+          <w:rFonts w:ascii="Times New Roman" w:eastAsia="Times New Roman" w:hAnsi="Times New Roman" w:cs="Times New Roman"/>
+          <w:b/>
+          <w:bCs/>
+          <w:sz w:val="24"/>
+          <w:szCs w:val="24"/>
+        </w:rPr>
+        <w:t>Jumps</w:t>
+      </w:r>
+      <w:r>
+        <w:rPr>
+          <w:rFonts w:ascii="Times New Roman" w:eastAsia="Times New Roman" w:hAnsi="Times New Roman" w:cs="Times New Roman"/>
+          <w:sz w:val="24"/>
+          <w:szCs w:val="24"/>
+        </w:rPr>
+        <w:t xml:space="preserve"> ahead by fixed steps </w:t>
+      </w:r>
+    </w:p>
+    <w:p>
+      <w:pPr>
+        <w:numPr>
+          <w:ilvl w:val="0"/>
+          <w:numId w:val="10"/>
+        </w:numPr>
+        <w:spacing w:before="100" w:beforeAutospacing="1" w:after="100" w:afterAutospacing="1" w:line="240" w:lineRule="auto"/>
+        <w:rPr>
+          <w:rFonts w:ascii="Times New Roman" w:eastAsia="Times New Roman" w:hAnsi="Times New Roman" w:cs="Times New Roman"/>
+          <w:sz w:val="24"/>
+          <w:szCs w:val="24"/>
+        </w:rPr>
+      </w:pPr>
+      <w:r>
+        <w:rPr>
+          <w:rFonts w:ascii="Times New Roman" w:eastAsia="Times New Roman" w:hAnsi="Times New Roman" w:cs="Times New Roman"/>
+          <w:sz w:val="24"/>
+          <w:szCs w:val="24"/>
+        </w:rPr>
+        <w:t xml:space="preserve">Finds the possible block </w:t>
+      </w:r>
+    </w:p>
+    <w:p>
+      <w:pPr>
+        <w:numPr>
+          <w:ilvl w:val="0"/>
+          <w:numId w:val="10"/>
+        </w:numPr>
+        <w:spacing w:before="100" w:beforeAutospacing="1" w:after="100" w:afterAutospacing="1" w:line="240" w:lineRule="auto"/>
+        <w:rPr>
+          <w:rFonts w:ascii="Times New Roman" w:eastAsia="Times New Roman" w:hAnsi="Times New Roman" w:cs="Times New Roman"/>
+          <w:sz w:val="24"/>
+          <w:szCs w:val="24"/>
+        </w:rPr>
+      </w:pPr>
+      <w:r>
+        <w:rPr>
+          <w:rFonts w:ascii="Times New Roman" w:eastAsia="Times New Roman" w:hAnsi="Times New Roman" w:cs="Times New Roman"/>
+          <w:sz w:val="24"/>
+          <w:szCs w:val="24"/>
+        </w:rPr>
+        <w:t xml:space="preserve">Then performs </w:t>
+      </w:r>
+      <w:r>
+        <w:rPr>
+          <w:rFonts w:ascii="Times New Roman" w:eastAsia="Times New Roman" w:hAnsi="Times New Roman" w:cs="Times New Roman"/>
+          <w:b/>
+          <w:bCs/>
+          <w:sz w:val="24"/>
+          <w:szCs w:val="24"/>
+        </w:rPr>
+        <w:t>linear search</w:t>
+      </w:r>
+      <w:r>
+        <w:rPr>
+          <w:rFonts w:ascii="Times New Roman" w:eastAsia="Times New Roman" w:hAnsi="Times New Roman" w:cs="Times New Roman"/>
+          <w:sz w:val="24"/>
+          <w:szCs w:val="24"/>
+        </w:rPr>
+        <w:t xml:space="preserve"> inside that block </w:t>
+      </w:r>
+    </w:p>
+    <w:p>
+      <w:pPr>
+        <w:spacing w:before="100" w:beforeAutospacing="1" w:after="100" w:afterAutospacing="1" w:line="240" w:lineRule="auto"/>
+        <w:rPr>
+          <w:rFonts w:ascii="Times New Roman" w:eastAsia="Times New Roman" w:hAnsi="Times New Roman" w:cs="Times New Roman"/>
+          <w:sz w:val="24"/>
+          <w:szCs w:val="24"/>
+        </w:rPr>
+      </w:pPr>
+      <w:r>
+        <w:rPr>
+          <w:rFonts w:ascii="Times New Roman" w:eastAsia="Times New Roman" w:hAnsi="Times New Roman" w:cs="Times New Roman"/>
+          <w:sz w:val="24"/>
+          <w:szCs w:val="24"/>
+        </w:rPr>
+        <w:t xml:space="preserve">⚠️ Array must be </w:t>
+      </w:r>
+      <w:r>
+        <w:rPr>
+          <w:rFonts w:ascii="Times New Roman" w:eastAsia="Times New Roman" w:hAnsi="Times New Roman" w:cs="Times New Roman"/>
+          <w:b/>
+          <w:bCs/>
+          <w:sz w:val="24"/>
+          <w:szCs w:val="24"/>
+        </w:rPr>
+        <w:t>sorted</w:t>
+      </w:r>
+      <w:r>
+        <w:rPr>
+          <w:rFonts w:ascii="Times New Roman" w:eastAsia="Times New Roman" w:hAnsi="Times New Roman" w:cs="Times New Roman"/>
+          <w:sz w:val="24"/>
+          <w:szCs w:val="24"/>
+        </w:rPr>
+        <w:t>.</w:t>
+      </w:r>
+    </w:p>
+    <w:tbl>
+      <w:tblPr>
+        <w:tblW w:w="0" w:type="auto"/>
+        <w:tblCellSpacing w:w="15" w:type="dxa"/>
+        <w:tblCellMar>
+          <w:top w:w="15" w:type="dxa"/>
+          <w:left w:w="15" w:type="dxa"/>
+          <w:bottom w:w="15" w:type="dxa"/>
+          <w:right w:w="15" w:type="dxa"/>
+        </w:tblCellMar>
+        <w:tblLook w:val="04A0"/>
+      </w:tblPr>
+      <w:tblGrid>
+        <w:gridCol w:w="549"/>
+        <w:gridCol w:w="1567"/>
+        <w:gridCol w:w="6151"/>
+      </w:tblGrid>
+      <w:tr>
+        <w:trPr>
+          <w:tblHeader/>
+          <w:tblCellSpacing w:w="15" w:type="dxa"/>
+        </w:trPr>
+        <w:tc>
+          <w:tcPr>
+            <w:tcW w:w="0" w:type="auto"/>
+            <w:tcBorders>
+              <w:top w:val="single" w:sz="4" w:space="0" w:color="auto"/>
+              <w:left w:val="single" w:sz="4" w:space="0" w:color="auto"/>
+              <w:bottom w:val="single" w:sz="4" w:space="0" w:color="auto"/>
+              <w:right w:val="single" w:sz="4" w:space="0" w:color="auto"/>
+            </w:tcBorders>
+            <w:vAlign w:val="center"/>
+            <w:hideMark/>
+          </w:tcPr>
+          <w:p>
+            <w:pPr>
+              <w:spacing w:after="320" w:line="240" w:lineRule="auto"/>
+              <w:rPr>
+                <w:rFonts w:ascii="Times New Roman" w:eastAsia="Times New Roman" w:hAnsi="Times New Roman" w:cs="Times New Roman"/>
+                <w:sz w:val="24"/>
+                <w:szCs w:val="24"/>
+              </w:rPr>
+            </w:pPr>
+            <w:r>
+              <w:rPr>
+                <w:rFonts w:ascii="Times New Roman" w:eastAsia="Times New Roman" w:hAnsi="Times New Roman" w:cs="Times New Roman"/>
+                <w:b/>
+                <w:bCs/>
+                <w:sz w:val="24"/>
+                <w:szCs w:val="24"/>
+              </w:rPr>
+              <w:t>Step</w:t>
+            </w:r>
+          </w:p>
+        </w:tc>
+        <w:tc>
+          <w:tcPr>
+            <w:tcW w:w="0" w:type="auto"/>
+            <w:tcBorders>
+              <w:top w:val="single" w:sz="4" w:space="0" w:color="auto"/>
+              <w:left w:val="single" w:sz="4" w:space="0" w:color="auto"/>
+              <w:bottom w:val="single" w:sz="4" w:space="0" w:color="auto"/>
+              <w:right w:val="single" w:sz="4" w:space="0" w:color="auto"/>
+            </w:tcBorders>
+            <w:vAlign w:val="center"/>
+            <w:hideMark/>
+          </w:tcPr>
+          <w:p>
+            <w:pPr>
+              <w:spacing w:after="320" w:line="240" w:lineRule="auto"/>
+              <w:rPr>
+                <w:rFonts w:ascii="Times New Roman" w:eastAsia="Times New Roman" w:hAnsi="Times New Roman" w:cs="Times New Roman"/>
+                <w:sz w:val="24"/>
+                <w:szCs w:val="24"/>
+              </w:rPr>
+            </w:pPr>
+            <w:r>
+              <w:rPr>
+                <w:rFonts w:ascii="Times New Roman" w:eastAsia="Times New Roman" w:hAnsi="Times New Roman" w:cs="Times New Roman"/>
+                <w:b/>
+                <w:bCs/>
+                <w:sz w:val="24"/>
+                <w:szCs w:val="24"/>
+              </w:rPr>
+              <w:t>Action</w:t>
+            </w:r>
+          </w:p>
+        </w:tc>
+        <w:tc>
+          <w:tcPr>
+            <w:tcW w:w="0" w:type="auto"/>
+            <w:tcBorders>
+              <w:top w:val="single" w:sz="4" w:space="0" w:color="auto"/>
+              <w:left w:val="single" w:sz="4" w:space="0" w:color="auto"/>
+              <w:bottom w:val="single" w:sz="4" w:space="0" w:color="auto"/>
+              <w:right w:val="single" w:sz="4" w:space="0" w:color="auto"/>
+            </w:tcBorders>
+            <w:vAlign w:val="center"/>
+            <w:hideMark/>
+          </w:tcPr>
+          <w:p>
+            <w:pPr>
+              <w:spacing w:after="320" w:line="240" w:lineRule="auto"/>
+              <w:rPr>
+                <w:rFonts w:ascii="Times New Roman" w:eastAsia="Times New Roman" w:hAnsi="Times New Roman" w:cs="Times New Roman"/>
+                <w:sz w:val="24"/>
+                <w:szCs w:val="24"/>
+              </w:rPr>
+            </w:pPr>
+            <w:r>
+              <w:rPr>
+                <w:rFonts w:ascii="Times New Roman" w:eastAsia="Times New Roman" w:hAnsi="Times New Roman" w:cs="Times New Roman"/>
+                <w:b/>
+                <w:bCs/>
+                <w:sz w:val="24"/>
+                <w:szCs w:val="24"/>
+              </w:rPr>
+              <w:t>Logic</w:t>
+            </w:r>
+          </w:p>
+        </w:tc>
+      </w:tr>
+      <w:tr>
+        <w:trPr>
+          <w:tblCellSpacing w:w="15" w:type="dxa"/>
+        </w:trPr>
+        <w:tc>
+          <w:tcPr>
+            <w:tcW w:w="0" w:type="auto"/>
+            <w:tcBorders>
+              <w:top w:val="single" w:sz="4" w:space="0" w:color="auto"/>
+              <w:left w:val="single" w:sz="4" w:space="0" w:color="auto"/>
+              <w:bottom w:val="single" w:sz="4" w:space="0" w:color="auto"/>
+              <w:right w:val="single" w:sz="4" w:space="0" w:color="auto"/>
+            </w:tcBorders>
+            <w:vAlign w:val="center"/>
+            <w:hideMark/>
+          </w:tcPr>
+          <w:p>
+            <w:pPr>
+              <w:spacing w:after="320" w:line="240" w:lineRule="auto"/>
+              <w:rPr>
+                <w:rFonts w:ascii="Times New Roman" w:eastAsia="Times New Roman" w:hAnsi="Times New Roman" w:cs="Times New Roman"/>
+                <w:sz w:val="24"/>
+                <w:szCs w:val="24"/>
+              </w:rPr>
+            </w:pPr>
+            <w:r>
+              <w:rPr>
+                <w:rFonts w:ascii="Times New Roman" w:eastAsia="Times New Roman" w:hAnsi="Times New Roman" w:cs="Times New Roman"/>
+                <w:b/>
+                <w:bCs/>
+                <w:sz w:val="24"/>
+                <w:szCs w:val="24"/>
+              </w:rPr>
+              <w:t>1</w:t>
+            </w:r>
+          </w:p>
+        </w:tc>
+        <w:tc>
+          <w:tcPr>
+            <w:tcW w:w="0" w:type="auto"/>
+            <w:tcBorders>
+              <w:top w:val="single" w:sz="4" w:space="0" w:color="auto"/>
+              <w:left w:val="single" w:sz="4" w:space="0" w:color="auto"/>
+              <w:bottom w:val="single" w:sz="4" w:space="0" w:color="auto"/>
+              <w:right w:val="single" w:sz="4" w:space="0" w:color="auto"/>
+            </w:tcBorders>
+            <w:vAlign w:val="center"/>
+            <w:hideMark/>
+          </w:tcPr>
+          <w:p>
+            <w:pPr>
+              <w:spacing w:after="320" w:line="240" w:lineRule="auto"/>
+              <w:rPr>
+                <w:rFonts w:ascii="Times New Roman" w:eastAsia="Times New Roman" w:hAnsi="Times New Roman" w:cs="Times New Roman"/>
+                <w:sz w:val="24"/>
+                <w:szCs w:val="24"/>
+              </w:rPr>
+            </w:pPr>
+            <w:r>
+              <w:rPr>
+                <w:rFonts w:ascii="Times New Roman" w:eastAsia="Times New Roman" w:hAnsi="Times New Roman" w:cs="Times New Roman"/>
+                <w:sz w:val="24"/>
+                <w:szCs w:val="24"/>
+              </w:rPr>
+              <w:t>Calculate Jump</w:t>
+            </w:r>
+          </w:p>
+        </w:tc>
+        <w:tc>
+          <w:tcPr>
+            <w:tcW w:w="0" w:type="auto"/>
+            <w:tcBorders>
+              <w:top w:val="single" w:sz="4" w:space="0" w:color="auto"/>
+              <w:left w:val="single" w:sz="4" w:space="0" w:color="auto"/>
+              <w:bottom w:val="single" w:sz="4" w:space="0" w:color="auto"/>
+              <w:right w:val="single" w:sz="4" w:space="0" w:color="auto"/>
+            </w:tcBorders>
+            <w:vAlign w:val="center"/>
+            <w:hideMark/>
+          </w:tcPr>
+          <w:p>
+            <w:pPr>
+              <w:spacing w:after="320" w:line="240" w:lineRule="auto"/>
+              <w:rPr>
+                <w:rFonts w:ascii="Times New Roman" w:eastAsia="Times New Roman" w:hAnsi="Times New Roman" w:cs="Times New Roman"/>
+                <w:sz w:val="24"/>
+                <w:szCs w:val="24"/>
+              </w:rPr>
+            </w:pPr>
+            <w:r>
+              <w:rPr>
+                <w:rFonts w:ascii="Times New Roman" w:eastAsia="Times New Roman" w:hAnsi="Times New Roman" w:cs="Times New Roman"/>
+                <w:sz w:val="24"/>
+                <w:szCs w:val="24"/>
+              </w:rPr>
+              <w:t>$\</w:t>
+            </w:r>
+            <w:proofErr w:type="spellStart"/>
+            <w:proofErr w:type="gramStart"/>
+            <w:r>
+              <w:rPr>
+                <w:rFonts w:ascii="Times New Roman" w:eastAsia="Times New Roman" w:hAnsi="Times New Roman" w:cs="Times New Roman"/>
+                <w:sz w:val="24"/>
+                <w:szCs w:val="24"/>
+              </w:rPr>
+              <w:t>sqrt</w:t>
+            </w:r>
+            <w:proofErr w:type="spellEnd"/>
+            <w:r>
+              <w:rPr>
+                <w:rFonts w:ascii="Times New Roman" w:eastAsia="Times New Roman" w:hAnsi="Times New Roman" w:cs="Times New Roman"/>
+                <w:sz w:val="24"/>
+                <w:szCs w:val="24"/>
+              </w:rPr>
+              <w:t>{</w:t>
+            </w:r>
+            <w:proofErr w:type="gramEnd"/>
+            <w:r>
+              <w:rPr>
+                <w:rFonts w:ascii="Times New Roman" w:eastAsia="Times New Roman" w:hAnsi="Times New Roman" w:cs="Times New Roman"/>
+                <w:sz w:val="24"/>
+                <w:szCs w:val="24"/>
+              </w:rPr>
+              <w:t>9} = 3$. Jump size $m = 3$.</w:t>
+            </w:r>
+          </w:p>
+        </w:tc>
+      </w:tr>
+      <w:tr>
+        <w:trPr>
+          <w:tblCellSpacing w:w="15" w:type="dxa"/>
+        </w:trPr>
+        <w:tc>
+          <w:tcPr>
+            <w:tcW w:w="0" w:type="auto"/>
+            <w:tcBorders>
+              <w:top w:val="single" w:sz="4" w:space="0" w:color="auto"/>
+              <w:left w:val="single" w:sz="4" w:space="0" w:color="auto"/>
+              <w:bottom w:val="single" w:sz="4" w:space="0" w:color="auto"/>
+              <w:right w:val="single" w:sz="4" w:space="0" w:color="auto"/>
+            </w:tcBorders>
+            <w:vAlign w:val="center"/>
+            <w:hideMark/>
+          </w:tcPr>
+          <w:p>
+            <w:pPr>
+              <w:spacing w:after="320" w:line="240" w:lineRule="auto"/>
+              <w:rPr>
+                <w:rFonts w:ascii="Times New Roman" w:eastAsia="Times New Roman" w:hAnsi="Times New Roman" w:cs="Times New Roman"/>
+                <w:sz w:val="24"/>
+                <w:szCs w:val="24"/>
+              </w:rPr>
+            </w:pPr>
+            <w:r>
+              <w:rPr>
+                <w:rFonts w:ascii="Times New Roman" w:eastAsia="Times New Roman" w:hAnsi="Times New Roman" w:cs="Times New Roman"/>
+                <w:b/>
+                <w:bCs/>
+                <w:sz w:val="24"/>
+                <w:szCs w:val="24"/>
+              </w:rPr>
+              <w:t>2</w:t>
+            </w:r>
+          </w:p>
+        </w:tc>
+        <w:tc>
+          <w:tcPr>
+            <w:tcW w:w="0" w:type="auto"/>
+            <w:tcBorders>
+              <w:top w:val="single" w:sz="4" w:space="0" w:color="auto"/>
+              <w:left w:val="single" w:sz="4" w:space="0" w:color="auto"/>
+              <w:bottom w:val="single" w:sz="4" w:space="0" w:color="auto"/>
+              <w:right w:val="single" w:sz="4" w:space="0" w:color="auto"/>
+            </w:tcBorders>
+            <w:vAlign w:val="center"/>
+            <w:hideMark/>
+          </w:tcPr>
+          <w:p>
+            <w:pPr>
+              <w:spacing w:after="320" w:line="240" w:lineRule="auto"/>
+              <w:rPr>
+                <w:rFonts w:ascii="Times New Roman" w:eastAsia="Times New Roman" w:hAnsi="Times New Roman" w:cs="Times New Roman"/>
+                <w:sz w:val="24"/>
+                <w:szCs w:val="24"/>
+              </w:rPr>
+            </w:pPr>
+            <w:r>
+              <w:rPr>
+                <w:rFonts w:ascii="Times New Roman" w:eastAsia="Times New Roman" w:hAnsi="Times New Roman" w:cs="Times New Roman"/>
+                <w:sz w:val="24"/>
+                <w:szCs w:val="24"/>
+              </w:rPr>
+              <w:t>Jump 1</w:t>
+            </w:r>
+          </w:p>
+        </w:tc>
+        <w:tc>
+          <w:tcPr>
+            <w:tcW w:w="0" w:type="auto"/>
+            <w:tcBorders>
+              <w:top w:val="single" w:sz="4" w:space="0" w:color="auto"/>
+              <w:left w:val="single" w:sz="4" w:space="0" w:color="auto"/>
+              <w:bottom w:val="single" w:sz="4" w:space="0" w:color="auto"/>
+              <w:right w:val="single" w:sz="4" w:space="0" w:color="auto"/>
+            </w:tcBorders>
+            <w:vAlign w:val="center"/>
+            <w:hideMark/>
+          </w:tcPr>
+          <w:p>
+            <w:pPr>
+              <w:spacing w:after="320" w:line="240" w:lineRule="auto"/>
+              <w:rPr>
+                <w:rFonts w:ascii="Times New Roman" w:eastAsia="Times New Roman" w:hAnsi="Times New Roman" w:cs="Times New Roman"/>
+                <w:sz w:val="24"/>
+                <w:szCs w:val="24"/>
+              </w:rPr>
+            </w:pPr>
+            <w:r>
+              <w:rPr>
+                <w:rFonts w:ascii="Times New Roman" w:eastAsia="Times New Roman" w:hAnsi="Times New Roman" w:cs="Times New Roman"/>
+                <w:sz w:val="24"/>
+                <w:szCs w:val="24"/>
+              </w:rPr>
+              <w:t xml:space="preserve">Check index 3 (Value: </w:t>
+            </w:r>
+            <w:r>
+              <w:rPr>
+                <w:rFonts w:ascii="Courier New" w:eastAsia="Times New Roman" w:hAnsi="Courier New" w:cs="Courier New"/>
+                <w:sz w:val="20"/>
+              </w:rPr>
+              <w:t>40</w:t>
+            </w:r>
+            <w:r>
+              <w:rPr>
+                <w:rFonts w:ascii="Times New Roman" w:eastAsia="Times New Roman" w:hAnsi="Times New Roman" w:cs="Times New Roman"/>
+                <w:sz w:val="24"/>
+                <w:szCs w:val="24"/>
+              </w:rPr>
+              <w:t>). $40 &lt; 55$, keep jumping.</w:t>
+            </w:r>
+          </w:p>
+        </w:tc>
+      </w:tr>
+      <w:tr>
+        <w:trPr>
+          <w:tblCellSpacing w:w="15" w:type="dxa"/>
+        </w:trPr>
+        <w:tc>
+          <w:tcPr>
+            <w:tcW w:w="0" w:type="auto"/>
+            <w:tcBorders>
+              <w:top w:val="single" w:sz="4" w:space="0" w:color="auto"/>
+              <w:left w:val="single" w:sz="4" w:space="0" w:color="auto"/>
+              <w:bottom w:val="single" w:sz="4" w:space="0" w:color="auto"/>
+              <w:right w:val="single" w:sz="4" w:space="0" w:color="auto"/>
+            </w:tcBorders>
+            <w:vAlign w:val="center"/>
+            <w:hideMark/>
+          </w:tcPr>
+          <w:p>
+            <w:pPr>
+              <w:spacing w:after="320" w:line="240" w:lineRule="auto"/>
+              <w:rPr>
+                <w:rFonts w:ascii="Times New Roman" w:eastAsia="Times New Roman" w:hAnsi="Times New Roman" w:cs="Times New Roman"/>
+                <w:sz w:val="24"/>
+                <w:szCs w:val="24"/>
+              </w:rPr>
+            </w:pPr>
+            <w:r>
+              <w:rPr>
+                <w:rFonts w:ascii="Times New Roman" w:eastAsia="Times New Roman" w:hAnsi="Times New Roman" w:cs="Times New Roman"/>
+                <w:b/>
+                <w:bCs/>
+                <w:sz w:val="24"/>
+                <w:szCs w:val="24"/>
+              </w:rPr>
+              <w:t>3</w:t>
+            </w:r>
+          </w:p>
+        </w:tc>
+        <w:tc>
+          <w:tcPr>
+            <w:tcW w:w="0" w:type="auto"/>
+            <w:tcBorders>
+              <w:top w:val="single" w:sz="4" w:space="0" w:color="auto"/>
+              <w:left w:val="single" w:sz="4" w:space="0" w:color="auto"/>
+              <w:bottom w:val="single" w:sz="4" w:space="0" w:color="auto"/>
+              <w:right w:val="single" w:sz="4" w:space="0" w:color="auto"/>
+            </w:tcBorders>
+            <w:vAlign w:val="center"/>
+            <w:hideMark/>
+          </w:tcPr>
+          <w:p>
+            <w:pPr>
+              <w:spacing w:after="320" w:line="240" w:lineRule="auto"/>
+              <w:rPr>
+                <w:rFonts w:ascii="Times New Roman" w:eastAsia="Times New Roman" w:hAnsi="Times New Roman" w:cs="Times New Roman"/>
+                <w:sz w:val="24"/>
+                <w:szCs w:val="24"/>
+              </w:rPr>
+            </w:pPr>
+            <w:r>
+              <w:rPr>
+                <w:rFonts w:ascii="Times New Roman" w:eastAsia="Times New Roman" w:hAnsi="Times New Roman" w:cs="Times New Roman"/>
+                <w:sz w:val="24"/>
+                <w:szCs w:val="24"/>
+              </w:rPr>
+              <w:t>Jump 2</w:t>
+            </w:r>
+          </w:p>
+        </w:tc>
+        <w:tc>
+          <w:tcPr>
+            <w:tcW w:w="0" w:type="auto"/>
+            <w:tcBorders>
+              <w:top w:val="single" w:sz="4" w:space="0" w:color="auto"/>
+              <w:left w:val="single" w:sz="4" w:space="0" w:color="auto"/>
+              <w:bottom w:val="single" w:sz="4" w:space="0" w:color="auto"/>
+              <w:right w:val="single" w:sz="4" w:space="0" w:color="auto"/>
+            </w:tcBorders>
+            <w:vAlign w:val="center"/>
+            <w:hideMark/>
+          </w:tcPr>
+          <w:p>
+            <w:pPr>
+              <w:spacing w:after="320" w:line="240" w:lineRule="auto"/>
+              <w:rPr>
+                <w:rFonts w:ascii="Times New Roman" w:eastAsia="Times New Roman" w:hAnsi="Times New Roman" w:cs="Times New Roman"/>
+                <w:sz w:val="24"/>
+                <w:szCs w:val="24"/>
+              </w:rPr>
+            </w:pPr>
+            <w:r>
+              <w:rPr>
+                <w:rFonts w:ascii="Times New Roman" w:eastAsia="Times New Roman" w:hAnsi="Times New Roman" w:cs="Times New Roman"/>
+                <w:sz w:val="24"/>
+                <w:szCs w:val="24"/>
+              </w:rPr>
+              <w:t xml:space="preserve">Check index 6 (Value: </w:t>
+            </w:r>
+            <w:r>
+              <w:rPr>
+                <w:rFonts w:ascii="Courier New" w:eastAsia="Times New Roman" w:hAnsi="Courier New" w:cs="Courier New"/>
+                <w:sz w:val="20"/>
+              </w:rPr>
+              <w:t>70</w:t>
+            </w:r>
+            <w:r>
+              <w:rPr>
+                <w:rFonts w:ascii="Times New Roman" w:eastAsia="Times New Roman" w:hAnsi="Times New Roman" w:cs="Times New Roman"/>
+                <w:sz w:val="24"/>
+                <w:szCs w:val="24"/>
+              </w:rPr>
+              <w:t xml:space="preserve">). $70 &gt; 55$. </w:t>
+            </w:r>
+            <w:r>
+              <w:rPr>
+                <w:rFonts w:ascii="Times New Roman" w:eastAsia="Times New Roman" w:hAnsi="Times New Roman" w:cs="Times New Roman"/>
+                <w:b/>
+                <w:bCs/>
+                <w:sz w:val="24"/>
+                <w:szCs w:val="24"/>
+              </w:rPr>
+              <w:t>Stop jumping.</w:t>
+            </w:r>
+          </w:p>
+        </w:tc>
+      </w:tr>
+      <w:tr>
+        <w:trPr>
+          <w:tblCellSpacing w:w="15" w:type="dxa"/>
+        </w:trPr>
+        <w:tc>
+          <w:tcPr>
+            <w:tcW w:w="0" w:type="auto"/>
+            <w:tcBorders>
+              <w:top w:val="single" w:sz="4" w:space="0" w:color="auto"/>
+              <w:left w:val="single" w:sz="4" w:space="0" w:color="auto"/>
+              <w:bottom w:val="single" w:sz="4" w:space="0" w:color="auto"/>
+              <w:right w:val="single" w:sz="4" w:space="0" w:color="auto"/>
+            </w:tcBorders>
+            <w:vAlign w:val="center"/>
+            <w:hideMark/>
+          </w:tcPr>
+          <w:p>
+            <w:pPr>
+              <w:spacing w:after="320" w:line="240" w:lineRule="auto"/>
+              <w:rPr>
+                <w:rFonts w:ascii="Times New Roman" w:eastAsia="Times New Roman" w:hAnsi="Times New Roman" w:cs="Times New Roman"/>
+                <w:sz w:val="24"/>
+                <w:szCs w:val="24"/>
+              </w:rPr>
+            </w:pPr>
+            <w:r>
+              <w:rPr>
+                <w:rFonts w:ascii="Times New Roman" w:eastAsia="Times New Roman" w:hAnsi="Times New Roman" w:cs="Times New Roman"/>
+                <w:b/>
+                <w:bCs/>
+                <w:sz w:val="24"/>
+                <w:szCs w:val="24"/>
+              </w:rPr>
+              <w:t>4</w:t>
+            </w:r>
+          </w:p>
+        </w:tc>
+        <w:tc>
+          <w:tcPr>
+            <w:tcW w:w="0" w:type="auto"/>
+            <w:tcBorders>
+              <w:top w:val="single" w:sz="4" w:space="0" w:color="auto"/>
+              <w:left w:val="single" w:sz="4" w:space="0" w:color="auto"/>
+              <w:bottom w:val="single" w:sz="4" w:space="0" w:color="auto"/>
+              <w:right w:val="single" w:sz="4" w:space="0" w:color="auto"/>
+            </w:tcBorders>
+            <w:vAlign w:val="center"/>
+            <w:hideMark/>
+          </w:tcPr>
+          <w:p>
+            <w:pPr>
+              <w:spacing w:after="320" w:line="240" w:lineRule="auto"/>
+              <w:rPr>
+                <w:rFonts w:ascii="Times New Roman" w:eastAsia="Times New Roman" w:hAnsi="Times New Roman" w:cs="Times New Roman"/>
+                <w:sz w:val="24"/>
+                <w:szCs w:val="24"/>
+              </w:rPr>
+            </w:pPr>
+            <w:r>
+              <w:rPr>
+                <w:rFonts w:ascii="Times New Roman" w:eastAsia="Times New Roman" w:hAnsi="Times New Roman" w:cs="Times New Roman"/>
+                <w:sz w:val="24"/>
+                <w:szCs w:val="24"/>
+              </w:rPr>
+              <w:t>Linear Scan</w:t>
+            </w:r>
+          </w:p>
+        </w:tc>
+        <w:tc>
+          <w:tcPr>
+            <w:tcW w:w="0" w:type="auto"/>
+            <w:tcBorders>
+              <w:top w:val="single" w:sz="4" w:space="0" w:color="auto"/>
+              <w:left w:val="single" w:sz="4" w:space="0" w:color="auto"/>
+              <w:bottom w:val="single" w:sz="4" w:space="0" w:color="auto"/>
+              <w:right w:val="single" w:sz="4" w:space="0" w:color="auto"/>
+            </w:tcBorders>
+            <w:vAlign w:val="center"/>
+            <w:hideMark/>
+          </w:tcPr>
+          <w:p>
+            <w:pPr>
+              <w:spacing w:after="320" w:line="240" w:lineRule="auto"/>
+              <w:rPr>
+                <w:rFonts w:ascii="Times New Roman" w:eastAsia="Times New Roman" w:hAnsi="Times New Roman" w:cs="Times New Roman"/>
+                <w:sz w:val="24"/>
+                <w:szCs w:val="24"/>
+              </w:rPr>
+            </w:pPr>
+            <w:r>
+              <w:rPr>
+                <w:rFonts w:ascii="Times New Roman" w:eastAsia="Times New Roman" w:hAnsi="Times New Roman" w:cs="Times New Roman"/>
+                <w:sz w:val="24"/>
+                <w:szCs w:val="24"/>
+              </w:rPr>
+              <w:t>Start at index 3 (</w:t>
+            </w:r>
+            <w:r>
+              <w:rPr>
+                <w:rFonts w:ascii="Courier New" w:eastAsia="Times New Roman" w:hAnsi="Courier New" w:cs="Courier New"/>
+                <w:sz w:val="20"/>
+              </w:rPr>
+              <w:t>40</w:t>
+            </w:r>
+            <w:r>
+              <w:rPr>
+                <w:rFonts w:ascii="Times New Roman" w:eastAsia="Times New Roman" w:hAnsi="Times New Roman" w:cs="Times New Roman"/>
+                <w:sz w:val="24"/>
+                <w:szCs w:val="24"/>
+              </w:rPr>
+              <w:t xml:space="preserve">) and check each: </w:t>
+            </w:r>
+            <w:r>
+              <w:rPr>
+                <w:rFonts w:ascii="Courier New" w:eastAsia="Times New Roman" w:hAnsi="Courier New" w:cs="Courier New"/>
+                <w:sz w:val="20"/>
+              </w:rPr>
+              <w:t>40, 50, 60...</w:t>
+            </w:r>
+          </w:p>
+        </w:tc>
+      </w:tr>
+      <w:tr>
+        <w:trPr>
+          <w:tblCellSpacing w:w="15" w:type="dxa"/>
+        </w:trPr>
+        <w:tc>
+          <w:tcPr>
+            <w:tcW w:w="0" w:type="auto"/>
+            <w:tcBorders>
+              <w:top w:val="single" w:sz="4" w:space="0" w:color="auto"/>
+              <w:left w:val="single" w:sz="4" w:space="0" w:color="auto"/>
+              <w:bottom w:val="single" w:sz="4" w:space="0" w:color="auto"/>
+              <w:right w:val="single" w:sz="4" w:space="0" w:color="auto"/>
+            </w:tcBorders>
+            <w:vAlign w:val="center"/>
+            <w:hideMark/>
+          </w:tcPr>
+          <w:p>
+            <w:pPr>
+              <w:spacing w:after="320" w:line="240" w:lineRule="auto"/>
+              <w:rPr>
+                <w:rFonts w:ascii="Times New Roman" w:eastAsia="Times New Roman" w:hAnsi="Times New Roman" w:cs="Times New Roman"/>
+                <w:sz w:val="24"/>
+                <w:szCs w:val="24"/>
+              </w:rPr>
+            </w:pPr>
+            <w:r>
+              <w:rPr>
+                <w:rFonts w:ascii="Times New Roman" w:eastAsia="Times New Roman" w:hAnsi="Times New Roman" w:cs="Times New Roman"/>
+                <w:b/>
+                <w:bCs/>
+                <w:sz w:val="24"/>
+                <w:szCs w:val="24"/>
+              </w:rPr>
+              <w:t>5</w:t>
+            </w:r>
+          </w:p>
+        </w:tc>
+        <w:tc>
+          <w:tcPr>
+            <w:tcW w:w="0" w:type="auto"/>
+            <w:tcBorders>
+              <w:top w:val="single" w:sz="4" w:space="0" w:color="auto"/>
+              <w:left w:val="single" w:sz="4" w:space="0" w:color="auto"/>
+              <w:bottom w:val="single" w:sz="4" w:space="0" w:color="auto"/>
+              <w:right w:val="single" w:sz="4" w:space="0" w:color="auto"/>
+            </w:tcBorders>
+            <w:vAlign w:val="center"/>
+            <w:hideMark/>
+          </w:tcPr>
+          <w:p>
+            <w:pPr>
+              <w:spacing w:after="320" w:line="240" w:lineRule="auto"/>
+              <w:rPr>
+                <w:rFonts w:ascii="Times New Roman" w:eastAsia="Times New Roman" w:hAnsi="Times New Roman" w:cs="Times New Roman"/>
+                <w:sz w:val="24"/>
+                <w:szCs w:val="24"/>
+              </w:rPr>
+            </w:pPr>
+            <w:r>
+              <w:rPr>
+                <w:rFonts w:ascii="Times New Roman" w:eastAsia="Times New Roman" w:hAnsi="Times New Roman" w:cs="Times New Roman"/>
+                <w:sz w:val="24"/>
+                <w:szCs w:val="24"/>
+              </w:rPr>
+              <w:t>Result</w:t>
+            </w:r>
+          </w:p>
+        </w:tc>
+        <w:tc>
+          <w:tcPr>
+            <w:tcW w:w="0" w:type="auto"/>
+            <w:tcBorders>
+              <w:top w:val="single" w:sz="4" w:space="0" w:color="auto"/>
+              <w:left w:val="single" w:sz="4" w:space="0" w:color="auto"/>
+              <w:bottom w:val="single" w:sz="4" w:space="0" w:color="auto"/>
+              <w:right w:val="single" w:sz="4" w:space="0" w:color="auto"/>
+            </w:tcBorders>
+            <w:vAlign w:val="center"/>
+            <w:hideMark/>
+          </w:tcPr>
+          <w:p>
+            <w:pPr>
+              <w:spacing w:after="320" w:line="240" w:lineRule="auto"/>
+              <w:rPr>
+                <w:rFonts w:ascii="Times New Roman" w:eastAsia="Times New Roman" w:hAnsi="Times New Roman" w:cs="Times New Roman"/>
+                <w:sz w:val="24"/>
+                <w:szCs w:val="24"/>
+              </w:rPr>
+            </w:pPr>
+            <w:r>
+              <w:rPr>
+                <w:rFonts w:ascii="Courier New" w:eastAsia="Times New Roman" w:hAnsi="Courier New" w:cs="Courier New"/>
+                <w:sz w:val="20"/>
+              </w:rPr>
+              <w:t>60</w:t>
+            </w:r>
+            <w:r>
+              <w:rPr>
+                <w:rFonts w:ascii="Times New Roman" w:eastAsia="Times New Roman" w:hAnsi="Times New Roman" w:cs="Times New Roman"/>
+                <w:sz w:val="24"/>
+                <w:szCs w:val="24"/>
+              </w:rPr>
+              <w:t xml:space="preserve"> </w:t>
+            </w:r>
+            <w:proofErr w:type="gramStart"/>
+            <w:r>
+              <w:rPr>
+                <w:rFonts w:ascii="Times New Roman" w:eastAsia="Times New Roman" w:hAnsi="Times New Roman" w:cs="Times New Roman"/>
+                <w:sz w:val="24"/>
+                <w:szCs w:val="24"/>
+              </w:rPr>
+              <w:t>is</w:t>
+            </w:r>
+            <w:proofErr w:type="gramEnd"/>
+            <w:r>
+              <w:rPr>
+                <w:rFonts w:ascii="Times New Roman" w:eastAsia="Times New Roman" w:hAnsi="Times New Roman" w:cs="Times New Roman"/>
+                <w:sz w:val="24"/>
+                <w:szCs w:val="24"/>
+              </w:rPr>
+              <w:t xml:space="preserve"> greater than </w:t>
+            </w:r>
+            <w:r>
+              <w:rPr>
+                <w:rFonts w:ascii="Courier New" w:eastAsia="Times New Roman" w:hAnsi="Courier New" w:cs="Courier New"/>
+                <w:sz w:val="20"/>
+              </w:rPr>
+              <w:t>55</w:t>
+            </w:r>
+            <w:r>
+              <w:rPr>
+                <w:rFonts w:ascii="Times New Roman" w:eastAsia="Times New Roman" w:hAnsi="Times New Roman" w:cs="Times New Roman"/>
+                <w:sz w:val="24"/>
+                <w:szCs w:val="24"/>
+              </w:rPr>
+              <w:t xml:space="preserve"> and the target wasn't found. </w:t>
+            </w:r>
+            <w:r>
+              <w:rPr>
+                <w:rFonts w:ascii="Times New Roman" w:eastAsia="Times New Roman" w:hAnsi="Times New Roman" w:cs="Times New Roman"/>
+                <w:b/>
+                <w:bCs/>
+                <w:sz w:val="24"/>
+                <w:szCs w:val="24"/>
+              </w:rPr>
+              <w:t>Not in array.</w:t>
+            </w:r>
+          </w:p>
+        </w:tc>
+      </w:tr>
+    </w:tbl>
+    <w:p>
+      <w:pPr>
+        <w:rPr>
+          <w:rFonts w:ascii="Times New Roman" w:eastAsia="Times New Roman" w:hAnsi="Times New Roman" w:cs="Times New Roman"/>
+          <w:b/>
+          <w:sz w:val="36"/>
+          <w:szCs w:val="36"/>
+        </w:rPr>
+      </w:pPr>
+    </w:p>
+    <w:p>
+      <w:pPr>
+        <w:spacing w:before="100" w:beforeAutospacing="1" w:after="100" w:afterAutospacing="1" w:line="240" w:lineRule="auto"/>
+        <w:outlineLvl w:val="0"/>
+        <w:rPr>
+          <w:rFonts w:ascii="Times New Roman" w:eastAsia="Times New Roman" w:hAnsi="Times New Roman" w:cs="Times New Roman"/>
+          <w:b/>
+          <w:bCs/>
+          <w:kern w:val="36"/>
+          <w:sz w:val="48"/>
+          <w:szCs w:val="48"/>
+        </w:rPr>
+      </w:pPr>
+      <w:r>
+        <w:rPr>
+          <w:rFonts w:ascii="Times New Roman" w:eastAsia="Times New Roman" w:hAnsi="Times New Roman" w:cs="Times New Roman"/>
+          <w:b/>
+          <w:bCs/>
+          <w:kern w:val="36"/>
+          <w:sz w:val="48"/>
+          <w:szCs w:val="48"/>
+        </w:rPr>
+        <w:t>Time Complexity</w:t>
+      </w:r>
+    </w:p>
+    <w:tbl>
+      <w:tblPr>
+        <w:tblW w:w="0" w:type="auto"/>
+        <w:tblCellSpacing w:w="15" w:type="dxa"/>
+        <w:tblCellMar>
+          <w:top w:w="15" w:type="dxa"/>
+          <w:left w:w="15" w:type="dxa"/>
+          <w:bottom w:w="15" w:type="dxa"/>
+          <w:right w:w="15" w:type="dxa"/>
+        </w:tblCellMar>
+        <w:tblLook w:val="04A0"/>
+      </w:tblPr>
+      <w:tblGrid>
+        <w:gridCol w:w="1189"/>
+        <w:gridCol w:w="1262"/>
+      </w:tblGrid>
+      <w:tr>
+        <w:trPr>
+          <w:tblHeader/>
+          <w:tblCellSpacing w:w="15" w:type="dxa"/>
+        </w:trPr>
+        <w:tc>
+          <w:tcPr>
+            <w:tcW w:w="0" w:type="auto"/>
+            <w:vAlign w:val="center"/>
+            <w:hideMark/>
+          </w:tcPr>
+          <w:p>
+            <w:pPr>
+              <w:spacing w:after="0" w:line="240" w:lineRule="auto"/>
+              <w:jc w:val="center"/>
+              <w:rPr>
+                <w:rFonts w:ascii="Times New Roman" w:eastAsia="Times New Roman" w:hAnsi="Times New Roman" w:cs="Times New Roman"/>
+                <w:b/>
+                <w:bCs/>
+                <w:sz w:val="24"/>
+                <w:szCs w:val="24"/>
+              </w:rPr>
+            </w:pPr>
+            <w:r>
+              <w:rPr>
+                <w:rFonts w:ascii="Times New Roman" w:eastAsia="Times New Roman" w:hAnsi="Times New Roman" w:cs="Times New Roman"/>
+                <w:b/>
+                <w:bCs/>
+                <w:sz w:val="24"/>
+                <w:szCs w:val="24"/>
+              </w:rPr>
+              <w:t>Case</w:t>
+            </w:r>
+          </w:p>
+        </w:tc>
+        <w:tc>
+          <w:tcPr>
+            <w:tcW w:w="0" w:type="auto"/>
+            <w:vAlign w:val="center"/>
+            <w:hideMark/>
+          </w:tcPr>
+          <w:p>
+            <w:pPr>
+              <w:spacing w:after="0" w:line="240" w:lineRule="auto"/>
+              <w:jc w:val="center"/>
+              <w:rPr>
+                <w:rFonts w:ascii="Times New Roman" w:eastAsia="Times New Roman" w:hAnsi="Times New Roman" w:cs="Times New Roman"/>
+                <w:b/>
+                <w:bCs/>
+                <w:sz w:val="24"/>
+                <w:szCs w:val="24"/>
+              </w:rPr>
+            </w:pPr>
+            <w:r>
+              <w:rPr>
+                <w:rFonts w:ascii="Times New Roman" w:eastAsia="Times New Roman" w:hAnsi="Times New Roman" w:cs="Times New Roman"/>
+                <w:b/>
+                <w:bCs/>
+                <w:sz w:val="24"/>
+                <w:szCs w:val="24"/>
+              </w:rPr>
+              <w:t>Complexity</w:t>
+            </w:r>
+          </w:p>
+        </w:tc>
+      </w:tr>
+      <w:tr>
+        <w:trPr>
+          <w:tblCellSpacing w:w="15" w:type="dxa"/>
+        </w:trPr>
+        <w:tc>
+          <w:tcPr>
+            <w:tcW w:w="0" w:type="auto"/>
+            <w:vAlign w:val="center"/>
+            <w:hideMark/>
+          </w:tcPr>
+          <w:p>
+            <w:pPr>
+              <w:spacing w:after="0" w:line="240" w:lineRule="auto"/>
+              <w:rPr>
+                <w:rFonts w:ascii="Times New Roman" w:eastAsia="Times New Roman" w:hAnsi="Times New Roman" w:cs="Times New Roman"/>
+                <w:sz w:val="24"/>
+                <w:szCs w:val="24"/>
+              </w:rPr>
+            </w:pPr>
+            <w:r>
+              <w:rPr>
+                <w:rFonts w:ascii="Times New Roman" w:eastAsia="Times New Roman" w:hAnsi="Times New Roman" w:cs="Times New Roman"/>
+                <w:sz w:val="24"/>
+                <w:szCs w:val="24"/>
+              </w:rPr>
+              <w:t>Best Case</w:t>
+            </w:r>
+          </w:p>
+        </w:tc>
+        <w:tc>
+          <w:tcPr>
+            <w:tcW w:w="0" w:type="auto"/>
+            <w:vAlign w:val="center"/>
+            <w:hideMark/>
+          </w:tcPr>
+          <w:p>
+            <w:pPr>
+              <w:spacing w:after="0" w:line="240" w:lineRule="auto"/>
+              <w:rPr>
+                <w:rFonts w:ascii="Times New Roman" w:eastAsia="Times New Roman" w:hAnsi="Times New Roman" w:cs="Times New Roman"/>
+                <w:sz w:val="24"/>
+                <w:szCs w:val="24"/>
+              </w:rPr>
+            </w:pPr>
+            <w:r>
+              <w:rPr>
+                <w:rFonts w:ascii="Times New Roman" w:eastAsia="Times New Roman" w:hAnsi="Times New Roman" w:cs="Times New Roman"/>
+                <w:sz w:val="24"/>
+                <w:szCs w:val="24"/>
+              </w:rPr>
+              <w:t>O(1)</w:t>
+            </w:r>
+          </w:p>
+        </w:tc>
+      </w:tr>
+      <w:tr>
+        <w:trPr>
+          <w:tblCellSpacing w:w="15" w:type="dxa"/>
+        </w:trPr>
+        <w:tc>
+          <w:tcPr>
+            <w:tcW w:w="0" w:type="auto"/>
+            <w:vAlign w:val="center"/>
+            <w:hideMark/>
+          </w:tcPr>
+          <w:p>
+            <w:pPr>
+              <w:spacing w:after="0" w:line="240" w:lineRule="auto"/>
+              <w:rPr>
+                <w:rFonts w:ascii="Times New Roman" w:eastAsia="Times New Roman" w:hAnsi="Times New Roman" w:cs="Times New Roman"/>
+                <w:sz w:val="24"/>
+                <w:szCs w:val="24"/>
+              </w:rPr>
+            </w:pPr>
+            <w:r>
+              <w:rPr>
+                <w:rFonts w:ascii="Times New Roman" w:eastAsia="Times New Roman" w:hAnsi="Times New Roman" w:cs="Times New Roman"/>
+                <w:sz w:val="24"/>
+                <w:szCs w:val="24"/>
+              </w:rPr>
+              <w:t>Worst Case</w:t>
+            </w:r>
+          </w:p>
+        </w:tc>
+        <w:tc>
+          <w:tcPr>
+            <w:tcW w:w="0" w:type="auto"/>
+            <w:vAlign w:val="center"/>
+            <w:hideMark/>
+          </w:tcPr>
+          <w:p>
+            <w:pPr>
+              <w:spacing w:after="0" w:line="240" w:lineRule="auto"/>
+              <w:rPr>
+                <w:rFonts w:ascii="Times New Roman" w:eastAsia="Times New Roman" w:hAnsi="Times New Roman" w:cs="Times New Roman"/>
+                <w:sz w:val="24"/>
+                <w:szCs w:val="24"/>
+              </w:rPr>
+            </w:pPr>
+            <w:r>
+              <w:rPr>
+                <w:rFonts w:ascii="Times New Roman" w:eastAsia="Times New Roman" w:hAnsi="Times New Roman" w:cs="Times New Roman"/>
+                <w:sz w:val="24"/>
+                <w:szCs w:val="24"/>
+              </w:rPr>
+              <w:t>O(√n)</w:t>
+            </w:r>
+          </w:p>
+        </w:tc>
+      </w:tr>
+    </w:tbl>
+    <w:p>
+      <w:pPr>
+        <w:rPr>
+          <w:b/>
+          <w:sz w:val="36"/>
+          <w:szCs w:val="36"/>
+        </w:rPr>
+      </w:pPr>
+    </w:p>
+    <w:p/>
+    <w:p/>
+    <w:p/>
+    <w:p/>
     <w:p/>
     <w:sectPr>
       <w:pgSz w:w="12240" w:h="15840"/>
@@ -4040,6 +5234,119 @@
     </w:lvl>
   </w:abstractNum>
   <w:abstractNum w:abstractNumId="4">
+    <w:nsid w:val="353D1703"/>
+    <w:multiLevelType w:val="multilevel"/>
+    <w:tmpl w:val="FC862F3A"/>
+    <w:lvl w:ilvl="0">
+      <w:start w:val="1"/>
+      <w:numFmt w:val="decimal"/>
+      <w:lvlText w:val="%1."/>
+      <w:lvlJc w:val="left"/>
+      <w:pPr>
+        <w:tabs>
+          <w:tab w:val="num" w:pos="720"/>
+        </w:tabs>
+        <w:ind w:left="720" w:hanging="360"/>
+      </w:pPr>
+    </w:lvl>
+    <w:lvl w:ilvl="1" w:tentative="1">
+      <w:start w:val="1"/>
+      <w:numFmt w:val="decimal"/>
+      <w:lvlText w:val="%2."/>
+      <w:lvlJc w:val="left"/>
+      <w:pPr>
+        <w:tabs>
+          <w:tab w:val="num" w:pos="1440"/>
+        </w:tabs>
+        <w:ind w:left="1440" w:hanging="360"/>
+      </w:pPr>
+    </w:lvl>
+    <w:lvl w:ilvl="2" w:tentative="1">
+      <w:start w:val="1"/>
+      <w:numFmt w:val="decimal"/>
+      <w:lvlText w:val="%3."/>
+      <w:lvlJc w:val="left"/>
+      <w:pPr>
+        <w:tabs>
+          <w:tab w:val="num" w:pos="2160"/>
+        </w:tabs>
+        <w:ind w:left="2160" w:hanging="360"/>
+      </w:pPr>
+    </w:lvl>
+    <w:lvl w:ilvl="3" w:tentative="1">
+      <w:start w:val="1"/>
+      <w:numFmt w:val="decimal"/>
+      <w:lvlText w:val="%4."/>
+      <w:lvlJc w:val="left"/>
+      <w:pPr>
+        <w:tabs>
+          <w:tab w:val="num" w:pos="2880"/>
+        </w:tabs>
+        <w:ind w:left="2880" w:hanging="360"/>
+      </w:pPr>
+    </w:lvl>
+    <w:lvl w:ilvl="4" w:tentative="1">
+      <w:start w:val="1"/>
+      <w:numFmt w:val="decimal"/>
+      <w:lvlText w:val="%5."/>
+      <w:lvlJc w:val="left"/>
+      <w:pPr>
+        <w:tabs>
+          <w:tab w:val="num" w:pos="3600"/>
+        </w:tabs>
+        <w:ind w:left="3600" w:hanging="360"/>
+      </w:pPr>
+    </w:lvl>
+    <w:lvl w:ilvl="5" w:tentative="1">
+      <w:start w:val="1"/>
+      <w:numFmt w:val="decimal"/>
+      <w:lvlText w:val="%6."/>
+      <w:lvlJc w:val="left"/>
+      <w:pPr>
+        <w:tabs>
+          <w:tab w:val="num" w:pos="4320"/>
+        </w:tabs>
+        <w:ind w:left="4320" w:hanging="360"/>
+      </w:pPr>
+    </w:lvl>
+    <w:lvl w:ilvl="6" w:tentative="1">
+      <w:start w:val="1"/>
+      <w:numFmt w:val="decimal"/>
+      <w:lvlText w:val="%7."/>
+      <w:lvlJc w:val="left"/>
+      <w:pPr>
+        <w:tabs>
+          <w:tab w:val="num" w:pos="5040"/>
+        </w:tabs>
+        <w:ind w:left="5040" w:hanging="360"/>
+      </w:pPr>
+    </w:lvl>
+    <w:lvl w:ilvl="7" w:tentative="1">
+      <w:start w:val="1"/>
+      <w:numFmt w:val="decimal"/>
+      <w:lvlText w:val="%8."/>
+      <w:lvlJc w:val="left"/>
+      <w:pPr>
+        <w:tabs>
+          <w:tab w:val="num" w:pos="5760"/>
+        </w:tabs>
+        <w:ind w:left="5760" w:hanging="360"/>
+      </w:pPr>
+    </w:lvl>
+    <w:lvl w:ilvl="8" w:tentative="1">
+      <w:start w:val="1"/>
+      <w:numFmt w:val="decimal"/>
+      <w:lvlText w:val="%9."/>
+      <w:lvlJc w:val="left"/>
+      <w:pPr>
+        <w:tabs>
+          <w:tab w:val="num" w:pos="6480"/>
+        </w:tabs>
+        <w:ind w:left="6480" w:hanging="360"/>
+      </w:pPr>
+    </w:lvl>
+  </w:abstractNum>
+  <w:abstractNum w:abstractNumId="5">
     <w:nsid w:val="36D25A31"/>
     <w:multiLevelType w:val="multilevel"/>
     <w:tmpl w:val="8D741E52"/>
@@ -4188,7 +5495,7 @@
       </w:rPr>
     </w:lvl>
   </w:abstractNum>
-  <w:abstractNum w:abstractNumId="5">
+  <w:abstractNum w:abstractNumId="6">
     <w:nsid w:val="3E8E1A92"/>
     <w:multiLevelType w:val="multilevel"/>
     <w:tmpl w:val="30EAEB8A"/>
@@ -4305,7 +5612,7 @@
       </w:pPr>
     </w:lvl>
   </w:abstractNum>
-  <w:abstractNum w:abstractNumId="6">
+  <w:abstractNum w:abstractNumId="7">
     <w:nsid w:val="47F2550C"/>
     <w:multiLevelType w:val="multilevel"/>
     <w:tmpl w:val="DB82CAD2"/>
@@ -4454,7 +5761,7 @@
       </w:rPr>
     </w:lvl>
   </w:abstractNum>
-  <w:abstractNum w:abstractNumId="7">
+  <w:abstractNum w:abstractNumId="8">
     <w:nsid w:val="66342D61"/>
     <w:multiLevelType w:val="multilevel"/>
     <w:tmpl w:val="5AB6879A"/>
@@ -4571,7 +5878,7 @@
       </w:pPr>
     </w:lvl>
   </w:abstractNum>
-  <w:abstractNum w:abstractNumId="8">
+  <w:abstractNum w:abstractNumId="9">
     <w:nsid w:val="68E01D92"/>
     <w:multiLevelType w:val="multilevel"/>
     <w:tmpl w:val="EFFC280C"/>
@@ -4702,22 +6009,25 @@
     <w:abstractNumId w:val="2"/>
   </w:num>
   <w:num w:numId="4">
-    <w:abstractNumId w:val="8"/>
+    <w:abstractNumId w:val="9"/>
   </w:num>
   <w:num w:numId="5">
-    <w:abstractNumId w:val="4"/>
+    <w:abstractNumId w:val="5"/>
   </w:num>
   <w:num w:numId="6">
+    <w:abstractNumId w:val="7"/>
+  </w:num>
+  <w:num w:numId="7">
     <w:abstractNumId w:val="6"/>
   </w:num>
-  <w:num w:numId="7">
-    <w:abstractNumId w:val="5"/>
-  </w:num>
   <w:num w:numId="8">
-    <w:abstractNumId w:val="7"/>
+    <w:abstractNumId w:val="8"/>
   </w:num>
   <w:num w:numId="9">
     <w:abstractNumId w:val="3"/>
+  </w:num>
+  <w:num w:numId="10">
+    <w:abstractNumId w:val="4"/>
   </w:num>
 </w:numbering>
 </file>
@@ -5040,6 +6350,11 @@
     <w:basedOn w:val="DefaultParagraphFont"/>
     <w:rsid w:val="00196785"/>
   </w:style>
+  <w:style w:type="character" w:customStyle="1" w:styleId="math-inline">
+    <w:name w:val="math-inline"/>
+    <w:basedOn w:val="DefaultParagraphFont"/>
+    <w:rsid w:val="00593B97"/>
+  </w:style>
 </w:styles>
 </file>
 

</xml_diff>

<commit_message>
Adding Exponential Searching Algo
</commit_message>
<xml_diff>
--- a/Searching Algorithm/Basics.docx
+++ b/Searching Algorithm/Basics.docx
@@ -5270,6 +5270,949 @@
     </w:p>
     <w:p>
       <w:pPr>
+        <w:spacing w:before="100" w:beforeAutospacing="1" w:after="100" w:afterAutospacing="1" w:line="240" w:lineRule="auto"/>
+      </w:pPr>
+    </w:p>
+    <w:p>
+      <w:pPr>
+        <w:spacing w:before="100" w:beforeAutospacing="1" w:after="100" w:afterAutospacing="1" w:line="240" w:lineRule="auto"/>
+      </w:pPr>
+    </w:p>
+    <w:p>
+      <w:pPr>
+        <w:spacing w:before="100" w:beforeAutospacing="1" w:after="100" w:afterAutospacing="1" w:line="240" w:lineRule="auto"/>
+      </w:pPr>
+    </w:p>
+    <w:p>
+      <w:pPr>
+        <w:spacing w:before="100" w:beforeAutospacing="1" w:after="100" w:afterAutospacing="1" w:line="240" w:lineRule="auto"/>
+      </w:pPr>
+    </w:p>
+    <w:p>
+      <w:pPr>
+        <w:spacing w:before="100" w:beforeAutospacing="1" w:after="100" w:afterAutospacing="1" w:line="240" w:lineRule="auto"/>
+      </w:pPr>
+    </w:p>
+    <w:p>
+      <w:pPr>
+        <w:jc w:val="center"/>
+        <w:rPr>
+          <w:b/>
+          <w:sz w:val="36"/>
+          <w:szCs w:val="36"/>
+        </w:rPr>
+      </w:pPr>
+      <w:proofErr w:type="spellStart"/>
+      <w:r>
+        <w:rPr>
+          <w:b/>
+          <w:sz w:val="36"/>
+          <w:szCs w:val="36"/>
+        </w:rPr>
+        <w:lastRenderedPageBreak/>
+        <w:t>Expnential</w:t>
+      </w:r>
+      <w:proofErr w:type="spellEnd"/>
+      <w:r>
+        <w:rPr>
+          <w:b/>
+          <w:sz w:val="36"/>
+          <w:szCs w:val="36"/>
+        </w:rPr>
+        <w:t xml:space="preserve"> Search</w:t>
+      </w:r>
+    </w:p>
+    <w:p>
+      <w:r>
+        <w:t xml:space="preserve">Exponential Search is a two-stage algorithm designed for </w:t>
+      </w:r>
+      <w:r>
+        <w:rPr>
+          <w:b/>
+          <w:bCs/>
+        </w:rPr>
+        <w:t>sorted, unbounded arrays</w:t>
+      </w:r>
+      <w:r>
+        <w:t xml:space="preserve"> (or arrays of unknown size). It finds a range where the element might exist and then narrows it down using Binary Search.</w:t>
+      </w:r>
+    </w:p>
+    <w:p>
+      <w:pPr>
+        <w:spacing w:before="100" w:beforeAutospacing="1" w:after="100" w:afterAutospacing="1" w:line="240" w:lineRule="auto"/>
+        <w:rPr>
+          <w:rFonts w:ascii="Times New Roman" w:eastAsia="Times New Roman" w:hAnsi="Times New Roman" w:cs="Times New Roman"/>
+          <w:sz w:val="24"/>
+          <w:szCs w:val="24"/>
+        </w:rPr>
+      </w:pPr>
+      <w:r>
+        <w:rPr>
+          <w:rFonts w:ascii="Times New Roman" w:eastAsia="Times New Roman" w:hAnsi="Times New Roman" w:cs="Times New Roman"/>
+          <w:sz w:val="24"/>
+          <w:szCs w:val="24"/>
+        </w:rPr>
+        <w:t xml:space="preserve">Exponential Search works in </w:t>
+      </w:r>
+      <w:r>
+        <w:rPr>
+          <w:rFonts w:ascii="Times New Roman" w:eastAsia="Times New Roman" w:hAnsi="Times New Roman" w:cs="Times New Roman"/>
+          <w:b/>
+          <w:bCs/>
+          <w:sz w:val="24"/>
+          <w:szCs w:val="24"/>
+        </w:rPr>
+        <w:t>2 steps</w:t>
+      </w:r>
+      <w:r>
+        <w:rPr>
+          <w:rFonts w:ascii="Times New Roman" w:eastAsia="Times New Roman" w:hAnsi="Times New Roman" w:cs="Times New Roman"/>
+          <w:sz w:val="24"/>
+          <w:szCs w:val="24"/>
+        </w:rPr>
+        <w:t>:</w:t>
+      </w:r>
+    </w:p>
+    <w:p>
+      <w:pPr>
+        <w:numPr>
+          <w:ilvl w:val="0"/>
+          <w:numId w:val="14"/>
+        </w:numPr>
+        <w:spacing w:before="100" w:beforeAutospacing="1" w:after="100" w:afterAutospacing="1" w:line="240" w:lineRule="auto"/>
+        <w:rPr>
+          <w:rFonts w:ascii="Times New Roman" w:eastAsia="Times New Roman" w:hAnsi="Times New Roman" w:cs="Times New Roman"/>
+          <w:sz w:val="24"/>
+          <w:szCs w:val="24"/>
+        </w:rPr>
+      </w:pPr>
+      <w:r>
+        <w:rPr>
+          <w:rFonts w:ascii="Times New Roman" w:eastAsia="Times New Roman" w:hAnsi="Times New Roman" w:cs="Times New Roman"/>
+          <w:sz w:val="24"/>
+          <w:szCs w:val="24"/>
+        </w:rPr>
+        <w:t xml:space="preserve">Find a search range exponentially </w:t>
+      </w:r>
+    </w:p>
+    <w:p>
+      <w:pPr>
+        <w:numPr>
+          <w:ilvl w:val="0"/>
+          <w:numId w:val="14"/>
+        </w:numPr>
+        <w:spacing w:before="100" w:beforeAutospacing="1" w:after="100" w:afterAutospacing="1" w:line="240" w:lineRule="auto"/>
+        <w:rPr>
+          <w:rFonts w:ascii="Times New Roman" w:eastAsia="Times New Roman" w:hAnsi="Times New Roman" w:cs="Times New Roman"/>
+          <w:sz w:val="24"/>
+          <w:szCs w:val="24"/>
+        </w:rPr>
+      </w:pPr>
+      <w:r>
+        <w:rPr>
+          <w:rFonts w:ascii="Times New Roman" w:eastAsia="Times New Roman" w:hAnsi="Times New Roman" w:cs="Times New Roman"/>
+          <w:sz w:val="24"/>
+          <w:szCs w:val="24"/>
+        </w:rPr>
+        <w:t>Use Binary Search inside that range</w:t>
+      </w:r>
+    </w:p>
+    <w:p>
+      <w:pPr>
+        <w:spacing w:before="100" w:beforeAutospacing="1" w:after="100" w:afterAutospacing="1" w:line="240" w:lineRule="auto"/>
+        <w:outlineLvl w:val="0"/>
+        <w:rPr>
+          <w:rFonts w:ascii="Times New Roman" w:eastAsia="Times New Roman" w:hAnsi="Times New Roman" w:cs="Times New Roman"/>
+          <w:b/>
+          <w:bCs/>
+          <w:kern w:val="36"/>
+          <w:sz w:val="48"/>
+          <w:szCs w:val="48"/>
+        </w:rPr>
+      </w:pPr>
+      <w:r>
+        <w:rPr>
+          <w:rFonts w:ascii="Times New Roman" w:eastAsia="Times New Roman" w:hAnsi="Times New Roman" w:cs="Times New Roman"/>
+          <w:b/>
+          <w:bCs/>
+          <w:kern w:val="36"/>
+          <w:sz w:val="48"/>
+          <w:szCs w:val="48"/>
+        </w:rPr>
+        <w:t xml:space="preserve">Exponential Search — Steps </w:t>
+      </w:r>
+    </w:p>
+    <w:p>
+      <w:pPr>
+        <w:numPr>
+          <w:ilvl w:val="0"/>
+          <w:numId w:val="15"/>
+        </w:numPr>
+        <w:spacing w:before="100" w:beforeAutospacing="1" w:after="100" w:afterAutospacing="1" w:line="240" w:lineRule="auto"/>
+        <w:rPr>
+          <w:rFonts w:ascii="Times New Roman" w:eastAsia="Times New Roman" w:hAnsi="Times New Roman" w:cs="Times New Roman"/>
+          <w:sz w:val="24"/>
+          <w:szCs w:val="24"/>
+        </w:rPr>
+      </w:pPr>
+      <w:r>
+        <w:rPr>
+          <w:rFonts w:ascii="Times New Roman" w:eastAsia="Times New Roman" w:hAnsi="Times New Roman" w:cs="Times New Roman"/>
+          <w:sz w:val="24"/>
+          <w:szCs w:val="24"/>
+        </w:rPr>
+        <w:t xml:space="preserve">Start with index </w:t>
+      </w:r>
+      <w:proofErr w:type="spellStart"/>
+      <w:r>
+        <w:rPr>
+          <w:rFonts w:ascii="Courier New" w:eastAsia="Times New Roman" w:hAnsi="Courier New" w:cs="Courier New"/>
+          <w:sz w:val="20"/>
+        </w:rPr>
+        <w:t>i</w:t>
+      </w:r>
+      <w:proofErr w:type="spellEnd"/>
+      <w:r>
+        <w:rPr>
+          <w:rFonts w:ascii="Courier New" w:eastAsia="Times New Roman" w:hAnsi="Courier New" w:cs="Courier New"/>
+          <w:sz w:val="20"/>
+        </w:rPr>
+        <w:t xml:space="preserve"> = 1</w:t>
+      </w:r>
+      <w:r>
+        <w:rPr>
+          <w:rFonts w:ascii="Times New Roman" w:eastAsia="Times New Roman" w:hAnsi="Times New Roman" w:cs="Times New Roman"/>
+          <w:sz w:val="24"/>
+          <w:szCs w:val="24"/>
+        </w:rPr>
+        <w:t xml:space="preserve"> </w:t>
+      </w:r>
+    </w:p>
+    <w:p>
+      <w:pPr>
+        <w:numPr>
+          <w:ilvl w:val="0"/>
+          <w:numId w:val="15"/>
+        </w:numPr>
+        <w:spacing w:before="100" w:beforeAutospacing="1" w:after="100" w:afterAutospacing="1" w:line="240" w:lineRule="auto"/>
+        <w:rPr>
+          <w:rFonts w:ascii="Times New Roman" w:eastAsia="Times New Roman" w:hAnsi="Times New Roman" w:cs="Times New Roman"/>
+          <w:sz w:val="24"/>
+          <w:szCs w:val="24"/>
+        </w:rPr>
+      </w:pPr>
+      <w:r>
+        <w:rPr>
+          <w:rFonts w:ascii="Times New Roman" w:eastAsia="Times New Roman" w:hAnsi="Times New Roman" w:cs="Times New Roman"/>
+          <w:sz w:val="24"/>
+          <w:szCs w:val="24"/>
+        </w:rPr>
+        <w:t xml:space="preserve">Check if the first element is the target </w:t>
+      </w:r>
+    </w:p>
+    <w:p>
+      <w:pPr>
+        <w:numPr>
+          <w:ilvl w:val="1"/>
+          <w:numId w:val="15"/>
+        </w:numPr>
+        <w:spacing w:before="100" w:beforeAutospacing="1" w:after="100" w:afterAutospacing="1" w:line="240" w:lineRule="auto"/>
+        <w:rPr>
+          <w:rFonts w:ascii="Times New Roman" w:eastAsia="Times New Roman" w:hAnsi="Times New Roman" w:cs="Times New Roman"/>
+          <w:sz w:val="24"/>
+          <w:szCs w:val="24"/>
+        </w:rPr>
+      </w:pPr>
+      <w:r>
+        <w:rPr>
+          <w:rFonts w:ascii="Times New Roman" w:eastAsia="Times New Roman" w:hAnsi="Times New Roman" w:cs="Times New Roman"/>
+          <w:sz w:val="24"/>
+          <w:szCs w:val="24"/>
+        </w:rPr>
+        <w:t xml:space="preserve">If yes, return index </w:t>
+      </w:r>
+      <w:r>
+        <w:rPr>
+          <w:rFonts w:ascii="Courier New" w:eastAsia="Times New Roman" w:hAnsi="Courier New" w:cs="Courier New"/>
+          <w:sz w:val="20"/>
+        </w:rPr>
+        <w:t>0</w:t>
+      </w:r>
+      <w:r>
+        <w:rPr>
+          <w:rFonts w:ascii="Times New Roman" w:eastAsia="Times New Roman" w:hAnsi="Times New Roman" w:cs="Times New Roman"/>
+          <w:sz w:val="24"/>
+          <w:szCs w:val="24"/>
+        </w:rPr>
+        <w:t xml:space="preserve"> </w:t>
+      </w:r>
+    </w:p>
+    <w:p>
+      <w:pPr>
+        <w:numPr>
+          <w:ilvl w:val="0"/>
+          <w:numId w:val="15"/>
+        </w:numPr>
+        <w:spacing w:before="100" w:beforeAutospacing="1" w:after="100" w:afterAutospacing="1" w:line="240" w:lineRule="auto"/>
+        <w:rPr>
+          <w:rFonts w:ascii="Times New Roman" w:eastAsia="Times New Roman" w:hAnsi="Times New Roman" w:cs="Times New Roman"/>
+          <w:sz w:val="24"/>
+          <w:szCs w:val="24"/>
+        </w:rPr>
+      </w:pPr>
+      <w:r>
+        <w:rPr>
+          <w:rFonts w:ascii="Times New Roman" w:eastAsia="Times New Roman" w:hAnsi="Times New Roman" w:cs="Times New Roman"/>
+          <w:sz w:val="24"/>
+          <w:szCs w:val="24"/>
+        </w:rPr>
+        <w:t xml:space="preserve">Repeatedly double the index: </w:t>
+      </w:r>
+    </w:p>
+    <w:p>
+      <w:pPr>
+        <w:numPr>
+          <w:ilvl w:val="1"/>
+          <w:numId w:val="15"/>
+        </w:numPr>
+        <w:spacing w:before="100" w:beforeAutospacing="1" w:after="100" w:afterAutospacing="1" w:line="240" w:lineRule="auto"/>
+        <w:rPr>
+          <w:rFonts w:ascii="Times New Roman" w:eastAsia="Times New Roman" w:hAnsi="Times New Roman" w:cs="Times New Roman"/>
+          <w:sz w:val="24"/>
+          <w:szCs w:val="24"/>
+        </w:rPr>
+      </w:pPr>
+      <w:proofErr w:type="spellStart"/>
+      <w:r>
+        <w:rPr>
+          <w:rFonts w:ascii="Courier New" w:eastAsia="Times New Roman" w:hAnsi="Courier New" w:cs="Courier New"/>
+          <w:sz w:val="20"/>
+        </w:rPr>
+        <w:t>i</w:t>
+      </w:r>
+      <w:proofErr w:type="spellEnd"/>
+      <w:r>
+        <w:rPr>
+          <w:rFonts w:ascii="Courier New" w:eastAsia="Times New Roman" w:hAnsi="Courier New" w:cs="Courier New"/>
+          <w:sz w:val="20"/>
+        </w:rPr>
+        <w:t xml:space="preserve"> = </w:t>
+      </w:r>
+      <w:proofErr w:type="spellStart"/>
+      <w:r>
+        <w:rPr>
+          <w:rFonts w:ascii="Courier New" w:eastAsia="Times New Roman" w:hAnsi="Courier New" w:cs="Courier New"/>
+          <w:sz w:val="20"/>
+        </w:rPr>
+        <w:t>i</w:t>
+      </w:r>
+      <w:proofErr w:type="spellEnd"/>
+      <w:r>
+        <w:rPr>
+          <w:rFonts w:ascii="Courier New" w:eastAsia="Times New Roman" w:hAnsi="Courier New" w:cs="Courier New"/>
+          <w:sz w:val="20"/>
+        </w:rPr>
+        <w:t xml:space="preserve"> × 2</w:t>
+      </w:r>
+      <w:r>
+        <w:rPr>
+          <w:rFonts w:ascii="Times New Roman" w:eastAsia="Times New Roman" w:hAnsi="Times New Roman" w:cs="Times New Roman"/>
+          <w:sz w:val="24"/>
+          <w:szCs w:val="24"/>
+        </w:rPr>
+        <w:t xml:space="preserve"> </w:t>
+      </w:r>
+    </w:p>
+    <w:p>
+      <w:pPr>
+        <w:numPr>
+          <w:ilvl w:val="1"/>
+          <w:numId w:val="15"/>
+        </w:numPr>
+        <w:spacing w:before="100" w:beforeAutospacing="1" w:after="100" w:afterAutospacing="1" w:line="240" w:lineRule="auto"/>
+        <w:rPr>
+          <w:rFonts w:ascii="Times New Roman" w:eastAsia="Times New Roman" w:hAnsi="Times New Roman" w:cs="Times New Roman"/>
+          <w:sz w:val="24"/>
+          <w:szCs w:val="24"/>
+        </w:rPr>
+      </w:pPr>
+      <w:r>
+        <w:rPr>
+          <w:rFonts w:ascii="Times New Roman" w:eastAsia="Times New Roman" w:hAnsi="Times New Roman" w:cs="Times New Roman"/>
+          <w:sz w:val="24"/>
+          <w:szCs w:val="24"/>
+        </w:rPr>
+        <w:t xml:space="preserve">Continue while: </w:t>
+      </w:r>
+    </w:p>
+    <w:p>
+      <w:pPr>
+        <w:numPr>
+          <w:ilvl w:val="2"/>
+          <w:numId w:val="15"/>
+        </w:numPr>
+        <w:spacing w:before="100" w:beforeAutospacing="1" w:after="100" w:afterAutospacing="1" w:line="240" w:lineRule="auto"/>
+        <w:rPr>
+          <w:rFonts w:ascii="Times New Roman" w:eastAsia="Times New Roman" w:hAnsi="Times New Roman" w:cs="Times New Roman"/>
+          <w:sz w:val="24"/>
+          <w:szCs w:val="24"/>
+        </w:rPr>
+      </w:pPr>
+      <w:proofErr w:type="spellStart"/>
+      <w:r>
+        <w:rPr>
+          <w:rFonts w:ascii="Courier New" w:eastAsia="Times New Roman" w:hAnsi="Courier New" w:cs="Courier New"/>
+          <w:sz w:val="20"/>
+        </w:rPr>
+        <w:t>i</w:t>
+      </w:r>
+      <w:proofErr w:type="spellEnd"/>
+      <w:r>
+        <w:rPr>
+          <w:rFonts w:ascii="Courier New" w:eastAsia="Times New Roman" w:hAnsi="Courier New" w:cs="Courier New"/>
+          <w:sz w:val="20"/>
+        </w:rPr>
+        <w:t xml:space="preserve"> &lt; n</w:t>
+      </w:r>
+      <w:r>
+        <w:rPr>
+          <w:rFonts w:ascii="Times New Roman" w:eastAsia="Times New Roman" w:hAnsi="Times New Roman" w:cs="Times New Roman"/>
+          <w:sz w:val="24"/>
+          <w:szCs w:val="24"/>
+        </w:rPr>
+        <w:t xml:space="preserve"> </w:t>
+      </w:r>
+    </w:p>
+    <w:p>
+      <w:pPr>
+        <w:numPr>
+          <w:ilvl w:val="2"/>
+          <w:numId w:val="15"/>
+        </w:numPr>
+        <w:spacing w:before="100" w:beforeAutospacing="1" w:after="100" w:afterAutospacing="1" w:line="240" w:lineRule="auto"/>
+        <w:rPr>
+          <w:rFonts w:ascii="Times New Roman" w:eastAsia="Times New Roman" w:hAnsi="Times New Roman" w:cs="Times New Roman"/>
+          <w:sz w:val="24"/>
+          <w:szCs w:val="24"/>
+        </w:rPr>
+      </w:pPr>
+      <w:proofErr w:type="spellStart"/>
+      <w:r>
+        <w:rPr>
+          <w:rFonts w:ascii="Courier New" w:eastAsia="Times New Roman" w:hAnsi="Courier New" w:cs="Courier New"/>
+          <w:sz w:val="20"/>
+        </w:rPr>
+        <w:t>arr</w:t>
+      </w:r>
+      <w:proofErr w:type="spellEnd"/>
+      <w:r>
+        <w:rPr>
+          <w:rFonts w:ascii="Courier New" w:eastAsia="Times New Roman" w:hAnsi="Courier New" w:cs="Courier New"/>
+          <w:sz w:val="20"/>
+        </w:rPr>
+        <w:t>[</w:t>
+      </w:r>
+      <w:proofErr w:type="spellStart"/>
+      <w:r>
+        <w:rPr>
+          <w:rFonts w:ascii="Courier New" w:eastAsia="Times New Roman" w:hAnsi="Courier New" w:cs="Courier New"/>
+          <w:sz w:val="20"/>
+        </w:rPr>
+        <w:t>i</w:t>
+      </w:r>
+      <w:proofErr w:type="spellEnd"/>
+      <w:r>
+        <w:rPr>
+          <w:rFonts w:ascii="Courier New" w:eastAsia="Times New Roman" w:hAnsi="Courier New" w:cs="Courier New"/>
+          <w:sz w:val="20"/>
+        </w:rPr>
+        <w:t>] &lt;= target</w:t>
+      </w:r>
+      <w:r>
+        <w:rPr>
+          <w:rFonts w:ascii="Times New Roman" w:eastAsia="Times New Roman" w:hAnsi="Times New Roman" w:cs="Times New Roman"/>
+          <w:sz w:val="24"/>
+          <w:szCs w:val="24"/>
+        </w:rPr>
+        <w:t xml:space="preserve"> </w:t>
+      </w:r>
+    </w:p>
+    <w:p>
+      <w:pPr>
+        <w:numPr>
+          <w:ilvl w:val="0"/>
+          <w:numId w:val="15"/>
+        </w:numPr>
+        <w:spacing w:before="100" w:beforeAutospacing="1" w:after="100" w:afterAutospacing="1" w:line="240" w:lineRule="auto"/>
+        <w:rPr>
+          <w:rFonts w:ascii="Times New Roman" w:eastAsia="Times New Roman" w:hAnsi="Times New Roman" w:cs="Times New Roman"/>
+          <w:sz w:val="24"/>
+          <w:szCs w:val="24"/>
+        </w:rPr>
+      </w:pPr>
+      <w:r>
+        <w:rPr>
+          <w:rFonts w:ascii="Times New Roman" w:eastAsia="Times New Roman" w:hAnsi="Times New Roman" w:cs="Times New Roman"/>
+          <w:sz w:val="24"/>
+          <w:szCs w:val="24"/>
+        </w:rPr>
+        <w:t xml:space="preserve">After finding the range: </w:t>
+      </w:r>
+    </w:p>
+    <w:p>
+      <w:pPr>
+        <w:numPr>
+          <w:ilvl w:val="1"/>
+          <w:numId w:val="15"/>
+        </w:numPr>
+        <w:spacing w:before="100" w:beforeAutospacing="1" w:after="100" w:afterAutospacing="1" w:line="240" w:lineRule="auto"/>
+        <w:rPr>
+          <w:rFonts w:ascii="Times New Roman" w:eastAsia="Times New Roman" w:hAnsi="Times New Roman" w:cs="Times New Roman"/>
+          <w:sz w:val="24"/>
+          <w:szCs w:val="24"/>
+        </w:rPr>
+      </w:pPr>
+      <w:r>
+        <w:rPr>
+          <w:rFonts w:ascii="Times New Roman" w:eastAsia="Times New Roman" w:hAnsi="Times New Roman" w:cs="Times New Roman"/>
+          <w:sz w:val="24"/>
+          <w:szCs w:val="24"/>
+        </w:rPr>
+        <w:t>Target lies between:</w:t>
+      </w:r>
+    </w:p>
+    <w:p>
+      <w:pPr>
+        <w:tabs>
+          <w:tab w:val="left" w:pos="916"/>
+          <w:tab w:val="left" w:pos="1832"/>
+          <w:tab w:val="left" w:pos="2748"/>
+          <w:tab w:val="left" w:pos="3664"/>
+          <w:tab w:val="left" w:pos="4580"/>
+          <w:tab w:val="left" w:pos="5496"/>
+          <w:tab w:val="left" w:pos="6412"/>
+          <w:tab w:val="left" w:pos="7328"/>
+          <w:tab w:val="left" w:pos="8244"/>
+          <w:tab w:val="left" w:pos="9160"/>
+          <w:tab w:val="left" w:pos="10076"/>
+          <w:tab w:val="left" w:pos="10992"/>
+          <w:tab w:val="left" w:pos="11908"/>
+          <w:tab w:val="left" w:pos="12824"/>
+          <w:tab w:val="left" w:pos="13740"/>
+          <w:tab w:val="left" w:pos="14656"/>
+        </w:tabs>
+        <w:spacing w:after="0" w:line="240" w:lineRule="auto"/>
+        <w:ind w:left="1440"/>
+        <w:rPr>
+          <w:rFonts w:ascii="Courier New" w:eastAsia="Times New Roman" w:hAnsi="Courier New" w:cs="Courier New"/>
+          <w:sz w:val="20"/>
+          <w:szCs w:val="20"/>
+        </w:rPr>
+      </w:pPr>
+      <w:proofErr w:type="spellStart"/>
+      <w:r>
+        <w:rPr>
+          <w:rFonts w:ascii="Courier New" w:eastAsia="Times New Roman" w:hAnsi="Courier New" w:cs="Courier New"/>
+          <w:sz w:val="20"/>
+        </w:rPr>
+        <w:t>i</w:t>
+      </w:r>
+      <w:proofErr w:type="spellEnd"/>
+      <w:r>
+        <w:rPr>
+          <w:rFonts w:ascii="Courier New" w:eastAsia="Times New Roman" w:hAnsi="Courier New" w:cs="Courier New"/>
+          <w:sz w:val="20"/>
+        </w:rPr>
+        <w:t>/</w:t>
+      </w:r>
+      <w:proofErr w:type="gramStart"/>
+      <w:r>
+        <w:rPr>
+          <w:rFonts w:ascii="Courier New" w:eastAsia="Times New Roman" w:hAnsi="Courier New" w:cs="Courier New"/>
+          <w:sz w:val="20"/>
+        </w:rPr>
+        <w:t>2  to</w:t>
+      </w:r>
+      <w:proofErr w:type="gramEnd"/>
+      <w:r>
+        <w:rPr>
+          <w:rFonts w:ascii="Courier New" w:eastAsia="Times New Roman" w:hAnsi="Courier New" w:cs="Courier New"/>
+          <w:sz w:val="20"/>
+        </w:rPr>
+        <w:t xml:space="preserve">  min(</w:t>
+      </w:r>
+      <w:proofErr w:type="spellStart"/>
+      <w:r>
+        <w:rPr>
+          <w:rFonts w:ascii="Courier New" w:eastAsia="Times New Roman" w:hAnsi="Courier New" w:cs="Courier New"/>
+          <w:sz w:val="20"/>
+        </w:rPr>
+        <w:t>i</w:t>
+      </w:r>
+      <w:proofErr w:type="spellEnd"/>
+      <w:r>
+        <w:rPr>
+          <w:rFonts w:ascii="Courier New" w:eastAsia="Times New Roman" w:hAnsi="Courier New" w:cs="Courier New"/>
+          <w:sz w:val="20"/>
+        </w:rPr>
+        <w:t>, n-1)</w:t>
+      </w:r>
+    </w:p>
+    <w:p>
+      <w:pPr>
+        <w:numPr>
+          <w:ilvl w:val="0"/>
+          <w:numId w:val="15"/>
+        </w:numPr>
+        <w:spacing w:before="100" w:beforeAutospacing="1" w:after="100" w:afterAutospacing="1" w:line="240" w:lineRule="auto"/>
+        <w:rPr>
+          <w:rFonts w:ascii="Times New Roman" w:eastAsia="Times New Roman" w:hAnsi="Times New Roman" w:cs="Times New Roman"/>
+          <w:sz w:val="24"/>
+          <w:szCs w:val="24"/>
+        </w:rPr>
+      </w:pPr>
+      <w:r>
+        <w:rPr>
+          <w:rFonts w:ascii="Times New Roman" w:eastAsia="Times New Roman" w:hAnsi="Times New Roman" w:cs="Times New Roman"/>
+          <w:sz w:val="24"/>
+          <w:szCs w:val="24"/>
+        </w:rPr>
+        <w:t xml:space="preserve">Apply </w:t>
+      </w:r>
+      <w:r>
+        <w:rPr>
+          <w:rFonts w:ascii="Times New Roman" w:eastAsia="Times New Roman" w:hAnsi="Times New Roman" w:cs="Times New Roman"/>
+          <w:b/>
+          <w:bCs/>
+          <w:sz w:val="24"/>
+          <w:szCs w:val="24"/>
+        </w:rPr>
+        <w:t>Binary Search</w:t>
+      </w:r>
+      <w:r>
+        <w:rPr>
+          <w:rFonts w:ascii="Times New Roman" w:eastAsia="Times New Roman" w:hAnsi="Times New Roman" w:cs="Times New Roman"/>
+          <w:sz w:val="24"/>
+          <w:szCs w:val="24"/>
+        </w:rPr>
+        <w:t xml:space="preserve"> in that range </w:t>
+      </w:r>
+    </w:p>
+    <w:p>
+      <w:pPr>
+        <w:numPr>
+          <w:ilvl w:val="0"/>
+          <w:numId w:val="15"/>
+        </w:numPr>
+        <w:spacing w:before="100" w:beforeAutospacing="1" w:after="100" w:afterAutospacing="1" w:line="240" w:lineRule="auto"/>
+        <w:rPr>
+          <w:rFonts w:ascii="Times New Roman" w:eastAsia="Times New Roman" w:hAnsi="Times New Roman" w:cs="Times New Roman"/>
+          <w:sz w:val="24"/>
+          <w:szCs w:val="24"/>
+        </w:rPr>
+      </w:pPr>
+      <w:r>
+        <w:rPr>
+          <w:rFonts w:ascii="Times New Roman" w:eastAsia="Times New Roman" w:hAnsi="Times New Roman" w:cs="Times New Roman"/>
+          <w:sz w:val="24"/>
+          <w:szCs w:val="24"/>
+        </w:rPr>
+        <w:t xml:space="preserve">If target is found: </w:t>
+      </w:r>
+    </w:p>
+    <w:p>
+      <w:pPr>
+        <w:numPr>
+          <w:ilvl w:val="1"/>
+          <w:numId w:val="15"/>
+        </w:numPr>
+        <w:spacing w:before="100" w:beforeAutospacing="1" w:after="100" w:afterAutospacing="1" w:line="240" w:lineRule="auto"/>
+        <w:rPr>
+          <w:rFonts w:ascii="Times New Roman" w:eastAsia="Times New Roman" w:hAnsi="Times New Roman" w:cs="Times New Roman"/>
+          <w:sz w:val="24"/>
+          <w:szCs w:val="24"/>
+        </w:rPr>
+      </w:pPr>
+      <w:r>
+        <w:rPr>
+          <w:rFonts w:ascii="Times New Roman" w:eastAsia="Times New Roman" w:hAnsi="Times New Roman" w:cs="Times New Roman"/>
+          <w:sz w:val="24"/>
+          <w:szCs w:val="24"/>
+        </w:rPr>
+        <w:t xml:space="preserve">Return index </w:t>
+      </w:r>
+    </w:p>
+    <w:p>
+      <w:pPr>
+        <w:numPr>
+          <w:ilvl w:val="0"/>
+          <w:numId w:val="15"/>
+        </w:numPr>
+        <w:spacing w:before="100" w:beforeAutospacing="1" w:after="100" w:afterAutospacing="1" w:line="240" w:lineRule="auto"/>
+        <w:rPr>
+          <w:rFonts w:ascii="Times New Roman" w:eastAsia="Times New Roman" w:hAnsi="Times New Roman" w:cs="Times New Roman"/>
+          <w:sz w:val="24"/>
+          <w:szCs w:val="24"/>
+        </w:rPr>
+      </w:pPr>
+      <w:r>
+        <w:rPr>
+          <w:rFonts w:ascii="Times New Roman" w:eastAsia="Times New Roman" w:hAnsi="Times New Roman" w:cs="Times New Roman"/>
+          <w:sz w:val="24"/>
+          <w:szCs w:val="24"/>
+        </w:rPr>
+        <w:t xml:space="preserve">Otherwise: </w:t>
+      </w:r>
+    </w:p>
+    <w:p>
+      <w:pPr>
+        <w:numPr>
+          <w:ilvl w:val="1"/>
+          <w:numId w:val="15"/>
+        </w:numPr>
+        <w:spacing w:before="100" w:beforeAutospacing="1" w:after="100" w:afterAutospacing="1" w:line="240" w:lineRule="auto"/>
+        <w:rPr>
+          <w:rFonts w:ascii="Times New Roman" w:eastAsia="Times New Roman" w:hAnsi="Times New Roman" w:cs="Times New Roman"/>
+          <w:sz w:val="24"/>
+          <w:szCs w:val="24"/>
+        </w:rPr>
+      </w:pPr>
+      <w:r>
+        <w:rPr>
+          <w:rFonts w:ascii="Times New Roman" w:eastAsia="Times New Roman" w:hAnsi="Times New Roman" w:cs="Times New Roman"/>
+          <w:sz w:val="24"/>
+          <w:szCs w:val="24"/>
+        </w:rPr>
+        <w:t xml:space="preserve">Return </w:t>
+      </w:r>
+      <w:r>
+        <w:rPr>
+          <w:rFonts w:ascii="Courier New" w:eastAsia="Times New Roman" w:hAnsi="Courier New" w:cs="Courier New"/>
+          <w:sz w:val="20"/>
+        </w:rPr>
+        <w:t>-1</w:t>
+      </w:r>
+    </w:p>
+    <w:p>
+      <w:pPr>
+        <w:spacing w:before="100" w:beforeAutospacing="1" w:after="100" w:afterAutospacing="1" w:line="240" w:lineRule="auto"/>
+        <w:outlineLvl w:val="0"/>
+        <w:rPr>
+          <w:rFonts w:ascii="Times New Roman" w:eastAsia="Times New Roman" w:hAnsi="Times New Roman" w:cs="Times New Roman"/>
+          <w:b/>
+          <w:bCs/>
+          <w:kern w:val="36"/>
+          <w:sz w:val="48"/>
+          <w:szCs w:val="48"/>
+        </w:rPr>
+      </w:pPr>
+      <w:r>
+        <w:rPr>
+          <w:rFonts w:ascii="Times New Roman" w:eastAsia="Times New Roman" w:hAnsi="Times New Roman" w:cs="Times New Roman"/>
+          <w:b/>
+          <w:bCs/>
+          <w:kern w:val="36"/>
+          <w:sz w:val="48"/>
+          <w:szCs w:val="48"/>
+        </w:rPr>
+        <w:t>Time Complexity</w:t>
+      </w:r>
+    </w:p>
+    <w:tbl>
+      <w:tblPr>
+        <w:tblW w:w="0" w:type="auto"/>
+        <w:tblCellSpacing w:w="15" w:type="dxa"/>
+        <w:tblCellMar>
+          <w:top w:w="15" w:type="dxa"/>
+          <w:left w:w="15" w:type="dxa"/>
+          <w:bottom w:w="15" w:type="dxa"/>
+          <w:right w:w="15" w:type="dxa"/>
+        </w:tblCellMar>
+        <w:tblLook w:val="04A0"/>
+      </w:tblPr>
+      <w:tblGrid>
+        <w:gridCol w:w="662"/>
+        <w:gridCol w:w="1262"/>
+      </w:tblGrid>
+      <w:tr>
+        <w:trPr>
+          <w:tblHeader/>
+          <w:tblCellSpacing w:w="15" w:type="dxa"/>
+        </w:trPr>
+        <w:tc>
+          <w:tcPr>
+            <w:tcW w:w="0" w:type="auto"/>
+            <w:vAlign w:val="center"/>
+            <w:hideMark/>
+          </w:tcPr>
+          <w:p>
+            <w:pPr>
+              <w:spacing w:after="0" w:line="240" w:lineRule="auto"/>
+              <w:jc w:val="center"/>
+              <w:rPr>
+                <w:rFonts w:ascii="Times New Roman" w:eastAsia="Times New Roman" w:hAnsi="Times New Roman" w:cs="Times New Roman"/>
+                <w:b/>
+                <w:bCs/>
+                <w:sz w:val="24"/>
+                <w:szCs w:val="24"/>
+              </w:rPr>
+            </w:pPr>
+            <w:r>
+              <w:rPr>
+                <w:rFonts w:ascii="Times New Roman" w:eastAsia="Times New Roman" w:hAnsi="Times New Roman" w:cs="Times New Roman"/>
+                <w:b/>
+                <w:bCs/>
+                <w:sz w:val="24"/>
+                <w:szCs w:val="24"/>
+              </w:rPr>
+              <w:t>Case</w:t>
+            </w:r>
+          </w:p>
+        </w:tc>
+        <w:tc>
+          <w:tcPr>
+            <w:tcW w:w="0" w:type="auto"/>
+            <w:vAlign w:val="center"/>
+            <w:hideMark/>
+          </w:tcPr>
+          <w:p>
+            <w:pPr>
+              <w:spacing w:after="0" w:line="240" w:lineRule="auto"/>
+              <w:jc w:val="center"/>
+              <w:rPr>
+                <w:rFonts w:ascii="Times New Roman" w:eastAsia="Times New Roman" w:hAnsi="Times New Roman" w:cs="Times New Roman"/>
+                <w:b/>
+                <w:bCs/>
+                <w:sz w:val="24"/>
+                <w:szCs w:val="24"/>
+              </w:rPr>
+            </w:pPr>
+            <w:r>
+              <w:rPr>
+                <w:rFonts w:ascii="Times New Roman" w:eastAsia="Times New Roman" w:hAnsi="Times New Roman" w:cs="Times New Roman"/>
+                <w:b/>
+                <w:bCs/>
+                <w:sz w:val="24"/>
+                <w:szCs w:val="24"/>
+              </w:rPr>
+              <w:t>Complexity</w:t>
+            </w:r>
+          </w:p>
+        </w:tc>
+      </w:tr>
+      <w:tr>
+        <w:trPr>
+          <w:tblCellSpacing w:w="15" w:type="dxa"/>
+        </w:trPr>
+        <w:tc>
+          <w:tcPr>
+            <w:tcW w:w="0" w:type="auto"/>
+            <w:vAlign w:val="center"/>
+            <w:hideMark/>
+          </w:tcPr>
+          <w:p>
+            <w:pPr>
+              <w:spacing w:after="0" w:line="240" w:lineRule="auto"/>
+              <w:rPr>
+                <w:rFonts w:ascii="Times New Roman" w:eastAsia="Times New Roman" w:hAnsi="Times New Roman" w:cs="Times New Roman"/>
+                <w:sz w:val="24"/>
+                <w:szCs w:val="24"/>
+              </w:rPr>
+            </w:pPr>
+            <w:r>
+              <w:rPr>
+                <w:rFonts w:ascii="Times New Roman" w:eastAsia="Times New Roman" w:hAnsi="Times New Roman" w:cs="Times New Roman"/>
+                <w:sz w:val="24"/>
+                <w:szCs w:val="24"/>
+              </w:rPr>
+              <w:t>Best</w:t>
+            </w:r>
+          </w:p>
+        </w:tc>
+        <w:tc>
+          <w:tcPr>
+            <w:tcW w:w="0" w:type="auto"/>
+            <w:vAlign w:val="center"/>
+            <w:hideMark/>
+          </w:tcPr>
+          <w:p>
+            <w:pPr>
+              <w:spacing w:after="0" w:line="240" w:lineRule="auto"/>
+              <w:rPr>
+                <w:rFonts w:ascii="Times New Roman" w:eastAsia="Times New Roman" w:hAnsi="Times New Roman" w:cs="Times New Roman"/>
+                <w:sz w:val="24"/>
+                <w:szCs w:val="24"/>
+              </w:rPr>
+            </w:pPr>
+            <w:r>
+              <w:rPr>
+                <w:rFonts w:ascii="Times New Roman" w:eastAsia="Times New Roman" w:hAnsi="Times New Roman" w:cs="Times New Roman"/>
+                <w:sz w:val="24"/>
+                <w:szCs w:val="24"/>
+              </w:rPr>
+              <w:t>O(1)</w:t>
+            </w:r>
+          </w:p>
+        </w:tc>
+      </w:tr>
+      <w:tr>
+        <w:trPr>
+          <w:tblCellSpacing w:w="15" w:type="dxa"/>
+        </w:trPr>
+        <w:tc>
+          <w:tcPr>
+            <w:tcW w:w="0" w:type="auto"/>
+            <w:vAlign w:val="center"/>
+            <w:hideMark/>
+          </w:tcPr>
+          <w:p>
+            <w:pPr>
+              <w:spacing w:after="0" w:line="240" w:lineRule="auto"/>
+              <w:rPr>
+                <w:rFonts w:ascii="Times New Roman" w:eastAsia="Times New Roman" w:hAnsi="Times New Roman" w:cs="Times New Roman"/>
+                <w:sz w:val="24"/>
+                <w:szCs w:val="24"/>
+              </w:rPr>
+            </w:pPr>
+            <w:r>
+              <w:rPr>
+                <w:rFonts w:ascii="Times New Roman" w:eastAsia="Times New Roman" w:hAnsi="Times New Roman" w:cs="Times New Roman"/>
+                <w:sz w:val="24"/>
+                <w:szCs w:val="24"/>
+              </w:rPr>
+              <w:t>Worst</w:t>
+            </w:r>
+          </w:p>
+        </w:tc>
+        <w:tc>
+          <w:tcPr>
+            <w:tcW w:w="0" w:type="auto"/>
+            <w:vAlign w:val="center"/>
+            <w:hideMark/>
+          </w:tcPr>
+          <w:p>
+            <w:pPr>
+              <w:spacing w:after="0" w:line="240" w:lineRule="auto"/>
+              <w:rPr>
+                <w:rFonts w:ascii="Times New Roman" w:eastAsia="Times New Roman" w:hAnsi="Times New Roman" w:cs="Times New Roman"/>
+                <w:sz w:val="24"/>
+                <w:szCs w:val="24"/>
+              </w:rPr>
+            </w:pPr>
+            <w:r>
+              <w:rPr>
+                <w:rFonts w:ascii="Times New Roman" w:eastAsia="Times New Roman" w:hAnsi="Times New Roman" w:cs="Times New Roman"/>
+                <w:sz w:val="24"/>
+                <w:szCs w:val="24"/>
+              </w:rPr>
+              <w:t>O(log n)</w:t>
+            </w:r>
+          </w:p>
+        </w:tc>
+      </w:tr>
+    </w:tbl>
+    <w:p>
+      <w:pPr>
         <w:rPr>
           <w:b/>
           <w:sz w:val="36"/>
@@ -6350,6 +7293,119 @@
     </w:lvl>
   </w:abstractNum>
   <w:abstractNum w:abstractNumId="8">
+    <w:nsid w:val="406B79D4"/>
+    <w:multiLevelType w:val="multilevel"/>
+    <w:tmpl w:val="FDFEC678"/>
+    <w:lvl w:ilvl="0">
+      <w:start w:val="1"/>
+      <w:numFmt w:val="decimal"/>
+      <w:lvlText w:val="%1."/>
+      <w:lvlJc w:val="left"/>
+      <w:pPr>
+        <w:tabs>
+          <w:tab w:val="num" w:pos="720"/>
+        </w:tabs>
+        <w:ind w:left="720" w:hanging="360"/>
+      </w:pPr>
+    </w:lvl>
+    <w:lvl w:ilvl="1" w:tentative="1">
+      <w:start w:val="1"/>
+      <w:numFmt w:val="decimal"/>
+      <w:lvlText w:val="%2."/>
+      <w:lvlJc w:val="left"/>
+      <w:pPr>
+        <w:tabs>
+          <w:tab w:val="num" w:pos="1440"/>
+        </w:tabs>
+        <w:ind w:left="1440" w:hanging="360"/>
+      </w:pPr>
+    </w:lvl>
+    <w:lvl w:ilvl="2" w:tentative="1">
+      <w:start w:val="1"/>
+      <w:numFmt w:val="decimal"/>
+      <w:lvlText w:val="%3."/>
+      <w:lvlJc w:val="left"/>
+      <w:pPr>
+        <w:tabs>
+          <w:tab w:val="num" w:pos="2160"/>
+        </w:tabs>
+        <w:ind w:left="2160" w:hanging="360"/>
+      </w:pPr>
+    </w:lvl>
+    <w:lvl w:ilvl="3" w:tentative="1">
+      <w:start w:val="1"/>
+      <w:numFmt w:val="decimal"/>
+      <w:lvlText w:val="%4."/>
+      <w:lvlJc w:val="left"/>
+      <w:pPr>
+        <w:tabs>
+          <w:tab w:val="num" w:pos="2880"/>
+        </w:tabs>
+        <w:ind w:left="2880" w:hanging="360"/>
+      </w:pPr>
+    </w:lvl>
+    <w:lvl w:ilvl="4" w:tentative="1">
+      <w:start w:val="1"/>
+      <w:numFmt w:val="decimal"/>
+      <w:lvlText w:val="%5."/>
+      <w:lvlJc w:val="left"/>
+      <w:pPr>
+        <w:tabs>
+          <w:tab w:val="num" w:pos="3600"/>
+        </w:tabs>
+        <w:ind w:left="3600" w:hanging="360"/>
+      </w:pPr>
+    </w:lvl>
+    <w:lvl w:ilvl="5" w:tentative="1">
+      <w:start w:val="1"/>
+      <w:numFmt w:val="decimal"/>
+      <w:lvlText w:val="%6."/>
+      <w:lvlJc w:val="left"/>
+      <w:pPr>
+        <w:tabs>
+          <w:tab w:val="num" w:pos="4320"/>
+        </w:tabs>
+        <w:ind w:left="4320" w:hanging="360"/>
+      </w:pPr>
+    </w:lvl>
+    <w:lvl w:ilvl="6" w:tentative="1">
+      <w:start w:val="1"/>
+      <w:numFmt w:val="decimal"/>
+      <w:lvlText w:val="%7."/>
+      <w:lvlJc w:val="left"/>
+      <w:pPr>
+        <w:tabs>
+          <w:tab w:val="num" w:pos="5040"/>
+        </w:tabs>
+        <w:ind w:left="5040" w:hanging="360"/>
+      </w:pPr>
+    </w:lvl>
+    <w:lvl w:ilvl="7" w:tentative="1">
+      <w:start w:val="1"/>
+      <w:numFmt w:val="decimal"/>
+      <w:lvlText w:val="%8."/>
+      <w:lvlJc w:val="left"/>
+      <w:pPr>
+        <w:tabs>
+          <w:tab w:val="num" w:pos="5760"/>
+        </w:tabs>
+        <w:ind w:left="5760" w:hanging="360"/>
+      </w:pPr>
+    </w:lvl>
+    <w:lvl w:ilvl="8" w:tentative="1">
+      <w:start w:val="1"/>
+      <w:numFmt w:val="decimal"/>
+      <w:lvlText w:val="%9."/>
+      <w:lvlJc w:val="left"/>
+      <w:pPr>
+        <w:tabs>
+          <w:tab w:val="num" w:pos="6480"/>
+        </w:tabs>
+        <w:ind w:left="6480" w:hanging="360"/>
+      </w:pPr>
+    </w:lvl>
+  </w:abstractNum>
+  <w:abstractNum w:abstractNumId="9">
     <w:nsid w:val="47F2550C"/>
     <w:multiLevelType w:val="multilevel"/>
     <w:tmpl w:val="DB82CAD2"/>
@@ -6498,7 +7554,7 @@
       </w:rPr>
     </w:lvl>
   </w:abstractNum>
-  <w:abstractNum w:abstractNumId="9">
+  <w:abstractNum w:abstractNumId="10">
     <w:nsid w:val="4BBE729F"/>
     <w:multiLevelType w:val="multilevel"/>
     <w:tmpl w:val="3FEA524A"/>
@@ -6647,7 +7703,7 @@
       </w:rPr>
     </w:lvl>
   </w:abstractNum>
-  <w:abstractNum w:abstractNumId="10">
+  <w:abstractNum w:abstractNumId="11">
     <w:nsid w:val="647058DA"/>
     <w:multiLevelType w:val="multilevel"/>
     <w:tmpl w:val="D01A091E"/>
@@ -6796,7 +7852,7 @@
       </w:rPr>
     </w:lvl>
   </w:abstractNum>
-  <w:abstractNum w:abstractNumId="11">
+  <w:abstractNum w:abstractNumId="12">
     <w:nsid w:val="66342D61"/>
     <w:multiLevelType w:val="multilevel"/>
     <w:tmpl w:val="5AB6879A"/>
@@ -6913,10 +7969,131 @@
       </w:pPr>
     </w:lvl>
   </w:abstractNum>
-  <w:abstractNum w:abstractNumId="12">
+  <w:abstractNum w:abstractNumId="13">
     <w:nsid w:val="68E01D92"/>
     <w:multiLevelType w:val="multilevel"/>
     <w:tmpl w:val="EFFC280C"/>
+    <w:lvl w:ilvl="0">
+      <w:start w:val="1"/>
+      <w:numFmt w:val="decimal"/>
+      <w:lvlText w:val="%1."/>
+      <w:lvlJc w:val="left"/>
+      <w:pPr>
+        <w:tabs>
+          <w:tab w:val="num" w:pos="720"/>
+        </w:tabs>
+        <w:ind w:left="720" w:hanging="360"/>
+      </w:pPr>
+    </w:lvl>
+    <w:lvl w:ilvl="1">
+      <w:start w:val="1"/>
+      <w:numFmt w:val="bullet"/>
+      <w:lvlText w:val="o"/>
+      <w:lvlJc w:val="left"/>
+      <w:pPr>
+        <w:tabs>
+          <w:tab w:val="num" w:pos="1440"/>
+        </w:tabs>
+        <w:ind w:left="1440" w:hanging="360"/>
+      </w:pPr>
+      <w:rPr>
+        <w:rFonts w:ascii="Courier New" w:hAnsi="Courier New" w:hint="default"/>
+        <w:sz w:val="20"/>
+      </w:rPr>
+    </w:lvl>
+    <w:lvl w:ilvl="2">
+      <w:start w:val="1"/>
+      <w:numFmt w:val="bullet"/>
+      <w:lvlText w:val=""/>
+      <w:lvlJc w:val="left"/>
+      <w:pPr>
+        <w:tabs>
+          <w:tab w:val="num" w:pos="2160"/>
+        </w:tabs>
+        <w:ind w:left="2160" w:hanging="360"/>
+      </w:pPr>
+      <w:rPr>
+        <w:rFonts w:ascii="Wingdings" w:hAnsi="Wingdings" w:hint="default"/>
+        <w:sz w:val="20"/>
+      </w:rPr>
+    </w:lvl>
+    <w:lvl w:ilvl="3" w:tentative="1">
+      <w:start w:val="1"/>
+      <w:numFmt w:val="decimal"/>
+      <w:lvlText w:val="%4."/>
+      <w:lvlJc w:val="left"/>
+      <w:pPr>
+        <w:tabs>
+          <w:tab w:val="num" w:pos="2880"/>
+        </w:tabs>
+        <w:ind w:left="2880" w:hanging="360"/>
+      </w:pPr>
+    </w:lvl>
+    <w:lvl w:ilvl="4" w:tentative="1">
+      <w:start w:val="1"/>
+      <w:numFmt w:val="decimal"/>
+      <w:lvlText w:val="%5."/>
+      <w:lvlJc w:val="left"/>
+      <w:pPr>
+        <w:tabs>
+          <w:tab w:val="num" w:pos="3600"/>
+        </w:tabs>
+        <w:ind w:left="3600" w:hanging="360"/>
+      </w:pPr>
+    </w:lvl>
+    <w:lvl w:ilvl="5" w:tentative="1">
+      <w:start w:val="1"/>
+      <w:numFmt w:val="decimal"/>
+      <w:lvlText w:val="%6."/>
+      <w:lvlJc w:val="left"/>
+      <w:pPr>
+        <w:tabs>
+          <w:tab w:val="num" w:pos="4320"/>
+        </w:tabs>
+        <w:ind w:left="4320" w:hanging="360"/>
+      </w:pPr>
+    </w:lvl>
+    <w:lvl w:ilvl="6" w:tentative="1">
+      <w:start w:val="1"/>
+      <w:numFmt w:val="decimal"/>
+      <w:lvlText w:val="%7."/>
+      <w:lvlJc w:val="left"/>
+      <w:pPr>
+        <w:tabs>
+          <w:tab w:val="num" w:pos="5040"/>
+        </w:tabs>
+        <w:ind w:left="5040" w:hanging="360"/>
+      </w:pPr>
+    </w:lvl>
+    <w:lvl w:ilvl="7" w:tentative="1">
+      <w:start w:val="1"/>
+      <w:numFmt w:val="decimal"/>
+      <w:lvlText w:val="%8."/>
+      <w:lvlJc w:val="left"/>
+      <w:pPr>
+        <w:tabs>
+          <w:tab w:val="num" w:pos="5760"/>
+        </w:tabs>
+        <w:ind w:left="5760" w:hanging="360"/>
+      </w:pPr>
+    </w:lvl>
+    <w:lvl w:ilvl="8" w:tentative="1">
+      <w:start w:val="1"/>
+      <w:numFmt w:val="decimal"/>
+      <w:lvlText w:val="%9."/>
+      <w:lvlJc w:val="left"/>
+      <w:pPr>
+        <w:tabs>
+          <w:tab w:val="num" w:pos="6480"/>
+        </w:tabs>
+        <w:ind w:left="6480" w:hanging="360"/>
+      </w:pPr>
+    </w:lvl>
+  </w:abstractNum>
+  <w:abstractNum w:abstractNumId="14">
+    <w:nsid w:val="78BD2CD7"/>
+    <w:multiLevelType w:val="multilevel"/>
+    <w:tmpl w:val="DF78B92E"/>
     <w:lvl w:ilvl="0">
       <w:start w:val="1"/>
       <w:numFmt w:val="decimal"/>
@@ -7044,19 +8221,19 @@
     <w:abstractNumId w:val="2"/>
   </w:num>
   <w:num w:numId="4">
-    <w:abstractNumId w:val="12"/>
+    <w:abstractNumId w:val="13"/>
   </w:num>
   <w:num w:numId="5">
     <w:abstractNumId w:val="6"/>
   </w:num>
   <w:num w:numId="6">
-    <w:abstractNumId w:val="8"/>
+    <w:abstractNumId w:val="9"/>
   </w:num>
   <w:num w:numId="7">
     <w:abstractNumId w:val="7"/>
   </w:num>
   <w:num w:numId="8">
-    <w:abstractNumId w:val="11"/>
+    <w:abstractNumId w:val="12"/>
   </w:num>
   <w:num w:numId="9">
     <w:abstractNumId w:val="3"/>
@@ -7065,13 +8242,19 @@
     <w:abstractNumId w:val="5"/>
   </w:num>
   <w:num w:numId="11">
-    <w:abstractNumId w:val="9"/>
+    <w:abstractNumId w:val="10"/>
   </w:num>
   <w:num w:numId="12">
     <w:abstractNumId w:val="4"/>
   </w:num>
   <w:num w:numId="13">
-    <w:abstractNumId w:val="10"/>
+    <w:abstractNumId w:val="11"/>
+  </w:num>
+  <w:num w:numId="14">
+    <w:abstractNumId w:val="8"/>
+  </w:num>
+  <w:num w:numId="15">
+    <w:abstractNumId w:val="14"/>
   </w:num>
 </w:numbering>
 </file>
@@ -7450,6 +8633,65 @@
     <w:basedOn w:val="DefaultParagraphFont"/>
     <w:rsid w:val="00826875"/>
   </w:style>
+  <w:style w:type="paragraph" w:styleId="HTMLPreformatted">
+    <w:name w:val="HTML Preformatted"/>
+    <w:basedOn w:val="Normal"/>
+    <w:link w:val="HTMLPreformattedChar"/>
+    <w:uiPriority w:val="99"/>
+    <w:semiHidden/>
+    <w:unhideWhenUsed/>
+    <w:rsid w:val="000F6056"/>
+    <w:pPr>
+      <w:tabs>
+        <w:tab w:val="left" w:pos="916"/>
+        <w:tab w:val="left" w:pos="1832"/>
+        <w:tab w:val="left" w:pos="2748"/>
+        <w:tab w:val="left" w:pos="3664"/>
+        <w:tab w:val="left" w:pos="4580"/>
+        <w:tab w:val="left" w:pos="5496"/>
+        <w:tab w:val="left" w:pos="6412"/>
+        <w:tab w:val="left" w:pos="7328"/>
+        <w:tab w:val="left" w:pos="8244"/>
+        <w:tab w:val="left" w:pos="9160"/>
+        <w:tab w:val="left" w:pos="10076"/>
+        <w:tab w:val="left" w:pos="10992"/>
+        <w:tab w:val="left" w:pos="11908"/>
+        <w:tab w:val="left" w:pos="12824"/>
+        <w:tab w:val="left" w:pos="13740"/>
+        <w:tab w:val="left" w:pos="14656"/>
+      </w:tabs>
+      <w:spacing w:after="0" w:line="240" w:lineRule="auto"/>
+    </w:pPr>
+    <w:rPr>
+      <w:rFonts w:ascii="Courier New" w:eastAsia="Times New Roman" w:hAnsi="Courier New" w:cs="Courier New"/>
+      <w:sz w:val="20"/>
+      <w:szCs w:val="20"/>
+    </w:rPr>
+  </w:style>
+  <w:style w:type="character" w:customStyle="1" w:styleId="HTMLPreformattedChar">
+    <w:name w:val="HTML Preformatted Char"/>
+    <w:basedOn w:val="DefaultParagraphFont"/>
+    <w:link w:val="HTMLPreformatted"/>
+    <w:uiPriority w:val="99"/>
+    <w:semiHidden/>
+    <w:rsid w:val="000F6056"/>
+    <w:rPr>
+      <w:rFonts w:ascii="Courier New" w:eastAsia="Times New Roman" w:hAnsi="Courier New" w:cs="Courier New"/>
+      <w:sz w:val="20"/>
+      <w:szCs w:val="20"/>
+    </w:rPr>
+  </w:style>
+  <w:style w:type="paragraph" w:styleId="ListParagraph">
+    <w:name w:val="List Paragraph"/>
+    <w:basedOn w:val="Normal"/>
+    <w:uiPriority w:val="34"/>
+    <w:qFormat/>
+    <w:rsid w:val="000F6056"/>
+    <w:pPr>
+      <w:ind w:left="720"/>
+      <w:contextualSpacing/>
+    </w:pPr>
+  </w:style>
 </w:styles>
 </file>
 

</xml_diff>

<commit_message>
Adding Fibonacci Searching Algo
</commit_message>
<xml_diff>
--- a/Searching Algorithm/Basics.docx
+++ b/Searching Algorithm/Basics.docx
@@ -6220,6 +6220,546 @@
         </w:rPr>
       </w:pPr>
     </w:p>
+    <w:p>
+      <w:pPr>
+        <w:rPr>
+          <w:b/>
+          <w:sz w:val="36"/>
+          <w:szCs w:val="36"/>
+        </w:rPr>
+      </w:pPr>
+    </w:p>
+    <w:p>
+      <w:pPr>
+        <w:spacing w:before="100" w:beforeAutospacing="1" w:after="100" w:afterAutospacing="1" w:line="240" w:lineRule="auto"/>
+        <w:jc w:val="center"/>
+        <w:outlineLvl w:val="0"/>
+        <w:rPr>
+          <w:rFonts w:ascii="Times New Roman" w:eastAsia="Times New Roman" w:hAnsi="Times New Roman" w:cs="Times New Roman"/>
+          <w:b/>
+          <w:bCs/>
+          <w:kern w:val="36"/>
+          <w:sz w:val="48"/>
+          <w:szCs w:val="48"/>
+        </w:rPr>
+      </w:pPr>
+      <w:r>
+        <w:rPr>
+          <w:rFonts w:ascii="Times New Roman" w:eastAsia="Times New Roman" w:hAnsi="Times New Roman" w:cs="Times New Roman"/>
+          <w:b/>
+          <w:bCs/>
+          <w:kern w:val="36"/>
+          <w:sz w:val="48"/>
+          <w:szCs w:val="48"/>
+        </w:rPr>
+        <w:lastRenderedPageBreak/>
+        <w:t>Fibonacci Search</w:t>
+      </w:r>
+    </w:p>
+    <w:p>
+      <w:pPr>
+        <w:spacing w:before="100" w:beforeAutospacing="1" w:after="100" w:afterAutospacing="1" w:line="240" w:lineRule="auto"/>
+        <w:rPr>
+          <w:rFonts w:ascii="Times New Roman" w:eastAsia="Times New Roman" w:hAnsi="Times New Roman" w:cs="Times New Roman"/>
+          <w:sz w:val="24"/>
+          <w:szCs w:val="24"/>
+        </w:rPr>
+      </w:pPr>
+      <w:r>
+        <w:rPr>
+          <w:rFonts w:ascii="Times New Roman" w:eastAsia="Times New Roman" w:hAnsi="Times New Roman" w:cs="Times New Roman"/>
+          <w:b/>
+          <w:bCs/>
+          <w:sz w:val="24"/>
+          <w:szCs w:val="24"/>
+        </w:rPr>
+        <w:t>Fibonacci Search</w:t>
+      </w:r>
+      <w:r>
+        <w:rPr>
+          <w:rFonts w:ascii="Times New Roman" w:eastAsia="Times New Roman" w:hAnsi="Times New Roman" w:cs="Times New Roman"/>
+          <w:sz w:val="24"/>
+          <w:szCs w:val="24"/>
+        </w:rPr>
+        <w:t xml:space="preserve"> is a searching algorithm used to find an element in a </w:t>
+      </w:r>
+      <w:r>
+        <w:rPr>
+          <w:rFonts w:ascii="Times New Roman" w:eastAsia="Times New Roman" w:hAnsi="Times New Roman" w:cs="Times New Roman"/>
+          <w:b/>
+          <w:bCs/>
+          <w:sz w:val="24"/>
+          <w:szCs w:val="24"/>
+        </w:rPr>
+        <w:t>sorted array</w:t>
+      </w:r>
+      <w:r>
+        <w:rPr>
+          <w:rFonts w:ascii="Times New Roman" w:eastAsia="Times New Roman" w:hAnsi="Times New Roman" w:cs="Times New Roman"/>
+          <w:sz w:val="24"/>
+          <w:szCs w:val="24"/>
+        </w:rPr>
+        <w:t xml:space="preserve"> using Fibonacci </w:t>
+      </w:r>
+      <w:proofErr w:type="spellStart"/>
+      <w:r>
+        <w:rPr>
+          <w:rFonts w:ascii="Times New Roman" w:eastAsia="Times New Roman" w:hAnsi="Times New Roman" w:cs="Times New Roman"/>
+          <w:sz w:val="24"/>
+          <w:szCs w:val="24"/>
+        </w:rPr>
+        <w:t>numbers.Instead</w:t>
+      </w:r>
+      <w:proofErr w:type="spellEnd"/>
+      <w:r>
+        <w:rPr>
+          <w:rFonts w:ascii="Times New Roman" w:eastAsia="Times New Roman" w:hAnsi="Times New Roman" w:cs="Times New Roman"/>
+          <w:sz w:val="24"/>
+          <w:szCs w:val="24"/>
+        </w:rPr>
+        <w:t xml:space="preserve"> of dividing the array in half like Binary </w:t>
+      </w:r>
+      <w:proofErr w:type="gramStart"/>
+      <w:r>
+        <w:rPr>
+          <w:rFonts w:ascii="Times New Roman" w:eastAsia="Times New Roman" w:hAnsi="Times New Roman" w:cs="Times New Roman"/>
+          <w:sz w:val="24"/>
+          <w:szCs w:val="24"/>
+        </w:rPr>
+        <w:t>Search,</w:t>
+      </w:r>
+      <w:proofErr w:type="gramEnd"/>
+      <w:r>
+        <w:rPr>
+          <w:rFonts w:ascii="Times New Roman" w:eastAsia="Times New Roman" w:hAnsi="Times New Roman" w:cs="Times New Roman"/>
+          <w:sz w:val="24"/>
+          <w:szCs w:val="24"/>
+        </w:rPr>
+        <w:t xml:space="preserve"> it divides the array using </w:t>
+      </w:r>
+      <w:r>
+        <w:rPr>
+          <w:rFonts w:ascii="Times New Roman" w:eastAsia="Times New Roman" w:hAnsi="Times New Roman" w:cs="Times New Roman"/>
+          <w:b/>
+          <w:bCs/>
+          <w:sz w:val="24"/>
+          <w:szCs w:val="24"/>
+        </w:rPr>
+        <w:t>Fibonacci sequence positions</w:t>
+      </w:r>
+      <w:r>
+        <w:rPr>
+          <w:rFonts w:ascii="Times New Roman" w:eastAsia="Times New Roman" w:hAnsi="Times New Roman" w:cs="Times New Roman"/>
+          <w:sz w:val="24"/>
+          <w:szCs w:val="24"/>
+        </w:rPr>
+        <w:t>.</w:t>
+      </w:r>
+    </w:p>
+    <w:p>
+      <w:pPr>
+        <w:spacing w:before="100" w:beforeAutospacing="1" w:after="100" w:afterAutospacing="1" w:line="240" w:lineRule="auto"/>
+        <w:rPr>
+          <w:b/>
+          <w:sz w:val="28"/>
+          <w:szCs w:val="28"/>
+        </w:rPr>
+      </w:pPr>
+      <w:r>
+        <w:rPr>
+          <w:b/>
+          <w:sz w:val="28"/>
+          <w:szCs w:val="28"/>
+        </w:rPr>
+        <w:t>Fibonacci Search — Steps</w:t>
+      </w:r>
+    </w:p>
+    <w:p>
+      <w:pPr>
+        <w:pStyle w:val="NoSpacing"/>
+        <w:rPr>
+          <w:rFonts w:eastAsia="Times New Roman"/>
+          <w:kern w:val="36"/>
+        </w:rPr>
+      </w:pPr>
+      <w:r>
+        <w:rPr>
+          <w:rFonts w:eastAsia="Times New Roman"/>
+          <w:kern w:val="36"/>
+        </w:rPr>
+        <w:t>Step 1: Generate Fibonacci Numbers</w:t>
+      </w:r>
+    </w:p>
+    <w:p>
+      <w:pPr>
+        <w:pStyle w:val="NoSpacing"/>
+        <w:rPr>
+          <w:rFonts w:eastAsia="Times New Roman"/>
+        </w:rPr>
+      </w:pPr>
+      <w:r>
+        <w:rPr>
+          <w:rFonts w:eastAsia="Times New Roman"/>
+        </w:rPr>
+        <w:t xml:space="preserve">Find the smallest Fibonacci number greater than or equal to array size </w:t>
+      </w:r>
+      <w:r>
+        <w:rPr>
+          <w:rFonts w:ascii="Courier New" w:eastAsia="Times New Roman" w:hAnsi="Courier New" w:cs="Courier New"/>
+          <w:sz w:val="20"/>
+        </w:rPr>
+        <w:t>n</w:t>
+      </w:r>
+      <w:r>
+        <w:rPr>
+          <w:rFonts w:eastAsia="Times New Roman"/>
+        </w:rPr>
+        <w:t>.</w:t>
+      </w:r>
+    </w:p>
+    <w:p>
+      <w:pPr>
+        <w:pStyle w:val="NoSpacing"/>
+        <w:rPr>
+          <w:rFonts w:ascii="Times New Roman" w:eastAsia="Times New Roman" w:hAnsi="Times New Roman" w:cs="Times New Roman"/>
+        </w:rPr>
+      </w:pPr>
+      <w:r>
+        <w:t>Step 2: Initialize Variables</w:t>
+      </w:r>
+    </w:p>
+    <w:p>
+      <w:pPr>
+        <w:pStyle w:val="NoSpacing"/>
+      </w:pPr>
+      <w:proofErr w:type="gramStart"/>
+      <w:r>
+        <w:rPr>
+          <w:rStyle w:val="HTMLCode"/>
+          <w:rFonts w:eastAsiaTheme="minorEastAsia"/>
+        </w:rPr>
+        <w:t>Offset(</w:t>
+      </w:r>
+      <w:proofErr w:type="gramEnd"/>
+      <w:r>
+        <w:rPr>
+          <w:rStyle w:val="HTMLCode"/>
+          <w:rFonts w:eastAsiaTheme="minorEastAsia"/>
+        </w:rPr>
+        <w:t>offset 1)</w:t>
+      </w:r>
+      <w:r>
+        <w:t xml:space="preserve"> keeps track of eliminated elements from the front.</w:t>
+      </w:r>
+    </w:p>
+    <w:p>
+      <w:pPr>
+        <w:spacing w:before="100" w:beforeAutospacing="1" w:after="100" w:afterAutospacing="1" w:line="240" w:lineRule="auto"/>
+        <w:outlineLvl w:val="0"/>
+        <w:rPr>
+          <w:rFonts w:ascii="Times New Roman" w:eastAsia="Times New Roman" w:hAnsi="Times New Roman" w:cs="Times New Roman"/>
+          <w:b/>
+          <w:bCs/>
+          <w:kern w:val="36"/>
+          <w:sz w:val="24"/>
+          <w:szCs w:val="24"/>
+        </w:rPr>
+      </w:pPr>
+      <w:r>
+        <w:rPr>
+          <w:rFonts w:ascii="Times New Roman" w:eastAsia="Times New Roman" w:hAnsi="Times New Roman" w:cs="Times New Roman"/>
+          <w:b/>
+          <w:bCs/>
+          <w:kern w:val="36"/>
+          <w:sz w:val="24"/>
+          <w:szCs w:val="24"/>
+        </w:rPr>
+        <w:t>Step 3: Find Comparison Index</w:t>
+      </w:r>
+    </w:p>
+    <w:p>
+      <w:pPr>
+        <w:pStyle w:val="NoSpacing"/>
+        <w:rPr>
+          <w:rFonts w:eastAsia="Times New Roman"/>
+        </w:rPr>
+      </w:pPr>
+      <w:r>
+        <w:rPr>
+          <w:rFonts w:eastAsia="Times New Roman"/>
+        </w:rPr>
+        <w:t>Formula:</w:t>
+      </w:r>
+    </w:p>
+    <w:p>
+      <w:pPr>
+        <w:pStyle w:val="NoSpacing"/>
+        <w:rPr>
+          <w:rFonts w:eastAsia="Times New Roman"/>
+        </w:rPr>
+      </w:pPr>
+      <w:proofErr w:type="spellStart"/>
+      <w:r>
+        <w:rPr>
+          <w:rFonts w:eastAsia="Times New Roman"/>
+        </w:rPr>
+        <w:t>i</w:t>
+      </w:r>
+      <w:proofErr w:type="spellEnd"/>
+      <w:r>
+        <w:rPr>
+          <w:rFonts w:eastAsia="Times New Roman"/>
+        </w:rPr>
+        <w:t>=min</w:t>
+      </w:r>
+      <w:proofErr w:type="gramStart"/>
+      <w:r>
+        <w:rPr>
+          <w:rFonts w:ascii="Cambria Math" w:eastAsia="Times New Roman" w:hAnsi="Cambria Math" w:cs="Cambria Math"/>
+        </w:rPr>
+        <w:t>⁡</w:t>
+      </w:r>
+      <w:r>
+        <w:rPr>
+          <w:rFonts w:ascii="Calibri" w:eastAsia="Times New Roman" w:hAnsi="Calibri" w:cs="Calibri"/>
+        </w:rPr>
+        <w:t>(</w:t>
+      </w:r>
+      <w:proofErr w:type="gramEnd"/>
+      <w:r>
+        <w:rPr>
+          <w:rFonts w:ascii="Calibri" w:eastAsia="Times New Roman" w:hAnsi="Calibri" w:cs="Calibri"/>
+        </w:rPr>
+        <w:t>offset+fibMMm2, n−1)</w:t>
+      </w:r>
+      <w:proofErr w:type="spellStart"/>
+      <w:r>
+        <w:rPr>
+          <w:rFonts w:ascii="Calibri" w:eastAsia="Times New Roman" w:hAnsi="Calibri" w:cs="Calibri"/>
+        </w:rPr>
+        <w:t>i</w:t>
+      </w:r>
+      <w:proofErr w:type="spellEnd"/>
+      <w:r>
+        <w:rPr>
+          <w:rFonts w:ascii="Calibri" w:eastAsia="Times New Roman" w:hAnsi="Calibri" w:cs="Calibri"/>
+        </w:rPr>
+        <w:t xml:space="preserve"> = \min(offset + fibMMm2,\ n-1)</w:t>
+      </w:r>
+      <w:proofErr w:type="spellStart"/>
+      <w:r>
+        <w:rPr>
+          <w:rFonts w:eastAsia="Times New Roman"/>
+        </w:rPr>
+        <w:t>i</w:t>
+      </w:r>
+      <w:proofErr w:type="spellEnd"/>
+      <w:r>
+        <w:rPr>
+          <w:rFonts w:eastAsia="Times New Roman"/>
+        </w:rPr>
+        <w:t>=min(offset+fibMMm2, n−1)</w:t>
+      </w:r>
+    </w:p>
+    <w:p>
+      <w:pPr>
+        <w:pStyle w:val="NoSpacing"/>
+        <w:rPr>
+          <w:rFonts w:eastAsia="Times New Roman"/>
+        </w:rPr>
+      </w:pPr>
+    </w:p>
+    <w:p>
+      <w:pPr>
+        <w:pStyle w:val="NoSpacing"/>
+        <w:rPr>
+          <w:b/>
+          <w:sz w:val="24"/>
+          <w:szCs w:val="24"/>
+        </w:rPr>
+      </w:pPr>
+      <w:r>
+        <w:rPr>
+          <w:b/>
+          <w:sz w:val="24"/>
+          <w:szCs w:val="24"/>
+        </w:rPr>
+        <w:t>Step 4: Compare Target</w:t>
+      </w:r>
+    </w:p>
+    <w:p>
+      <w:pPr>
+        <w:pStyle w:val="NoSpacing"/>
+      </w:pPr>
+      <w:r>
+        <w:t>Target is on the right side.</w:t>
+      </w:r>
+    </w:p>
+    <w:p>
+      <w:pPr>
+        <w:pStyle w:val="NoSpacing"/>
+      </w:pPr>
+      <w:r>
+        <w:t>Move range right.</w:t>
+      </w:r>
+    </w:p>
+    <w:p>
+      <w:pPr>
+        <w:pStyle w:val="NoSpacing"/>
+      </w:pPr>
+      <w:r>
+        <w:t>Update Fibonacci numbers.</w:t>
+      </w:r>
+    </w:p>
+    <w:p>
+      <w:pPr>
+        <w:spacing w:before="100" w:beforeAutospacing="1" w:after="100" w:afterAutospacing="1" w:line="240" w:lineRule="auto"/>
+        <w:outlineLvl w:val="0"/>
+        <w:rPr>
+          <w:rFonts w:ascii="Times New Roman" w:eastAsia="Times New Roman" w:hAnsi="Times New Roman" w:cs="Times New Roman"/>
+          <w:b/>
+          <w:bCs/>
+          <w:kern w:val="36"/>
+          <w:sz w:val="24"/>
+          <w:szCs w:val="24"/>
+        </w:rPr>
+      </w:pPr>
+      <w:r>
+        <w:rPr>
+          <w:rFonts w:ascii="Times New Roman" w:eastAsia="Times New Roman" w:hAnsi="Times New Roman" w:cs="Times New Roman"/>
+          <w:b/>
+          <w:bCs/>
+          <w:kern w:val="36"/>
+          <w:sz w:val="24"/>
+          <w:szCs w:val="24"/>
+        </w:rPr>
+        <w:t>Step 5: Find New Index</w:t>
+      </w:r>
+    </w:p>
+    <w:p>
+      <w:pPr>
+        <w:pStyle w:val="NoSpacing"/>
+        <w:rPr>
+          <w:rFonts w:eastAsia="Times New Roman"/>
+        </w:rPr>
+      </w:pPr>
+      <w:r>
+        <w:rPr>
+          <w:rFonts w:eastAsia="Times New Roman"/>
+        </w:rPr>
+        <w:t>Next Fibonacci values reduce.</w:t>
+      </w:r>
+    </w:p>
+    <w:p>
+      <w:pPr>
+        <w:pStyle w:val="NoSpacing"/>
+        <w:rPr>
+          <w:rFonts w:eastAsia="Times New Roman"/>
+        </w:rPr>
+      </w:pPr>
+      <w:r>
+        <w:rPr>
+          <w:rFonts w:eastAsia="Times New Roman"/>
+        </w:rPr>
+        <w:t>Calculate again:</w:t>
+      </w:r>
+    </w:p>
+    <w:p>
+      <w:pPr>
+        <w:pStyle w:val="NoSpacing"/>
+        <w:rPr>
+          <w:rFonts w:eastAsia="Times New Roman"/>
+          <w:b/>
+        </w:rPr>
+      </w:pPr>
+      <w:proofErr w:type="spellStart"/>
+      <w:r>
+        <w:rPr>
+          <w:rFonts w:eastAsia="Times New Roman"/>
+          <w:b/>
+        </w:rPr>
+        <w:t>i</w:t>
+      </w:r>
+      <w:proofErr w:type="spellEnd"/>
+      <w:r>
+        <w:rPr>
+          <w:rFonts w:eastAsia="Times New Roman"/>
+          <w:b/>
+        </w:rPr>
+        <w:t xml:space="preserve"> = </w:t>
+      </w:r>
+      <w:proofErr w:type="gramStart"/>
+      <w:r>
+        <w:rPr>
+          <w:rFonts w:eastAsia="Times New Roman"/>
+          <w:b/>
+        </w:rPr>
+        <w:t>min(</w:t>
+      </w:r>
+      <w:proofErr w:type="gramEnd"/>
+      <w:r>
+        <w:rPr>
+          <w:rFonts w:eastAsia="Times New Roman"/>
+          <w:b/>
+        </w:rPr>
+        <w:t>2 + 2, 7)</w:t>
+      </w:r>
+    </w:p>
+    <w:p>
+      <w:pPr>
+        <w:pStyle w:val="NoSpacing"/>
+        <w:rPr>
+          <w:rFonts w:eastAsia="Times New Roman"/>
+          <w:b/>
+        </w:rPr>
+      </w:pPr>
+      <w:proofErr w:type="spellStart"/>
+      <w:r>
+        <w:rPr>
+          <w:rFonts w:eastAsia="Times New Roman"/>
+          <w:b/>
+        </w:rPr>
+        <w:t>i</w:t>
+      </w:r>
+      <w:proofErr w:type="spellEnd"/>
+      <w:r>
+        <w:rPr>
+          <w:rFonts w:eastAsia="Times New Roman"/>
+          <w:b/>
+        </w:rPr>
+        <w:t xml:space="preserve"> = 4</w:t>
+      </w:r>
+    </w:p>
+    <w:p>
+      <w:pPr>
+        <w:pStyle w:val="NormalWeb"/>
+        <w:rPr>
+          <w:b/>
+        </w:rPr>
+      </w:pPr>
+      <w:r>
+        <w:rPr>
+          <w:b/>
+        </w:rPr>
+        <w:t>Step 6: Target Found</w:t>
+      </w:r>
+    </w:p>
+    <w:p>
+      <w:pPr>
+        <w:pStyle w:val="NormalWeb"/>
+      </w:pPr>
+      <w:r>
+        <w:t>Return index:</w:t>
+      </w:r>
+    </w:p>
+    <w:p>
+      <w:pPr>
+        <w:rPr>
+          <w:sz w:val="36"/>
+          <w:szCs w:val="36"/>
+        </w:rPr>
+      </w:pPr>
+    </w:p>
     <w:sectPr>
       <w:pgSz w:w="12240" w:h="15840"/>
       <w:pgMar w:top="1440" w:right="1440" w:bottom="1440" w:left="1440" w:header="720" w:footer="720" w:gutter="0"/>
@@ -8692,6 +9232,21 @@
       <w:contextualSpacing/>
     </w:pPr>
   </w:style>
+  <w:style w:type="character" w:customStyle="1" w:styleId="mspace">
+    <w:name w:val="mspace"/>
+    <w:basedOn w:val="DefaultParagraphFont"/>
+    <w:rsid w:val="00EF4137"/>
+  </w:style>
+  <w:style w:type="character" w:customStyle="1" w:styleId="mop">
+    <w:name w:val="mop"/>
+    <w:basedOn w:val="DefaultParagraphFont"/>
+    <w:rsid w:val="00EF4137"/>
+  </w:style>
+  <w:style w:type="character" w:customStyle="1" w:styleId="mpunct">
+    <w:name w:val="mpunct"/>
+    <w:basedOn w:val="DefaultParagraphFont"/>
+    <w:rsid w:val="00EF4137"/>
+  </w:style>
 </w:styles>
 </file>
 

</xml_diff>